<commit_message>
chore: update project report and clean up temporary system files
</commit_message>
<xml_diff>
--- a/Project_Report_Super_Expanded.docx
+++ b/Project_Report_Super_Expanded.docx
@@ -54,7 +54,21 @@
           <w:b/>
           <w:sz w:val="28"/>
         </w:rPr>
-        <w:t>Uday Vachasiddha (Registration Number Placeholder)</w:t>
+        <w:t>Uday Vachasiddha (</w:t>
+      </w:r>
+      <w:r>
+        <w:rPr>
+          <w:b/>
+          <w:sz w:val="28"/>
+        </w:rPr>
+        <w:t>213065</w:t>
+      </w:r>
+      <w:r>
+        <w:rPr>
+          <w:b/>
+          <w:sz w:val="28"/>
+        </w:rPr>
+        <w:t>)</w:t>
       </w:r>
     </w:p>
     <w:p>
@@ -84,6 +98,10 @@
     <w:p>
       <w:pPr>
         <w:pStyle w:val="Heading1"/>
+        <w:numPr>
+          <w:ilvl w:val="0"/>
+          <w:numId w:val="17"/>
+        </w:numPr>
       </w:pPr>
       <w:bookmarkStart w:id="0" w:name="_Toc227571852"/>
       <w:r>
@@ -96,6 +114,9 @@
       <w:bookmarkEnd w:id="0"/>
     </w:p>
     <w:p>
+      <w:pPr>
+        <w:ind w:left="360"/>
+      </w:pPr>
       <w:r>
         <w:t xml:space="preserve">The current architecture of online multiplayer gaming is characterized by strong demands in terms of low-latency and real-time delivery of packets. Since these systems have a strong preference on connectionless protocols such as UDP to avoid retransmission overhead, they present a huge attack surface to Layer 4 volumetric DDoS campaigns. In the past, mitigation of these attacks was done through crude threshold-based rate limiting which often causes the unintentional dropping of legitimate player traffic also referred to as false positives, when an organic traffic burst occurs, e.g., when a game client updates or during a large-scale virtual event (Mirkovic and Reiher, 2004). This project presents a hybrid machine-learning-controlled defense mechanism that </w:t>
       </w:r>
@@ -145,6 +166,14 @@
     </w:p>
     <w:sdt>
       <w:sdtPr>
+        <w:rPr>
+          <w:rFonts w:ascii="Times New Roman" w:eastAsiaTheme="minorEastAsia" w:hAnsi="Times New Roman" w:cstheme="minorBidi"/>
+          <w:b w:val="0"/>
+          <w:bCs w:val="0"/>
+          <w:color w:val="auto"/>
+          <w:sz w:val="24"/>
+          <w:szCs w:val="22"/>
+        </w:rPr>
         <w:id w:val="-1607332100"/>
         <w:docPartObj>
           <w:docPartGallery w:val="Table of Contents"/>
@@ -153,20 +182,23 @@
       </w:sdtPr>
       <w:sdtEndPr>
         <w:rPr>
-          <w:rFonts w:ascii="Times New Roman" w:eastAsiaTheme="minorEastAsia" w:hAnsi="Times New Roman" w:cstheme="minorBidi"/>
           <w:noProof/>
-          <w:color w:val="auto"/>
-          <w:sz w:val="24"/>
-          <w:szCs w:val="22"/>
         </w:rPr>
       </w:sdtEndPr>
       <w:sdtContent>
         <w:p>
           <w:pPr>
             <w:pStyle w:val="TOCHeading"/>
+            <w:numPr>
+              <w:ilvl w:val="0"/>
+              <w:numId w:val="17"/>
+            </w:numPr>
           </w:pPr>
           <w:r>
             <w:t>Table of Contents</w:t>
+          </w:r>
+          <w:r>
+            <w:t>:</w:t>
           </w:r>
         </w:p>
         <w:p>
@@ -1974,6 +2006,10 @@
     <w:p>
       <w:pPr>
         <w:pStyle w:val="Heading1"/>
+        <w:numPr>
+          <w:ilvl w:val="0"/>
+          <w:numId w:val="17"/>
+        </w:numPr>
       </w:pPr>
       <w:bookmarkStart w:id="1" w:name="_Toc227571853"/>
       <w:r>
@@ -1981,12 +2017,16 @@
         <w:t>Acknowledgements</w:t>
       </w:r>
       <w:bookmarkEnd w:id="1"/>
+      <w:r>
+        <w:t>:</w:t>
+      </w:r>
     </w:p>
     <w:p>
       <w:pPr>
         <w:tabs>
           <w:tab w:val="left" w:pos="5387"/>
         </w:tabs>
+        <w:ind w:left="360"/>
       </w:pPr>
       <w:r>
         <w:t xml:space="preserve">I would also like to say my sincere thanks to the faculty and advisors of the Birla Institute of Technology and Science (BITS), Pilani, whose guidance and critical feedback and further support was invaluable in the development and implementation of this project. The academic investigation is known to be tedious and the atmosphere that the institution provided enabled them to do the experiment continuously without the fear of failure. Additionally, I recognize the makers of the open-source machine learning and data science communities. The fundamental structural building blocks of the data pipeline of the present project have a strong dependency on the work of developers of Pandas, Scikit-Learn, and </w:t>
@@ -2024,6 +2064,10 @@
     <w:p>
       <w:pPr>
         <w:pStyle w:val="Heading1"/>
+        <w:numPr>
+          <w:ilvl w:val="0"/>
+          <w:numId w:val="17"/>
+        </w:numPr>
       </w:pPr>
       <w:bookmarkStart w:id="2" w:name="_Toc227571854"/>
       <w:r>
@@ -2038,6 +2082,7 @@
     <w:p>
       <w:pPr>
         <w:pStyle w:val="Heading2"/>
+        <w:ind w:left="360"/>
       </w:pPr>
       <w:bookmarkStart w:id="3" w:name="_Toc227571855"/>
       <w:r>
@@ -2049,6 +2094,9 @@
       </w:r>
     </w:p>
     <w:p>
+      <w:pPr>
+        <w:ind w:left="360"/>
+      </w:pPr>
       <w:r>
         <w:t>The digital infrastructure that forms the basis of the commercial video game industry has grown in ways never seen before in the past ten years. As publishers move towards models of games as a service, tens of millions of concurrent players are the norm. The network latency can be measured locally in single-digit milliseconds, which is very important to have a fair and smooth experience. Since the standard TCP architecture is based on a three-way handshake and delivery of packets, the protocol overhead nature of the protocol makes it highly inappropriate in the fast-paced exchanges of positional data needed in a multiplayer shooter or real-time strategy game (Zargar et al., 2013).</w:t>
       </w:r>
@@ -2057,6 +2105,9 @@
       </w:r>
     </w:p>
     <w:p>
+      <w:pPr>
+        <w:ind w:left="360"/>
+      </w:pPr>
       <w:r>
         <w:t>As a result, developers are limited to User Datagram Protocol (UDP). UDP is basically a stateless stream; it just throws packets at a server without assuring that it has been received, or that it has successfully transferred data. Nevertheless, this stateless mechanism is far too weak and offers a very tempting target to bad actors interested in causing disruptions to services.</w:t>
       </w:r>
@@ -2079,276 +2130,749 @@
         <w:br/>
       </w:r>
       <w:r>
-        <w:t xml:space="preserve">Conventional edge defense strategies are typically based on fixed rules. An example is that a firewall could block any IP address making over a certain </w:t>
+        <w:t xml:space="preserve">Conventional edge defense strategies are typically based on fixed rules. An example is that a firewall could block any IP address making over a certain amount of requests in a second. This brute-force method is computationally cheap, but utterly fails in flash crowds, impulsive bursts of legitimate network traffic (due to a popular event or tournament final, or new content release on the internet). Players can send traffic during these legitimate spikes that are </w:t>
       </w:r>
       <w:proofErr w:type="gramStart"/>
       <w:r>
-        <w:t>amount</w:t>
+        <w:t>similar to</w:t>
       </w:r>
       <w:proofErr w:type="gramEnd"/>
       <w:r>
-        <w:t xml:space="preserve"> of requests in a second. This brute-force method is computationally cheap, but utterly fails in flash crowds, impulsive bursts of legitimate network traffic (due to a popular event or tournament final, or new content release on the internet). Players can send traffic during these legitimate spikes that are </w:t>
-      </w:r>
-      <w:proofErr w:type="gramStart"/>
-      <w:r>
-        <w:t>similar to</w:t>
-      </w:r>
-      <w:proofErr w:type="gramEnd"/>
-      <w:r>
         <w:t xml:space="preserve"> a primitive botnet. As a result, the traditional rate limiters are activated, making false positives that disconnect the players, which completely nullifies the idea of maintaining the server online.</w:t>
-      </w:r>
-      <w:r>
-        <w:br/>
-      </w:r>
-      <w:r>
-        <w:br/>
-      </w:r>
-      <w:r>
-        <w:t xml:space="preserve">This </w:t>
-      </w:r>
-      <w:proofErr w:type="gramStart"/>
-      <w:r>
-        <w:t>particular project</w:t>
-      </w:r>
-      <w:proofErr w:type="gramEnd"/>
-      <w:r>
-        <w:t xml:space="preserve"> was formulated to specifically deal with the extreme economic and reputational harm when a game company mistakenly labels its own player base as a malicious botnet. Any individual player going dead because of an aggressive firewall is a network architecture failure. This system demonstrates that we do not have to use a fixed </w:t>
-      </w:r>
-      <w:r>
-        <w:lastRenderedPageBreak/>
-        <w:t>set of limitations anymore by applying a simulation of a step-up in the level of intelligence.</w:t>
       </w:r>
     </w:p>
     <w:p>
       <w:pPr>
-        <w:pStyle w:val="Heading2"/>
-      </w:pPr>
-      <w:bookmarkStart w:id="4" w:name="_Toc227571856"/>
-      <w:r>
-        <w:t>The Design that Emerged</w:t>
-      </w:r>
-      <w:bookmarkEnd w:id="4"/>
+        <w:ind w:left="360"/>
+      </w:pPr>
+      <w:r>
+        <w:br/>
+      </w:r>
+      <w:r>
+        <w:br/>
+      </w:r>
+      <w:r>
+        <w:lastRenderedPageBreak/>
+        <w:t xml:space="preserve">This </w:t>
+      </w:r>
+      <w:proofErr w:type="gramStart"/>
+      <w:r>
+        <w:t>particular project</w:t>
+      </w:r>
+      <w:proofErr w:type="gramEnd"/>
+      <w:r>
+        <w:t xml:space="preserve"> was formulated to specifically deal with the extreme economic and reputational harm when a game company mistakenly labels its own player base as a malicious botnet. Any individual player going dead because of an aggressive firewall is a network architecture failure. This system demonstrates that we do not have to use a fixed set of limitations anymore by applying a simulation of a step-up in the level of intelligence.</w:t>
+      </w:r>
     </w:p>
     <w:p>
-      <w:r>
-        <w:t xml:space="preserve">We shifted to dynamic behavioral analytics to take advantage of this structural problem. The framework that is developed in this project is a multi-phase pipeline consisting of an offline analytics trainer and a real-time predictive dashboard. It is based on a Random Forest machine learning classifier, with a strict standardization </w:t>
-      </w:r>
-      <w:proofErr w:type="gramStart"/>
-      <w:r>
-        <w:t>scaler</w:t>
-      </w:r>
-      <w:proofErr w:type="gramEnd"/>
-      <w:r>
-        <w:t>. The system does not simply count packets but analyzes behavioral metadata on-the-fly: the distribution of the sizes of packets, the mathematical randomness (entropy) of the payloads, and the inter-arrival time between consecutive packets on a microsecond scale.</w:t>
-      </w:r>
-      <w:r>
-        <w:br/>
-      </w:r>
-      <w:r>
-        <w:br/>
-      </w:r>
-      <w:r>
-        <w:t xml:space="preserve">The project simulates the existence of a Content Delivery Network (CDN) around the world using Anycast routing. A </w:t>
-      </w:r>
-      <w:proofErr w:type="spellStart"/>
-      <w:r>
-        <w:t>FastAPI</w:t>
-      </w:r>
-      <w:proofErr w:type="spellEnd"/>
-      <w:r>
-        <w:t xml:space="preserve"> based back-end server is used to synthesize large streams of traffic that </w:t>
-      </w:r>
-      <w:proofErr w:type="gramStart"/>
-      <w:r>
-        <w:t>contains</w:t>
-      </w:r>
-      <w:proofErr w:type="gramEnd"/>
-      <w:r>
-        <w:t xml:space="preserve"> both normal player behavior and botnet noise. When packets arrive at the simulated edge, nodes and randomly labelled as BOM-Edge (Mumbai), FRA-Edge (Frankfurt), TYO-Edge (Tokyo), etc., the machine learning logic is applied by the pipeline, the choice of passing or dropping is solved. The custom, asynchronous </w:t>
-      </w:r>
-      <w:proofErr w:type="spellStart"/>
-      <w:r>
-        <w:t>Javascript</w:t>
-      </w:r>
-      <w:proofErr w:type="spellEnd"/>
-      <w:r>
-        <w:t xml:space="preserve"> dashboard listens to Server-Sent Events (SSE) directly being emitted by the simulation, and displays real-time statistics, precise throughput rates, and real-time confusion matrix metrics in the browser. The resulting architecture is thus a fully vertical slice: a data pipeline that drives a neural model, which safeguards an edge routing element, which lastly visualizes outcomes in a web-hosted DOM hierarchy.</w:t>
+      <w:pPr>
+        <w:pStyle w:val="Heading2"/>
+        <w:ind w:firstLine="360"/>
+      </w:pPr>
+      <w:bookmarkStart w:id="4" w:name="_Toc227571856"/>
+      <w:r>
+        <w:t>The Design that Emerged</w:t>
+      </w:r>
+      <w:bookmarkEnd w:id="4"/>
+      <w:r>
+        <w:t>:</w:t>
       </w:r>
     </w:p>
     <w:p>
       <w:pPr>
-        <w:pStyle w:val="Heading2"/>
-      </w:pPr>
-      <w:bookmarkStart w:id="5" w:name="_Toc227571857"/>
-      <w:r>
-        <w:t>The Main Aims and Objectives of the Project</w:t>
-      </w:r>
-      <w:bookmarkEnd w:id="5"/>
+        <w:ind w:left="360"/>
+      </w:pPr>
+      <w:r>
+        <w:t xml:space="preserve">We shifted to dynamic behavioral analytics to take advantage of this structural problem. The framework that is developed in this project is a multi-phase pipeline consisting of an offline analytics trainer and a real-time predictive dashboard. It is based on a Random Forest machine learning classifier, with a strict standardization </w:t>
+      </w:r>
+      <w:proofErr w:type="gramStart"/>
+      <w:r>
+        <w:t>scaler</w:t>
+      </w:r>
+      <w:proofErr w:type="gramEnd"/>
+      <w:r>
+        <w:t>. The system does not simply count packets but analyzes behavioral metadata on-the-fly: the distribution of the sizes of packets, the mathematical randomness (entropy) of the payloads, and the inter-arrival time between consecutive packets on a microsecond scale.</w:t>
+      </w:r>
+      <w:r>
+        <w:br/>
+      </w:r>
+      <w:r>
+        <w:br/>
+      </w:r>
+      <w:r>
+        <w:t xml:space="preserve">The project simulates the existence of a Content Delivery Network (CDN) around the world using Anycast routing. A </w:t>
+      </w:r>
+      <w:proofErr w:type="spellStart"/>
+      <w:r>
+        <w:t>FastAPI</w:t>
+      </w:r>
+      <w:proofErr w:type="spellEnd"/>
+      <w:r>
+        <w:t xml:space="preserve"> based back-end server is used to synthesize large streams of traffic that contains both normal player behavior and botnet noise. When packets arrive at the simulated edge, nodes and randomly labelled as BOM-Edge (Mumbai), FRA-Edge (Frankfurt), TYO-Edge (Tokyo), etc., the machine learning logic is applied by the pipeline, the choice of passing or dropping is solved.</w:t>
+      </w:r>
+      <w:r>
+        <w:t xml:space="preserve"> </w:t>
+      </w:r>
+      <w:r>
+        <w:t xml:space="preserve">The custom, asynchronous </w:t>
+      </w:r>
+      <w:proofErr w:type="spellStart"/>
+      <w:r>
+        <w:t>Javascript</w:t>
+      </w:r>
+      <w:proofErr w:type="spellEnd"/>
+      <w:r>
+        <w:t xml:space="preserve"> dashboard listens to Server-Sent Events (SSE) directly being emitted by the simulation, and displays real-time statistics, precise throughput rates, and real-time confusion matrix metrics in the browser. The resulting architecture is thus a fully vertical slice: a data pipeline that drives a neural model, which safeguards an edge routing element, which lastly visualizes outcomes in a web-hosted DOM hierarchy.</w:t>
+      </w:r>
     </w:p>
     <w:p>
-      <w:r>
-        <w:t xml:space="preserve">The underlying framework developed for this research paper centers on achieving computational accuracy without sacrificing end-user stability. The core objectives defining this assignment are as follows: </w:t>
-      </w:r>
-      <w:r>
-        <w:br/>
-      </w:r>
-      <w:r>
-        <w:br/>
-        <w:t>1. Construct a Robust Data Infrastructure: To successfully import, parse, and process real-world Parquet files representing network telemetry alongside generated synthetic multiplayer datasets. The data must be cleanly balanced and standardized before training can occur to prevent model bias.</w:t>
-      </w:r>
-      <w:r>
-        <w:br/>
-        <w:t>2. Develop a Predictive Filter Network: To implement a Random Forest algorithm specifically tailored to minimize the false positive rate. Protecting the player base is prioritized over blocking every single malicious package, establishing a realistic business-logic threshold for the classifier.</w:t>
-      </w:r>
-      <w:r>
-        <w:br/>
-        <w:t>3. Simulate an Edge Router Environment: To write networking code simulating high-volume asynchronous packet buffering, allowing the pipeline to judge the impact of classification delays visually.</w:t>
-      </w:r>
-      <w:r>
-        <w:br/>
-        <w:t xml:space="preserve">4. Provide Interactive Administrative Visualization: To design a sleek, dark-themed </w:t>
-      </w:r>
-      <w:r>
-        <w:lastRenderedPageBreak/>
-        <w:t>operational dashboard showcasing the mitigation live. The UI must provide administrative stakeholders with live accuracy updates and geographic node filtering.</w:t>
-      </w:r>
-      <w:r>
-        <w:br/>
-        <w:t>5. Automated Notification Architecture: Integrations with external services, specifically utilizing Pywhatkit, to broadcast immediate administrative alerts once heavy packet dropping crosses defined critical thresholds.</w:t>
+      <w:pPr>
+        <w:pStyle w:val="Heading2"/>
+        <w:ind w:firstLine="360"/>
+      </w:pPr>
+      <w:bookmarkStart w:id="5" w:name="_Toc227571857"/>
+      <w:r>
+        <w:t>The Main Aims and Objectives of the Project</w:t>
+      </w:r>
+      <w:bookmarkEnd w:id="5"/>
+      <w:r>
+        <w:t>:</w:t>
       </w:r>
     </w:p>
     <w:p>
       <w:pPr>
-        <w:pStyle w:val="Heading2"/>
-      </w:pPr>
-      <w:bookmarkStart w:id="6" w:name="_Toc227571858"/>
-      <w:r>
-        <w:t>A Short Overview of the Remaining Chapters</w:t>
-      </w:r>
-      <w:bookmarkEnd w:id="6"/>
+        <w:ind w:left="360"/>
+      </w:pPr>
+      <w:r>
+        <w:t>The key structure of the research paper is to give no compromise computational solutions to the end user. The objectives of this assignment will be the following:</w:t>
+      </w:r>
+      <w:r>
+        <w:t xml:space="preserve"> </w:t>
+      </w:r>
     </w:p>
     <w:p>
-      <w:r>
-        <w:t>The subsequent sections of this report explore the granular technical execution of those objectives. Chapter 6 (Background) discusses the evolution of malicious network paradigms and justifies our selection of standard Scikit-Learn libraries over heavy deep learning options. Chapter 7 (Analysis) strictly scopes the functional boundaries of the application and delineates administrator use cases in deep detail. Chapter 8 (Design) dissects the code explicitly, exposing the connection between the python-based generation logic and the DOM manipulation occurring in the Javascript engine. Chapter 9 details project management constraints and our offline simulation metrics, while Chapter 10 synthesizes the conclusions drawn from this approach.</w:t>
+      <w:pPr>
+        <w:pStyle w:val="ListParagraph"/>
+        <w:numPr>
+          <w:ilvl w:val="0"/>
+          <w:numId w:val="13"/>
+        </w:numPr>
+      </w:pPr>
+      <w:r>
+        <w:rPr>
+          <w:b/>
+          <w:bCs/>
+        </w:rPr>
+        <w:t xml:space="preserve">Build a Strong Data Backbone: </w:t>
+      </w:r>
+      <w:r>
+        <w:t>To effectively import, decode and manipulate actual-world Parquet files of network telemetry data as well as programmed multiplayer datasets. There should be a clean balance and standardization of the data to ensure that training is done to avoid model bias.</w:t>
       </w:r>
     </w:p>
     <w:p>
-      <w:r>
-        <w:br w:type="page"/>
-      </w:r>
+      <w:pPr>
+        <w:pStyle w:val="ListParagraph"/>
+      </w:pPr>
     </w:p>
     <w:p>
       <w:pPr>
+        <w:pStyle w:val="ListParagraph"/>
+        <w:ind w:left="360"/>
+      </w:pPr>
+    </w:p>
+    <w:p>
+      <w:pPr>
+        <w:pStyle w:val="ListParagraph"/>
+        <w:numPr>
+          <w:ilvl w:val="0"/>
+          <w:numId w:val="13"/>
+        </w:numPr>
+      </w:pPr>
+      <w:r>
+        <w:rPr>
+          <w:b/>
+          <w:bCs/>
+        </w:rPr>
+        <w:lastRenderedPageBreak/>
+        <w:t xml:space="preserve">Create a Predictive Filter Network: </w:t>
+      </w:r>
+      <w:r>
+        <w:t xml:space="preserve">To create a random forest algorithm that is specifically designed to reduce the false positive rate. The protection of the player base is considered more important than blocking </w:t>
+      </w:r>
+      <w:proofErr w:type="gramStart"/>
+      <w:r>
+        <w:t>each and every</w:t>
+      </w:r>
+      <w:proofErr w:type="gramEnd"/>
+      <w:r>
+        <w:t xml:space="preserve"> malicious package, which sets a realistic business-logic threshold to the classifier.</w:t>
+      </w:r>
+    </w:p>
+    <w:p>
+      <w:pPr>
+        <w:pStyle w:val="ListParagraph"/>
+        <w:ind w:left="360"/>
+      </w:pPr>
+    </w:p>
+    <w:p>
+      <w:pPr>
+        <w:pStyle w:val="ListParagraph"/>
+        <w:numPr>
+          <w:ilvl w:val="0"/>
+          <w:numId w:val="13"/>
+        </w:numPr>
+      </w:pPr>
+      <w:r>
+        <w:rPr>
+          <w:b/>
+          <w:bCs/>
+        </w:rPr>
+        <w:t>Simulate an Edge Router Environment:</w:t>
+      </w:r>
+      <w:r>
+        <w:t xml:space="preserve"> </w:t>
+      </w:r>
+      <w:r>
+        <w:t>To code simulate networking code to simulate high-volume asynchronous packet buffering, in a way that lets the pipeline visually judge the effects of classification delays.</w:t>
+      </w:r>
+    </w:p>
+    <w:p>
+      <w:pPr>
+        <w:pStyle w:val="ListParagraph"/>
+        <w:ind w:left="360"/>
+      </w:pPr>
+    </w:p>
+    <w:p>
+      <w:pPr>
+        <w:pStyle w:val="ListParagraph"/>
+        <w:numPr>
+          <w:ilvl w:val="0"/>
+          <w:numId w:val="13"/>
+        </w:numPr>
+      </w:pPr>
+      <w:r>
+        <w:rPr>
+          <w:b/>
+          <w:bCs/>
+        </w:rPr>
+        <w:t xml:space="preserve">Give Interactive Administrative Visualization: </w:t>
+      </w:r>
+      <w:r>
+        <w:t xml:space="preserve">To create a smooth, dark-themed operational dashboard displaying the mitigation live. Live accuracy updates and geographic node filtering </w:t>
+      </w:r>
+      <w:proofErr w:type="gramStart"/>
+      <w:r>
+        <w:t>needs</w:t>
+      </w:r>
+      <w:proofErr w:type="gramEnd"/>
+      <w:r>
+        <w:t xml:space="preserve"> to be offered by the UI to administrative stakeholders.</w:t>
+      </w:r>
+    </w:p>
+    <w:p>
+      <w:pPr>
+        <w:pStyle w:val="ListParagraph"/>
+        <w:ind w:left="360"/>
+      </w:pPr>
+    </w:p>
+    <w:p>
+      <w:pPr>
+        <w:pStyle w:val="ListParagraph"/>
+        <w:numPr>
+          <w:ilvl w:val="0"/>
+          <w:numId w:val="13"/>
+        </w:numPr>
+      </w:pPr>
+      <w:r>
+        <w:rPr>
+          <w:b/>
+          <w:bCs/>
+        </w:rPr>
+        <w:t>Automated Notification Architecture:</w:t>
+      </w:r>
+      <w:r>
+        <w:t xml:space="preserve"> </w:t>
+      </w:r>
+      <w:r>
+        <w:t xml:space="preserve">Interconnections with external services, namely, using </w:t>
+      </w:r>
+      <w:proofErr w:type="spellStart"/>
+      <w:r>
+        <w:t>Pywhatkit</w:t>
+      </w:r>
+      <w:proofErr w:type="spellEnd"/>
+      <w:r>
+        <w:t>, to send immediate administrative notifications when the aggressive packet-dropping exceeds predetermined critical limits.</w:t>
+      </w:r>
+    </w:p>
+    <w:p>
+      <w:pPr>
+        <w:pStyle w:val="ListParagraph"/>
+      </w:pPr>
+    </w:p>
+    <w:p>
+      <w:pPr>
+        <w:pStyle w:val="Heading2"/>
+        <w:ind w:firstLine="360"/>
+      </w:pPr>
+      <w:r>
+        <w:t>Brief Outline of the Rest of the Chapters</w:t>
+      </w:r>
+      <w:r>
+        <w:t>:</w:t>
+      </w:r>
+    </w:p>
+    <w:p>
+      <w:pPr>
+        <w:ind w:left="360"/>
+      </w:pPr>
+      <w:r>
+        <w:t xml:space="preserve">The following pages of this report delve into the finer technical implementation of those goals. Chapter 6 (Background) explains the development of malicious network paradigms and explains why we chose standard Scikit-Learn libraries instead of heavy deep learning alternatives. Chapter 7 (Analysis) strictly bounds the functional scope of the application and outlines </w:t>
+      </w:r>
+      <w:proofErr w:type="gramStart"/>
+      <w:r>
+        <w:t>administrator</w:t>
+      </w:r>
+      <w:proofErr w:type="gramEnd"/>
+      <w:r>
+        <w:t xml:space="preserve"> use cases in exquisite detail. The explicit breakout of the code as in Chapter 8 (Design) reveals the relationship between the </w:t>
+      </w:r>
+      <w:proofErr w:type="gramStart"/>
+      <w:r>
+        <w:t>python based</w:t>
+      </w:r>
+      <w:proofErr w:type="gramEnd"/>
+      <w:r>
+        <w:t xml:space="preserve"> generation logic and the DOM manipulation that takes place within the </w:t>
+      </w:r>
+      <w:proofErr w:type="spellStart"/>
+      <w:r>
+        <w:t>Javascript</w:t>
+      </w:r>
+      <w:proofErr w:type="spellEnd"/>
+      <w:r>
+        <w:t xml:space="preserve"> engine. Chapter 9 provides information on the project management constraints and our offline simulation </w:t>
+      </w:r>
+      <w:proofErr w:type="gramStart"/>
+      <w:r>
+        <w:t>measures</w:t>
+      </w:r>
+      <w:proofErr w:type="gramEnd"/>
+      <w:r>
+        <w:t xml:space="preserve"> and Chapter 10 </w:t>
+      </w:r>
+      <w:proofErr w:type="spellStart"/>
+      <w:r>
+        <w:t>summarises</w:t>
+      </w:r>
+      <w:proofErr w:type="spellEnd"/>
+      <w:r>
+        <w:t xml:space="preserve"> the findings of this method.</w:t>
+      </w:r>
+    </w:p>
+    <w:p>
+      <w:r>
+        <w:br w:type="page"/>
+      </w:r>
+    </w:p>
+    <w:p>
+      <w:pPr>
         <w:pStyle w:val="Heading1"/>
-      </w:pPr>
-      <w:bookmarkStart w:id="7" w:name="_Toc227571859"/>
+        <w:numPr>
+          <w:ilvl w:val="0"/>
+          <w:numId w:val="18"/>
+        </w:numPr>
+      </w:pPr>
+      <w:bookmarkStart w:id="6" w:name="_Toc227571859"/>
       <w:r>
         <w:lastRenderedPageBreak/>
         <w:t>Background</w:t>
       </w:r>
-      <w:bookmarkEnd w:id="7"/>
+      <w:bookmarkEnd w:id="6"/>
+      <w:r>
+        <w:t>:</w:t>
+      </w:r>
     </w:p>
     <w:p>
-      <w:r>
-        <w:t xml:space="preserve">The context of this work sits aggressively at the intersection of conventional network management and contemporary artificial intelligence applications. Historically, handling DDoS meant provisioning expensive, on-premise hardware appliances directly in front of the server racks. These appliances essentially utilized Access Control Lists (ACLs), dropping traffic matching known bad IP signatures. Early iterations of denial of service vulnerabilities, such as the infamous 'teardrop' attacks of the late 1990s, relied on sending mathematically malformed packets that would physically crash Windows operating systems reading the headers. Since those vulnerabilities were quickly patched at the operating system level, attackers shifted strictly to volumetric floods. The core concept transitioned from 'tricking' the server to simply suffocating it via massive data throughput that physical cables strictly could not accommodate. </w:t>
+      <w:pPr>
+        <w:ind w:left="360"/>
+      </w:pPr>
+      <w:r>
+        <w:t xml:space="preserve">The context of this writing is </w:t>
+      </w:r>
+      <w:proofErr w:type="gramStart"/>
+      <w:r>
+        <w:t>violently</w:t>
+      </w:r>
+      <w:proofErr w:type="gramEnd"/>
+      <w:r>
+        <w:t xml:space="preserve"> in the cross-section of traditional network management and modern artificial intelligence applications. Traditionally, managing DDoS has involved deploying costly physical hardware appliances in front of the server racks. These devices basically employed Access Control Lists (ACLs) and dropped traffic that matched a set of </w:t>
+      </w:r>
+      <w:proofErr w:type="gramStart"/>
+      <w:r>
+        <w:t>known bad</w:t>
+      </w:r>
+      <w:proofErr w:type="gramEnd"/>
+      <w:r>
+        <w:t xml:space="preserve"> IP signatures. Older forms of </w:t>
+      </w:r>
+      <w:proofErr w:type="gramStart"/>
+      <w:r>
+        <w:t>denial of service</w:t>
+      </w:r>
+      <w:proofErr w:type="gramEnd"/>
+      <w:r>
+        <w:t xml:space="preserve"> vulnerabilities, including the famous teardrop attacks of the late 1990s, were based on the transmission of </w:t>
+      </w:r>
+      <w:proofErr w:type="gramStart"/>
+      <w:r>
+        <w:t>mathematically-constructed</w:t>
+      </w:r>
+      <w:proofErr w:type="gramEnd"/>
+      <w:r>
+        <w:t xml:space="preserve"> packets that would crash operating systems based on windows reading the headers. The vulnerabilities were soon addressed at the operating system level, thereby forcing the attackers into the confines of volumetric floods alone. The main idea shifted to not to scam the server, but just to choke it with a huge data flow which could be physically delivered only by physical cables.</w:t>
+      </w:r>
+      <w:r>
+        <w:t xml:space="preserve"> </w:t>
       </w:r>
       <w:r>
         <w:br/>
       </w:r>
       <w:r>
         <w:br/>
-        <w:t>As Somner and Paxson (2010) established early on in their reviews of Intrusion Detection Systems (IDS), the effectiveness of signature-based mechanisms degrades completely when dealing with zero-day attacks or incredibly vast distributed botnets consisting of hijacked residential IoT devices. When a modern attack scenario involves three hundred thousand different residential cameras, baby monitors, and smart refrigerators independently launching UDP requests via malware systems akin to the notorious Mirai botnet, blocking specific malicious IP addresses becomes a mathematically impossible game of whack-a-mole. There are simply too many unique addresses participating in the attack to manually filter without accidentally blocking entire legitimate residential subnets.</w:t>
+      </w:r>
+      <w:r>
+        <w:t xml:space="preserve">Since as early as the reviews of Intrusion Detection Systems (IDS) by Somner and Paxson (2010) made it clear, the efficiency of signature-based mechanisms can and will drop to zero with zero-day attacks or with </w:t>
+      </w:r>
+      <w:proofErr w:type="gramStart"/>
+      <w:r>
+        <w:t>an enormously</w:t>
+      </w:r>
+      <w:proofErr w:type="gramEnd"/>
+      <w:r>
+        <w:t xml:space="preserve"> </w:t>
+      </w:r>
+      <w:proofErr w:type="gramStart"/>
+      <w:r>
+        <w:t>large distributed</w:t>
+      </w:r>
+      <w:proofErr w:type="gramEnd"/>
+      <w:r>
+        <w:t xml:space="preserve"> botnet of hijacked home internet of things devices. In the case of a modern attack scenario involving three hundred thousand various residential cameras, baby monitors and smart refrigerators independently firing UDP requests through malware systems </w:t>
+      </w:r>
+      <w:proofErr w:type="gramStart"/>
+      <w:r>
+        <w:t>similar to</w:t>
+      </w:r>
+      <w:proofErr w:type="gramEnd"/>
+      <w:r>
+        <w:t xml:space="preserve"> the infamous Mirai botnet, blocking individual malicious IP addresses is a game of whack-a-mole that is mathematically impossible. The number of unique addresses involved in the attack is too high to be filtered manually, not to mention the risk of blocking out whole legitimate residential subnets.</w:t>
       </w:r>
       <w:r>
         <w:br/>
       </w:r>
       <w:r>
         <w:br/>
-        <w:t>To combat this massive operational scale, global network engineering adopted BGP Anycast routing methodologies (Mirkovic and Reiher, 2004). Anycast fundamentally changes how IP addresses operate on a global scale. Traditionally, 'Unicast' states that one IP address maps strictly to one physical piece of hardware in a specific geographic location. Anycast permits a single IP address to live simultaneously across hundreds of different separate datacenters distributed globally. When a user routes their network request to an Anycast protected IP, the core internet backbone hardware dynamically calculates the shortest geographical path and passes them to the closest physical node. If a botnet located exclusively in Eastern Europe manages to launch a massive UDP reflection attack against the game server, only the European datacenter absorbs the flood, shielding players located remotely in Asia and North America. However, localized Anycast nodes still require incredibly efficient traffic scrubbing techniques. If the localized edge node collapses due to the volume, the internet's core BGP routes 'flap', dynamically redistributing the malicious attack traffic to the next closest center, eventually causing massive cascade degradation across neighboring regions. Therefore, scrubbing needs to occur instantly at every edge.</w:t>
+      </w:r>
+      <w:r>
+        <w:t xml:space="preserve">Global network engineering implemented BGP Anycast routing methods as a way of combating this huge scale of operation (Mirkovic and Reiher, 2004). Anycast essentially alters the way in which IP addresses are used on a worldwide basis. Historically, Unicast implies that a single IP address has a single physical hardware located in a particular geographic area. Anycast is allowing one IP address to coexist in hundreds of different independent datacenters spread all over the world. When a user directs his or her network request to an Anycast guarded IP, the underlying internet backbone equipment dynamically determines the shortest geographical route and forwards them to the nearest physical node. By having a botnet solely in Eastern Europe manage to cause a huge UDP reflection attack on the game server, the flood is only absorbed by the European datacenter, protecting players who are far away, in Asia and North America. Nonetheless, localized Anycast nodes still demand very high efficiency in terms of traffic scrubbing methods. When the localized edge node fails because of the volume, the core BGP paths of the internet flap, redistributing the rogue attack traffic dynamically to the nearest center, ultimately resulting in huge </w:t>
+      </w:r>
+      <w:r>
+        <w:lastRenderedPageBreak/>
+        <w:t>cascading degradation of the neighboring. regions. Consequently, scrubbing must take place immediately at each corner.</w:t>
       </w:r>
       <w:r>
         <w:br/>
       </w:r>
       <w:r>
+        <w:br/>
+      </w:r>
+      <w:r>
+        <w:t xml:space="preserve">More recently, there was a significant shift to proactive Machine Learning notions of predictive threat blocking on these edge paths (Buczak and Guven, 2016). Machine Learning nodes can learn what normal behavior should look like and automatically </w:t>
+      </w:r>
+      <w:proofErr w:type="gramStart"/>
+      <w:r>
+        <w:t>eliminating</w:t>
+      </w:r>
+      <w:proofErr w:type="gramEnd"/>
+      <w:r>
+        <w:t xml:space="preserve"> extreme standard deviations by looking at sequential data streams and metadata of behavior, rather than performing explicit packet payload analysis. However, the question might be: why use complicated machine learning algorithms rather than set up generic predefined thresholds? An in-built physical-layer policy like 'block packets exceeding 512 bytes of incoming UDP traffic' could be just the ticket to capture an NTP amplification attack, but the instant the game studio issues a new patch to its multiplayer networking code, which raises the default size of positional data packets to 600 bytes, the hardware firewall blocking policy suddenly blocks the entire legitimate user base in the world. These are so expensive to </w:t>
+      </w:r>
+      <w:proofErr w:type="gramStart"/>
+      <w:r>
+        <w:t>companies</w:t>
+      </w:r>
+      <w:proofErr w:type="gramEnd"/>
+      <w:r>
+        <w:t xml:space="preserve"> reputations, and result in colossal financial losses through service level agreement (SLA) breaches. The defining benefit of machine learning in this spectrum of security is, thus, all about its dynamic adjustment to the boundary. The model autonomously discovers the intricate and continuously varying non-linear associations between the typical attributes of the packets </w:t>
+      </w:r>
+      <w:proofErr w:type="gramStart"/>
+      <w:r>
+        <w:t>and also</w:t>
+      </w:r>
+      <w:proofErr w:type="gramEnd"/>
+      <w:r>
+        <w:t xml:space="preserve"> optimizes its blocking limits without the support of predefined policies.</w:t>
+      </w:r>
+      <w:r>
+        <w:br/>
+      </w:r>
+      <w:r>
+        <w:br/>
+      </w:r>
+      <w:r>
+        <w:t xml:space="preserve">ML in network security is experiencing a high level of friction in its developmental process despite its promises. As observed heavily by Buczak and Guven (2016), highly powerful deep learning models like Multi-Layer </w:t>
+      </w:r>
+      <w:proofErr w:type="spellStart"/>
+      <w:r>
+        <w:t>Perceptrons</w:t>
+      </w:r>
+      <w:proofErr w:type="spellEnd"/>
+      <w:r>
+        <w:t xml:space="preserve"> or Deep Neural Networks (DNNs), though incredibly precise in identifying new malicious patterns, demand heavy matrix multiplications, which inherently make the process sluggish. A 100 </w:t>
+      </w:r>
+      <w:proofErr w:type="gramStart"/>
+      <w:r>
+        <w:t>milliseconds</w:t>
+      </w:r>
+      <w:proofErr w:type="gramEnd"/>
+      <w:r>
+        <w:t xml:space="preserve"> delay of a packet, so it can be inspected by an advanced </w:t>
+      </w:r>
+      <w:proofErr w:type="spellStart"/>
+      <w:r>
+        <w:t>Tensorflow</w:t>
+      </w:r>
+      <w:proofErr w:type="spellEnd"/>
+      <w:r>
+        <w:t xml:space="preserve"> algorithm, is equally harmful to the player experience as the packet being dropped. This is a latency constraint that was considered in architecture, which dictated the absolute choice of the algorithmic design used in this simulation project.</w:t>
+      </w:r>
+      <w:r>
+        <w:t xml:space="preserve"> </w:t>
+      </w:r>
+      <w:r>
+        <w:br/>
+      </w:r>
+      <w:r>
+        <w:br/>
+      </w:r>
+      <w:proofErr w:type="gramStart"/>
+      <w:r>
+        <w:t>In particular, we</w:t>
+      </w:r>
+      <w:proofErr w:type="gramEnd"/>
+      <w:r>
+        <w:t xml:space="preserve"> chose not to use Neural Networks and decided to adamantly choose the Random Forest ensemble algorithm that is implemented directly in the Scikit-Learn Python library. A Random Forest is an effective voted ensemble of hundreds of simple mathematical decision trees as opposed to complex deep neural nets. After having fully trained the forest off-</w:t>
+      </w:r>
+      <w:proofErr w:type="gramStart"/>
+      <w:r>
+        <w:t>line, then</w:t>
+      </w:r>
+      <w:proofErr w:type="gramEnd"/>
+      <w:r>
+        <w:t xml:space="preserve"> running a Random Forest to infer a quick binary classification only involves walking simple binary logical paths (e.g. 'Is variance &gt; X?') and the CPU processor can compute this type of computation with computational triviality (Patel et al., 2021). These decision nodes can pass scaled </w:t>
+      </w:r>
+      <w:r>
         <w:lastRenderedPageBreak/>
+        <w:t xml:space="preserve">network metrics with almost no delay, and these nodes can simulate the speeds that are so desperately needed when deploying actual hardware-level bare-metal deployment. Moreover, decision trees provide an explainability feature which is vital in business cybersecurity governance. In a company setting, when a mitigation AI misidentifies a big e-sports event that costs sponsors thousands of dollars, security architects </w:t>
+      </w:r>
+      <w:proofErr w:type="gramStart"/>
+      <w:r>
+        <w:t>have to</w:t>
+      </w:r>
+      <w:proofErr w:type="gramEnd"/>
+      <w:r>
+        <w:t xml:space="preserve"> be in a special position to analyze log files to conclusively determine the motivation behind the decision made. Neural networks are purely black boxes and the decision as to why the internal decimal weights led to a logical failure is unknown. In contrast, Random Forests permit mathematical transparent extraction of explicit 'Feature Importances' right away, which obviously legitimize and audit the possibility that the model prioritized the inter-arrival of packets over the entropy computation in the erroneous block assignment phase.</w:t>
+      </w:r>
+      <w:r>
         <w:br/>
-        <w:t>Recently, the emphasis shifted significantly toward proactive Machine Learning concepts for predictive threat blocking traversing these edge routes (Buczak and Guven, 2016). By interpreting sequential data flows and behavioral metadata rather than executing explicit packet payload analysis, Machine Learning nodes can identify what 'normal' baseline behavior looks like and instantly discard severe standard deviations. But one might ask: why implement complex machine learning algorithms instead of configuring generic predefined thresholds? A predefined physical-layer rule stating 'blocking all incoming UDP packets larger than 512 bytes' might work perfectly to intercept an NTP amplification strike, but the moment the game studio releases a new multiplayer networking patch that naturally increases standard positional data packet sizes to 600 bytes, the hardware firewall suddenly locks out the entire legitimate player population globally. Such incidents are incredibly costly to corporate reputations and cause massive financial damages due to service level agreement (SLA) breaches. The core defining benefit of machine learning within this security spectrum, therefore, lies entirely within its dynamic boundary adaptation. The model independently learns the complex, constantly fluctuating non-linear relationships between 'normal' packet characteristics and dynamically adapts its blocking boundaries independently of hardcoded rules.</w:t>
       </w:r>
       <w:r>
         <w:br/>
       </w:r>
       <w:r>
-        <w:br/>
-        <w:t xml:space="preserve">Despite its promises, ML in network security faces significant developmental friction. Buczak and Guven (2016) heavily noted that extremely powerful deep learning structures such as Multi-Layer Perceptrons or Deep Neural Networks (DNNs), while incredibly accurate in detecting novel malicious patterns, require intensive matrix multiplications that cause inherent process latency. In a real-time multiplayer application, delaying a packet by 100 milliseconds just to inspect it via an advanced Tensorflow algorithm is just as detrimental to the player experience as dropping it altogether. This architectural latency constraint informed the absolute selection of the algorithmic design applied in this simulation project. </w:t>
-      </w:r>
-      <w:r>
-        <w:br/>
-      </w:r>
-      <w:r>
-        <w:br/>
-        <w:t xml:space="preserve">We specifically opted against Neural Networks and firmly selected the Random Forest ensemble algorithm provided natively through the Scikit-Learn Python library. Unlike complex deep neural nets, a Random Forest operates effectively as a voted ensemble of hundreds of simple mathematical decision trees. Once a data-scientist trains the forest completely off-line, subsequently applying a Random Forest to determine a rapid binary classification requires merely traversing simple binary logical branches (e.g. 'Is variance &gt; X?'), which is computationally trivial for the CPU processor (Patel et al., 2021). We can pass scaled network metrics directly through these decision nodes with near-absolute zero latency, mimicking the speeds desperately necessary for actual hardware-level bare-metal deployment. Furthermore, decision trees offer 'explainability'—a crucial aspect in commercial cybersecurity governance. In a corporate environment, if a mitigation AI </w:t>
-      </w:r>
-      <w:r>
-        <w:lastRenderedPageBreak/>
-        <w:t>incorrectly blocks a major e-sports tournament costing sponsors thousands of dollars, security architects must be uniquely capable of forensically reviewing logs to definitively ascertain why the decision was made. Neural networks operate strictly as 'black boxes', obscuring the exact internal decimal weights that caused a logical failure. Random Forests, on the contrary, allow immediate mathematical transparent extraction of explicit 'Feature Importances', clearly validating and auditing whether the model prioritized packet inter-arrival times over entropy calculations during the incorrect block assignment.</w:t>
-      </w:r>
-      <w:r>
-        <w:br/>
-      </w:r>
-      <w:r>
-        <w:br/>
-        <w:t xml:space="preserve">Further examining the networking execution side, we implemented the front-end simulation architecture strongly mimicking typical cloud delivery network implementations. An extremely common technical alternative involves using deep packet inspection (DPI) appliances. DPI physically opens the packet encryption and scans the internal software byte code to search for recognized malicious packet header injections. This project strictly rejects DPI implementations for two core reasons: firstly, attempting to decrypt and open game-state UDP packets introduces intolerable processing latency; secondly, inspecting absolute application-layer payloads frequently breaches severe privacy compliance rules contained within modern global governance frameworks like GDPR. Instead, we extract purely metadata values: absolute mathematical packet size, explicit size variance over a defined rolling window timeframe, calculated entropy representation of the encrypted random noise payload, and pure millisecond timestamps dictating exact inter-arrival timings. These metrics are available instantly via simple statistical hardware network taps located directly at the OSI Layer 2/3 switch level, perfectly aligning with modern eBPF (Extended Berkeley Packet Filter) programming standards. eBPF allows systems administrators to write restricted compiled C-code directly inside the core Linux Kernel memory space, forcibly isolating and dropping packets before they even reach standard server user-space RAM allocations. Although the complete technical implementation of actual eBPF kernel memory hooks was ultimately deemed outside the practical scope of this Python-based academic simulation codebase, designing the simulated logic to operate exclusively on metadata heavily prepares the exact core mathematical logic for future direct production kernel translation. </w:t>
-      </w:r>
-      <w:r>
-        <w:br/>
-      </w:r>
-      <w:r>
-        <w:br/>
-        <w:t xml:space="preserve">In terms of reporting efficiency regarding dashboard capabilities, broadcasting active mitigation metrics dynamically traditionally required executing painful database polling requests, where the administrative web dashboard constantly executed SQL requests requesting continual data updates. Polling wastes immense amounts of backend thread connections and creates lag. Thus, completely aligning with the project thesis demanding real-time operational capability, the structural architecture selected utilizes modern Server-Sent Events (SSE). By leveraging the native asynchronous yield capabilities established within the Python FastAPI server framework, a persistent unidirectional </w:t>
-      </w:r>
-      <w:r>
-        <w:lastRenderedPageBreak/>
-        <w:t>continuous web socket pushes exact dictionary metrics immediately to the client Javascript, simultaneously presenting the accurate physical scale and speed associated with a globally simulated internal network infrastructure flood scenario. Therefore, this exhaustive background review solidifies the premise that this simulation functions effectively as an evidence-based operational template mapping standard academic theory against current industrial cyber security constraints.</w:t>
+        <w:t xml:space="preserve">Continuing with the simulation of networking implementation, we adopted the front-end simulation architecture closely resembling the common cloud delivery network implementations. One of the highly used technical solutions is the deployment of deep packet inspection (DPI) appliances. DPI opens the packet encryption by force and scans the internal software </w:t>
+      </w:r>
+      <w:proofErr w:type="gramStart"/>
+      <w:r>
+        <w:t>byte-code</w:t>
+      </w:r>
+      <w:proofErr w:type="gramEnd"/>
+      <w:r>
+        <w:t xml:space="preserve"> in search </w:t>
+      </w:r>
+      <w:proofErr w:type="gramStart"/>
+      <w:r>
+        <w:t>of known</w:t>
+      </w:r>
+      <w:proofErr w:type="gramEnd"/>
+      <w:r>
+        <w:t xml:space="preserve"> malicious injections of packet header. There are two fundamental reasons why this project categorically rejects the use of DPI implementations: firstly, the implementation of decryptions and the opening of game-state UDP packets would impose unacceptable processing latency; secondly, the examination of absolute application-layer payloads often likely violates stringent rules of privacy compliance contained within contemporary global governance frameworks such as GDPR. Rather, we only steal out pure metadata values, such as absolute mathematical packet size, explicit size variance over a specified rolling window time interval, calculated entropy representation of the encrypted random noise payload, and pure millisecond time values determining absolute inter-arrival times. These measurements can be accessed immediately through simple statistical network hardware taps at the OSI Layer 2/3 directly at the switch level, ideally matching the current eBPF (Extended Berkeley Packet Filter) programming model. eBPF enables the administrator to author limited compiled C-code to directly execute within the core Linux Kernel memory space, forcefully isolating and dropping packets prior to even accessing typical server user-space RAM allocations. Even though the entire technical execution of real eBPF kernel memory hooks was ultimately considered beyond the practical scope of this Python-based academic simulation codebase, providing the logic to be simulated with only metadata as input is a heavyweight precondition to the eventual direct production kernel translation of the very mathematical logic.</w:t>
       </w:r>
     </w:p>
     <w:p>
-      <w:r>
-        <w:br w:type="page"/>
+      <w:pPr>
+        <w:ind w:left="360"/>
+      </w:pPr>
+      <w:r>
+        <w:br/>
+      </w:r>
+      <w:r>
+        <w:br/>
+      </w:r>
+      <w:r>
+        <w:lastRenderedPageBreak/>
+        <w:t xml:space="preserve">Regarding reporting efficiency in terms of dashboard capabilities, broadcasting running mitigation measures traditionally would have involved implementing painful database polling requests, with the administrative web dashboard repeatedly executing SQL requests asking the database to continuously update data. Polling consumes colossal quantities of thread connections in the </w:t>
+      </w:r>
+      <w:proofErr w:type="gramStart"/>
+      <w:r>
+        <w:t>back-end</w:t>
+      </w:r>
+      <w:proofErr w:type="gramEnd"/>
+      <w:r>
+        <w:t xml:space="preserve"> and induces latency. In this way, fully adhering to the project thesis that requires real-time operating capability, the structural architecture chosen is one that employs the recent Server-Sent Events (SSE). Using the native asynchronous yield features that have been implemented in the Python </w:t>
+      </w:r>
+      <w:proofErr w:type="spellStart"/>
+      <w:r>
+        <w:t>FastAPI</w:t>
+      </w:r>
+      <w:proofErr w:type="spellEnd"/>
+      <w:r>
+        <w:t xml:space="preserve"> server architecture, a long-running unidirectional continuous web socket sends precise dictionary measures directly to the client </w:t>
+      </w:r>
+      <w:proofErr w:type="spellStart"/>
+      <w:r>
+        <w:t>Javascript</w:t>
+      </w:r>
+      <w:proofErr w:type="spellEnd"/>
+      <w:r>
+        <w:t xml:space="preserve">, at the same time showing the real physical size and performance of a globally simulated internal </w:t>
+      </w:r>
+      <w:proofErr w:type="gramStart"/>
+      <w:r>
+        <w:t>network infrastructure</w:t>
+      </w:r>
+      <w:proofErr w:type="gramEnd"/>
+      <w:r>
+        <w:t xml:space="preserve"> flood situation. As such, this comprehensive background survey underlines the fact that this simulation is a successful operation template map standard of the academic theory against the prevailing industrial cyber security limitations.</w:t>
       </w:r>
     </w:p>
     <w:p>
+      <w:r>
+        <w:br w:type="page"/>
+      </w:r>
+    </w:p>
+    <w:p>
       <w:pPr>
         <w:pStyle w:val="Heading1"/>
-      </w:pPr>
-      <w:bookmarkStart w:id="8" w:name="_Toc227571860"/>
+        <w:numPr>
+          <w:ilvl w:val="0"/>
+          <w:numId w:val="18"/>
+        </w:numPr>
+      </w:pPr>
+      <w:bookmarkStart w:id="7" w:name="_Toc227571860"/>
       <w:r>
         <w:lastRenderedPageBreak/>
         <w:t>Analysis</w:t>
       </w:r>
-      <w:bookmarkEnd w:id="8"/>
+      <w:bookmarkEnd w:id="7"/>
+      <w:r>
+        <w:t>:</w:t>
+      </w:r>
     </w:p>
     <w:p>
-      <w:r>
-        <w:t>The analysis phase of any comprehensive system requires a stringent breakdown detailing explicit operative behaviors mapping standard functional operations (detailing what the system definitively must compute independently) and crucial non-functional requirements (dictating how effectively, optimally, or smoothly the system performs under explicit strain conditions). This strict categorical separation strongly prevents feature-creep while ensuring that the core original academic validation—specifically determining whether a Random Forest classifier framework can accurately prevent DDoS traffic floods without actively penalizing the legitimate user populations—remains the sole operational focus throughout the software codebase development.</w:t>
+      <w:pPr>
+        <w:ind w:left="360"/>
+      </w:pPr>
+      <w:r>
+        <w:t xml:space="preserve">Analysis stage of any complete system must have a high-level breakdown that describes explicit operative </w:t>
+      </w:r>
+      <w:proofErr w:type="spellStart"/>
+      <w:r>
+        <w:t>behaviours</w:t>
+      </w:r>
+      <w:proofErr w:type="spellEnd"/>
+      <w:r>
+        <w:t xml:space="preserve"> that map standard functional </w:t>
+      </w:r>
+      <w:proofErr w:type="spellStart"/>
+      <w:r>
+        <w:t>behaviour</w:t>
+      </w:r>
+      <w:proofErr w:type="spellEnd"/>
+      <w:r>
+        <w:t xml:space="preserve"> (describing what the system is ultimately required to compute by itself) and important non-functional requirements (describing how well, best, or smoothly the system will work under explicit strain conditions). This categorical division is very rigid, and thus helps in avoiding feature-creep, and at the same time, makes sure that the core original academic validation, of whether a Random Forest classifier framework can effectively prevent DDoS traffic floods without actively punishing the legitimate user populations, is the only operational focus during the software codebase development.</w:t>
       </w:r>
     </w:p>
     <w:p>
       <w:pPr>
         <w:pStyle w:val="Heading2"/>
-      </w:pPr>
-      <w:bookmarkStart w:id="9" w:name="_Toc227571861"/>
+        <w:ind w:firstLine="360"/>
+      </w:pPr>
+      <w:bookmarkStart w:id="8" w:name="_Toc227571861"/>
       <w:r>
         <w:t>Functional Requirements</w:t>
       </w:r>
-      <w:bookmarkEnd w:id="9"/>
+      <w:bookmarkEnd w:id="8"/>
+      <w:r>
+        <w:t>:</w:t>
+      </w:r>
     </w:p>
     <w:p>
-      <w:r>
+      <w:pPr>
+        <w:ind w:left="360"/>
+      </w:pPr>
+      <w:r>
+        <w:rPr>
+          <w:b/>
+          <w:bCs/>
+        </w:rPr>
         <w:t>FR1: Hybrid Dataset Consolidation Strategy</w:t>
       </w:r>
       <w:r>
+        <w:rPr>
+          <w:b/>
+          <w:bCs/>
+        </w:rPr>
+        <w:t>:</w:t>
+      </w:r>
+      <w:r>
         <w:br/>
-        <w:t>The deployed backend server logic must autonomously gather, isolate, and formulate telemetry elements comprehensively representing two intrinsically separate operational populations defining regular traffic and aggressive attack vectors. The code architecture must prominently feature a `generate_normal_traffic` generation function heavily utilizing bounded random normal distributions mathematically simulating steady human-controlled 20Hz gameplay positional tick rates (equating to approximately 50ms consistent operational gaps). Simultaneously, the secondary `load_and_filter_botnet_data` routine logically must attempt executing extractions isolating massive structural payload volume bursts from offline formatted `.parquet` analytical datasets held securely inside local storage archives. Should offline dataset access fail due to explicit operational I/O constraints or absent source files, the routine must instantly seamlessly fallback executing a complete secondary mathematical distribution generating realistic erratic UDP data structures simulating overwhelming baseline fluctuations. Following autonomous generation, the subsequent `create_hybrid_dataset` method merges these separate data structures dynamically into unified DataFrames, executing strict memory randomization protocols (shuffling) effectively eliminating any natural sequential grouping bias before safely feeding the compiled structure into the active statistical scaling processor.</w:t>
+      </w:r>
+      <w:r>
+        <w:t xml:space="preserve">The deployed backend server logic would have to self-accumulate, segregate and create telemetry components holistically representing two inherently distinct operating populations that characterize normal operator traffic and malicious attack vectors. A code architecture should prominently include a generation normal traffic generation function that heavily relies on bounded random normal distributions mathematically simulating constant human controlled 20Hz gameplay positional tick rates (which would correspond to around 50ms constant operational gaps). At the same time, the second-level load-and-filter-botnet-data routine logically needs to attempt to make extractions that segregate massive structural payload volume bursts offline </w:t>
+      </w:r>
+      <w:proofErr w:type="gramStart"/>
+      <w:r>
+        <w:t>formatted .parquet</w:t>
+      </w:r>
+      <w:proofErr w:type="gramEnd"/>
+      <w:r>
+        <w:t xml:space="preserve"> analytical datasets stored safely within local storage archives. In case of failure in offline dataset access because of operational explicit I/O limits, or because of the lack of source files, the routine should immediately gracefully </w:t>
+      </w:r>
+      <w:proofErr w:type="gramStart"/>
+      <w:r>
+        <w:t>fallback</w:t>
+      </w:r>
+      <w:proofErr w:type="gramEnd"/>
+      <w:r>
+        <w:t xml:space="preserve"> to execution of a full secondary mathematical distribution of realistic erratic UDP data structures, to simulate excessive fluctuations at the baseline. After independent generation, the following </w:t>
+      </w:r>
+      <w:proofErr w:type="spellStart"/>
+      <w:r>
+        <w:t>createhybriddataset</w:t>
+      </w:r>
+      <w:proofErr w:type="spellEnd"/>
+      <w:r>
+        <w:t xml:space="preserve"> method combines these individual data structures dynamically into coherent </w:t>
+      </w:r>
+      <w:proofErr w:type="spellStart"/>
+      <w:r>
+        <w:t>DataFrames</w:t>
+      </w:r>
+      <w:proofErr w:type="spellEnd"/>
+      <w:r>
+        <w:t>, and implements stringent memory randomization measures (shuffling) essentially removing any inherent sequential grouping bias prior to safely passing the compiled structure into the active statistical scaling processor.</w:t>
       </w:r>
       <w:r>
         <w:br/>
@@ -2359,11 +2883,11 @@
       </w:r>
       <w:r>
         <w:br/>
-        <w:t xml:space="preserve">The web-based visual user interface must successfully expose a distinct administrative control endpoint (a defined HTML button representation) intentionally mapped to permit an external network engineering operator explicit capabilities to securely initiate the overarching algorithmic background calculation phase directly on demand. Upon successfully transmitting the HTTP POST request to the explicit `/api/train` backend controller mapping, the core Python server interpreter must immediately load specific dataset permutations, utilize standard `Scikit-learn` algorithms calculating normalized </w:t>
+        <w:t xml:space="preserve">The web-based visual user interface must successfully expose a distinct administrative control endpoint (a defined HTML button representation) intentionally mapped to permit an external network engineering operator explicit capabilities to securely initiate the overarching algorithmic background calculation phase directly on demand. Upon successfully transmitting the HTTP POST request to the explicit `/api/train` backend controller mapping, the core Python server interpreter must </w:t>
       </w:r>
       <w:r>
         <w:lastRenderedPageBreak/>
-        <w:t>`train_test_split` cross-validation variables, formally instantiate the Random Forest classifier matrix assigning parameters allowing exactly up to 100 deep constituent estimation nodes to form preventing extensive branching logic generating computational overfitting problems. Following strict creation, it executes the explicit `.fit()` iterative methodology mapping variables. It subsequently computes static local validations establishing confusion arrays (mapping true negatives and active false dropping variables) and pushes a successfully serialized JSON success string backwards towards the Javascript caller invoking interface DOM transitions.</w:t>
+        <w:t>immediately load specific dataset permutations, utilize standard `Scikit-learn` algorithms calculating normalized `train_test_split` cross-validation variables, formally instantiate the Random Forest classifier matrix assigning parameters allowing exactly up to 100 deep constituent estimation nodes to form preventing extensive branching logic generating computational overfitting problems. Following strict creation, it executes the explicit `.fit()` iterative methodology mapping variables. It subsequently computes static local validations establishing confusion arrays (mapping true negatives and active false dropping variables) and pushes a successfully serialized JSON success string backwards towards the Javascript caller invoking interface DOM transitions.</w:t>
       </w:r>
       <w:r>
         <w:br/>
@@ -2392,28 +2916,34 @@
       </w:r>
       <w:r>
         <w:br/>
+      </w:r>
+      <w:r>
+        <w:lastRenderedPageBreak/>
         <w:t>FR5: Mobile Threat Notification Delivery Sequences</w:t>
       </w:r>
       <w:r>
         <w:br/>
-        <w:t xml:space="preserve">When the continuous stream counters natively detect aggressive sustained patterns of maliciously categorized 'dropped' arrays deliberately breaching explicit embedded </w:t>
-      </w:r>
-      <w:r>
-        <w:lastRenderedPageBreak/>
-        <w:t>security volume thresholds (explicitly hard-coded mapped to precisely 15 concurrent uninterrupted aggressive elements specifically mimicking extended overwhelming strain environments), the FastAPI framework logic must securely instantiate separate independent task functions explicitly calling python local shell integration libraries exactly utilizing the `pywhatkit` codebase implementations. This execution translates raw current numerical assessment counts tracking cumulative dropped entities paired simultaneously matching false positive percentage values directly toward standard outbound strings dynamically mapped executing live mobile SMS/WhatsApp protocol API interactions, notifying network infrastructure leaders seamlessly without generating terminal locks.</w:t>
+        <w:t>When the continuous stream counters natively detect aggressive sustained patterns of maliciously categorized 'dropped' arrays deliberately breaching explicit embedded security volume thresholds (explicitly hard-coded mapped to precisely 15 concurrent uninterrupted aggressive elements specifically mimicking extended overwhelming strain environments), the FastAPI framework logic must securely instantiate separate independent task functions explicitly calling python local shell integration libraries exactly utilizing the `pywhatkit` codebase implementations. This execution translates raw current numerical assessment counts tracking cumulative dropped entities paired simultaneously matching false positive percentage values directly toward standard outbound strings dynamically mapped executing live mobile SMS/WhatsApp protocol API interactions, notifying network infrastructure leaders seamlessly without generating terminal locks.</w:t>
       </w:r>
     </w:p>
     <w:p>
       <w:pPr>
         <w:pStyle w:val="Heading2"/>
-      </w:pPr>
-      <w:bookmarkStart w:id="10" w:name="_Toc227571862"/>
+        <w:ind w:firstLine="360"/>
+      </w:pPr>
+      <w:bookmarkStart w:id="9" w:name="_Toc227571862"/>
       <w:r>
         <w:t>Non-Functional Requirements</w:t>
       </w:r>
-      <w:bookmarkEnd w:id="10"/>
+      <w:bookmarkEnd w:id="9"/>
+      <w:r>
+        <w:t>:</w:t>
+      </w:r>
     </w:p>
     <w:p>
+      <w:pPr>
+        <w:ind w:left="360"/>
+      </w:pPr>
       <w:r>
         <w:t>NFR1: Absolute Strict Prioritization Maintaining Negligible False Positive Boundaries</w:t>
       </w:r>
@@ -2441,26 +2971,48 @@
       </w:r>
       <w:r>
         <w:br/>
-        <w:t xml:space="preserve">The administrative simulated frontend operator dashboard strictly demands continuous sixty frames per second execution speeds natively rendered utilizing local hardware acceleration protocols. Executing explicit single threaded asynchronous Javascript loops processing thousands of individual SSE push operations implicitly ensures complex </w:t>
       </w:r>
       <w:r>
         <w:lastRenderedPageBreak/>
-        <w:t>parsing structures executing innerHTML text injections drastically avoid seizing standard UI rendering elements. Moreover, advanced DOM element culling routines continuously check document child counts explicitly removing older stale log rows mapping beyond display limitations, ensuring memory usage stays static preventing absolute catastrophic crash routines.</w:t>
+        <w:t>The administrative simulated frontend operator dashboard strictly demands continuous sixty frames per second execution speeds natively rendered utilizing local hardware acceleration protocols. Executing explicit single threaded asynchronous Javascript loops processing thousands of individual SSE push operations implicitly ensures complex parsing structures executing innerHTML text injections drastically avoid seizing standard UI rendering elements. Moreover, advanced DOM element culling routines continuously check document child counts explicitly removing older stale log rows mapping beyond display limitations, ensuring memory usage stays static preventing absolute catastrophic crash routines.</w:t>
       </w:r>
     </w:p>
     <w:p>
       <w:pPr>
         <w:pStyle w:val="Heading2"/>
-      </w:pPr>
-      <w:bookmarkStart w:id="11" w:name="_Toc227571863"/>
+        <w:ind w:firstLine="360"/>
+      </w:pPr>
+      <w:bookmarkStart w:id="10" w:name="_Toc227571863"/>
       <w:r>
         <w:t>System Use Cases Models</w:t>
       </w:r>
-      <w:bookmarkEnd w:id="11"/>
+      <w:bookmarkEnd w:id="10"/>
+      <w:r>
+        <w:t>:</w:t>
+      </w:r>
     </w:p>
     <w:p>
-      <w:r>
-        <w:t>The fundamental architectural software formulation executes explicitly reacting amongst three isolated contextual system actors simultaneously operating over explicit system resources. The automated algorithmic process loop (System), the aggressive high volume structural generation loop aggressively replicating outside boundaries (Attacker), and the visual web based execution element triggering physical operations matrices (Administrator).</w:t>
+      <w:pPr>
+        <w:ind w:left="360"/>
+      </w:pPr>
+      <w:r>
+        <w:t xml:space="preserve">The fundamental architectural software </w:t>
+      </w:r>
+      <w:proofErr w:type="gramStart"/>
+      <w:r>
+        <w:t>formulation executes</w:t>
+      </w:r>
+      <w:proofErr w:type="gramEnd"/>
+      <w:r>
+        <w:t xml:space="preserve"> explicitly </w:t>
+      </w:r>
+      <w:proofErr w:type="gramStart"/>
+      <w:r>
+        <w:t>reacting</w:t>
+      </w:r>
+      <w:proofErr w:type="gramEnd"/>
+      <w:r>
+        <w:t xml:space="preserve"> amongst three isolated contextual system actors simultaneously operating over explicit system resources. The automated algorithmic process loop (System), the aggressive high volume structural generation loop aggressively replicating outside boundaries (Attacker), and the visual web based execution element triggering physical operations matrices (Administrator).</w:t>
       </w:r>
       <w:r>
         <w:br/>
@@ -2482,13 +3034,16 @@
       </w:r>
       <w:r>
         <w:br/>
-        <w:t>Actor Requirement: Administrator initializing events effectively triggering autonomous internal simulated Attacker loops. System assumes successfully trained models operate. Primary Flow Sequence: Operator clicks specifically deployed 'Enable Mitigation Shield' button components. Frontend HTTP streams initiate immediately listening explicitly mapping endpoints over persistent connection tunnels. FastAPI generators initialize while loops. Legitimate packet formulation simulates organic arrays natively mapped calculating small variance behaviors. Alongside organic traffic, asynchronous attack variables produce massive variance combinations aggressively altering inter-arrival calculations. Active System processes intercept merged data streams immediately executing classifier calculations yielding outputs directly downstream alongside recorded logical truth arrays isolating physical model errors cleanly. Dashboard DOM renders continuous visual heatmap statistics directly translating offline data values simulating reality realistically.</w:t>
+        <w:t xml:space="preserve">Actor Requirement: Administrator initializing events effectively triggering autonomous internal simulated Attacker loops. System assumes successfully trained models operate. Primary Flow Sequence: Operator clicks specifically deployed 'Enable Mitigation Shield' button components. Frontend HTTP streams initiate immediately listening explicitly mapping endpoints over persistent connection tunnels. FastAPI generators initialize while loops. Legitimate packet formulation simulates organic arrays natively mapped calculating small variance behaviors. Alongside organic traffic, asynchronous attack variables produce massive variance </w:t>
+      </w:r>
+      <w:r>
+        <w:lastRenderedPageBreak/>
+        <w:t>combinations aggressively altering inter-arrival calculations. Active System processes intercept merged data streams immediately executing classifier calculations yielding outputs directly downstream alongside recorded logical truth arrays isolating physical model errors cleanly. Dashboard DOM renders continuous visual heatmap statistics directly translating offline data values simulating reality realistically.</w:t>
       </w:r>
       <w:r>
         <w:br/>
       </w:r>
       <w:r>
-        <w:lastRenderedPageBreak/>
         <w:br/>
         <w:t>Use Case 3: Mobile Outbound Notification Execution on Stress Boundaries</w:t>
       </w:r>
@@ -2505,15 +3060,25 @@
     <w:p>
       <w:pPr>
         <w:pStyle w:val="Heading1"/>
-      </w:pPr>
-      <w:bookmarkStart w:id="12" w:name="_Toc227571864"/>
+        <w:numPr>
+          <w:ilvl w:val="0"/>
+          <w:numId w:val="18"/>
+        </w:numPr>
+      </w:pPr>
+      <w:bookmarkStart w:id="11" w:name="_Toc227571864"/>
       <w:r>
         <w:lastRenderedPageBreak/>
         <w:t>Design</w:t>
       </w:r>
-      <w:bookmarkEnd w:id="12"/>
+      <w:bookmarkEnd w:id="11"/>
+      <w:r>
+        <w:t>:</w:t>
+      </w:r>
     </w:p>
     <w:p>
+      <w:pPr>
+        <w:ind w:left="360"/>
+      </w:pPr>
       <w:r>
         <w:t>The structural technical compilation inherently implemented throughout this project directly respects completely distinct modular logic abstraction definitions. By actively keeping advanced data science preprocessing loops tightly separated executing entirely autonomously from the explicit ASGI API routing functions, combined maintaining complete physical detachment from client end browser DOM state management, the physical codebase securely maintains profound levels of direct component testability natively. This explicit chapter precisely outlines overarching structural framework organization matrices explicitly defining Python global variable inheritance methodologies natively defining complex network simulations accurately simulating reality.</w:t>
       </w:r>
@@ -2521,14 +3086,21 @@
     <w:p>
       <w:pPr>
         <w:pStyle w:val="Heading2"/>
-      </w:pPr>
-      <w:bookmarkStart w:id="13" w:name="_Toc227571865"/>
+        <w:ind w:firstLine="360"/>
+      </w:pPr>
+      <w:bookmarkStart w:id="12" w:name="_Toc227571865"/>
       <w:r>
         <w:t>Structural Application Layers Architecture</w:t>
       </w:r>
-      <w:bookmarkEnd w:id="13"/>
+      <w:bookmarkEnd w:id="12"/>
+      <w:r>
+        <w:t>:</w:t>
+      </w:r>
     </w:p>
     <w:p>
+      <w:pPr>
+        <w:ind w:left="360"/>
+      </w:pPr>
       <w:r>
         <w:t xml:space="preserve">The fundamental baseline software code framework relies exclusively across establishing a powerful python application backend strictly heavily utilizing the robust natively asynchronous 'FastAPI' web framework. Applying FastAPI firmly leverages complete intrinsic support natively enabling advanced ASGI non-blocking operational methodologies, thus ensuring absolute maximal hardware processor throughput optimization across highly simultaneous data processing events simulating massive traffic flow volumes mathematically. </w:t>
       </w:r>
@@ -2541,11 +3113,11 @@
       </w:r>
       <w:r>
         <w:br/>
-        <w:t xml:space="preserve">This specifically detailed foundational software module operates entirely in isolation executing independently decoupled safely navigating unattached completely outside specific web application API endpoints natively. Structural formatting within this layer executes primarily centering heavily around discrete standalone Python function loops directly integrated dynamically reading, filtering, parsing, and restructuring complex DataFrames natively controlled heavily utilizing explicit Pandas methodologies directly. Executing primary baseline raw dataset ingestion structures logically navigates internal functional operations automatically engaging standard local Python OS path utilities natively sweeping physical absolute disk locations deliberately extracting local offline physical `.parquet` telemetry datasets. Executing physical analysis models across raw network data exclusively mapping native Parquet files significantly outpaces standard raw flat CSV physical memory ingestion overhead drastically, essentially required optimizing performance avoiding physical RAM capacity saturation restrictions commonly affecting heavy local data science environment simulations natively. Furthermore explicitly prioritizing robust fault recovery, must physical file system disk access entirely fail locating designated extraction sources, the defined internal structural methods cleanly failover executing secondary complex deterministic numpy array </w:t>
+        <w:t xml:space="preserve">This specifically detailed foundational software module operates entirely in isolation executing independently decoupled safely navigating unattached completely outside specific web application API endpoints natively. Structural formatting within this layer executes primarily centering heavily around discrete standalone Python function loops directly integrated dynamically reading, filtering, parsing, and restructuring complex DataFrames natively controlled heavily utilizing explicit Pandas methodologies directly. Executing primary baseline raw dataset ingestion structures logically navigates internal functional operations automatically engaging standard local Python OS path utilities natively sweeping physical absolute disk locations deliberately extracting local offline physical `.parquet` telemetry datasets. Executing physical analysis models across raw network data exclusively mapping native Parquet files significantly outpaces standard raw flat CSV physical memory ingestion overhead drastically, essentially required optimizing performance avoiding physical RAM capacity saturation restrictions commonly affecting heavy local data science environment simulations natively. Furthermore explicitly prioritizing robust fault recovery, must physical file system disk access entirely fail locating designated extraction sources, the defined internal structural methods cleanly failover executing </w:t>
       </w:r>
       <w:r>
         <w:lastRenderedPageBreak/>
-        <w:t>synthesis pipelines realistically mocking extreme real-life fluctuation limits mimicking hostile network events seamlessly natively allowing server configurations complete initialization without total core application fatal panic triggers correctly. Crucially culminating standard execution protocols inside this foundational logic outputs dual highly critical physical variables permanently into functional global RAM memory matrices safely: Firstly returning the fundamentally complete mathematically mapped `RandomForestClassifier` object tree algorithm arrays alongside returning identical importance mathematically derived completely exact operational `StandardScaler` definition mathematical objects explicitly unconditionally required safely standardizing unconstrained live incoming external packet arrays maintaining operational bounds seamlessly before explicit statistical execution sequences complete fully.</w:t>
+        <w:t>secondary complex deterministic numpy array synthesis pipelines realistically mocking extreme real-life fluctuation limits mimicking hostile network events seamlessly natively allowing server configurations complete initialization without total core application fatal panic triggers correctly. Crucially culminating standard execution protocols inside this foundational logic outputs dual highly critical physical variables permanently into functional global RAM memory matrices safely: Firstly returning the fundamentally complete mathematically mapped `RandomForestClassifier` object tree algorithm arrays alongside returning identical importance mathematically derived completely exact operational `StandardScaler` definition mathematical objects explicitly unconditionally required safely standardizing unconstrained live incoming external packet arrays maintaining operational bounds seamlessly before explicit statistical execution sequences complete fully.</w:t>
       </w:r>
       <w:r>
         <w:br/>
@@ -2556,13 +3128,16 @@
       </w:r>
       <w:r>
         <w:br/>
-        <w:t>The executing live FastAPI controller instances directly establish operational states successfully maintaining persistent local memory instances heavily retaining exact Python object mappings exactly corresponding tracking `GLOBAL_MODEL` instances natively bridging functional namespaces directly. The application layer explicitly dictates formatting structures separating operations entirely mapping strictly establishing exactly three fundamentally distinct endpoint URL web router definitions. Initial standard `/` URI pathway correctly actively responds securely mapping functional StaticFiles mounting configurations executing local extraction retrieving standard absolute client GUI structure indices natively. Simultaneously executing HTTP POST transactions executing specifically crossing explicit `/api/train` controller maps directly securely commands underlying machine logic pipelines natively physically engaging exact `Scikit-Learn` library dependencies physically mapping specific data rows directly crossing logical splits safely computing massive internal algorithmic metrics returning exact successful confirmation structured text arrays confirming online definitions explicitly. However, investigating architecture crucially mapping definitive advanced core execution loops strongly relies navigating precise functional definitions strictly executing within absolute designated boundaries establishing specifically exact route endpoints directly locating towards `/api/simulate` definitions exactly. This execution logic physically avoids processing normal JSON dictionaries natively implementing complex asynchronous `EventSourceResponse` return logic completely. Unlike executing basic REST definitions actively severing local HTTP data pipelines explicitly mapping response finalizations naturally natively closing socket ports completely, the structural simulation completely legally hijacks structural response connections utilizing standard python `yield` statements executing endless data generation pipelines mathematically forcing uninterrupted streams across web protocol bounds mimicking continuous realtime live physical network interface telemetry directly precisely modeling actual events exactly.</w:t>
+        <w:t xml:space="preserve">The executing live FastAPI controller instances directly establish operational states successfully maintaining persistent local memory instances heavily retaining exact Python object mappings exactly corresponding tracking `GLOBAL_MODEL` instances natively bridging functional namespaces directly. The application layer explicitly dictates formatting structures separating operations entirely mapping strictly establishing exactly three fundamentally distinct endpoint URL web router definitions. Initial standard `/` URI pathway correctly actively responds securely mapping functional StaticFiles mounting configurations executing local extraction retrieving standard absolute client GUI structure indices natively. Simultaneously executing HTTP POST transactions executing specifically crossing explicit `/api/train` controller maps directly securely commands underlying machine logic pipelines natively physically engaging exact `Scikit-Learn` library dependencies physically mapping specific data rows directly crossing logical splits safely computing massive internal algorithmic metrics returning exact successful confirmation structured text arrays confirming online definitions explicitly. However, investigating architecture crucially mapping definitive advanced core execution loops strongly relies navigating precise functional definitions strictly executing within absolute designated boundaries establishing specifically exact route endpoints directly locating towards `/api/simulate` definitions exactly. This execution logic physically avoids processing normal JSON dictionaries natively implementing complex asynchronous `EventSourceResponse` return logic completely. Unlike executing basic REST definitions actively severing local HTTP data pipelines explicitly mapping response finalizations naturally natively closing socket ports completely, the structural simulation completely legally hijacks structural response connections </w:t>
+      </w:r>
+      <w:r>
+        <w:lastRenderedPageBreak/>
+        <w:t>utilizing standard python `yield` statements executing endless data generation pipelines mathematically forcing uninterrupted streams across web protocol bounds mimicking continuous realtime live physical network interface telemetry directly precisely modeling actual events exactly.</w:t>
       </w:r>
       <w:r>
         <w:br/>
       </w:r>
       <w:r>
-        <w:lastRenderedPageBreak/>
         <w:br/>
         <w:t>Layer 3: Local DOM Mutability Configuration Environment Variables (`script.js` &amp; `index.html`)</w:t>
       </w:r>
@@ -2573,57 +3148,242 @@
     </w:p>
     <w:p>
       <w:pPr>
-        <w:pStyle w:val="Heading2"/>
-      </w:pPr>
-      <w:bookmarkStart w:id="14" w:name="_Toc227571866"/>
-      <w:r>
-        <w:t>Explicit Active Asynchronous Behavioural Models</w:t>
-      </w:r>
-      <w:bookmarkEnd w:id="14"/>
+        <w:ind w:left="2160"/>
+      </w:pPr>
+      <w:r>
+        <w:drawing>
+          <wp:inline distT="0" distB="0" distL="0" distR="0" wp14:anchorId="5AE02AB5" wp14:editId="44D0CF6D">
+            <wp:extent cx="2449830" cy="3287706"/>
+            <wp:effectExtent l="19050" t="19050" r="26670" b="27305"/>
+            <wp:docPr id="1608689420" name="Picture 1"/>
+            <wp:cNvGraphicFramePr>
+              <a:graphicFrameLocks xmlns:a="http://schemas.openxmlformats.org/drawingml/2006/main" noChangeAspect="1"/>
+            </wp:cNvGraphicFramePr>
+            <a:graphic xmlns:a="http://schemas.openxmlformats.org/drawingml/2006/main">
+              <a:graphicData uri="http://schemas.openxmlformats.org/drawingml/2006/picture">
+                <pic:pic xmlns:pic="http://schemas.openxmlformats.org/drawingml/2006/picture">
+                  <pic:nvPicPr>
+                    <pic:cNvPr id="1608689420" name=""/>
+                    <pic:cNvPicPr/>
+                  </pic:nvPicPr>
+                  <pic:blipFill>
+                    <a:blip r:embed="rId8"/>
+                    <a:stretch>
+                      <a:fillRect/>
+                    </a:stretch>
+                  </pic:blipFill>
+                  <pic:spPr>
+                    <a:xfrm>
+                      <a:off x="0" y="0"/>
+                      <a:ext cx="2465663" cy="3308954"/>
+                    </a:xfrm>
+                    <a:prstGeom prst="rect">
+                      <a:avLst/>
+                    </a:prstGeom>
+                    <a:ln>
+                      <a:solidFill>
+                        <a:schemeClr val="tx1"/>
+                      </a:solidFill>
+                    </a:ln>
+                  </pic:spPr>
+                </pic:pic>
+              </a:graphicData>
+            </a:graphic>
+          </wp:inline>
+        </w:drawing>
+      </w:r>
     </w:p>
     <w:p>
-      <w:r>
-        <w:t xml:space="preserve">Operating actively mapping standard interaction events directly exposes software executing explicit dual tracked sequential execution logic accurately separating physical asynchronous realities securely. Initial defined primary operational sequences completely implement explicit blocking standard synchronous timeline executions strictly. Network technical operators physically command initialization inputs completely directly forcing active client HTTP browser application fetch transactions. The standard system intercepts execution pipelines executing physical mathematical matrix calculations cleanly isolating precisely defined massive data sample components, completely mapping absolute variable matrices generating highly complicated Random Forest matrices accurately executing absolute physical internal array branching algorithms exactly correctly processing fully 100 native evaluation sequence layers. This execution mathematically logically forces exact primary system CPU cores strictly locking operational boundaries preventing extraneous API interaction conflicts absolutely natively resulting executing precise explicit metric evaluations exactly returning outputs confirming physical model finalizations cleanly securely. </w:t>
-      </w:r>
-      <w:r>
-        <w:br/>
-      </w:r>
-      <w:r>
-        <w:br/>
-        <w:t xml:space="preserve">Contrasting explicit synchronous routines completely mapping operational system simulation phases exactly generates radically different software behavioral pipelines executing uniquely implementing explicit fully asynchronous generation methodologies natively. Network application operators initialize physical mitigation start elements actively immediately successfully opening specific Server-Sent local physical application pipelines explicitly establishing internal permanent loops natively generating continuous </w:t>
-      </w:r>
-      <w:r>
-        <w:lastRenderedPageBreak/>
-        <w:t xml:space="preserve">randomized logical values completely natively mimicking extreme erratic aggressive external botnet anomalies effectively randomly inserting standard human player variables interspersed actively creating exact representations naturally establishing chaos arrays cleanly. The active python simulation core precisely executes endless iterative loops natively running exactly transforming raw unformatted physical dataset metrics directly specifically pushing unaligned specific array parameters exactly actively through mapped scaler transformation functions strictly ensuring unnormalized integers absolutely never completely generate explicit corrupted classifier errors natively. System extracts explicit variable binary outputs securely calculating metrics defining specifically exact logical evaluation models mapping precisely correct actions physically generating raw HTTP output texts uniquely combining mathematically formatted JSON exact combinations. Explicit executing standard python `await asyncio.sleep()` commands absolutely critically enforces realistic mechanical delivery limitations successfully preventing system hardware running exact infinite loops totally locking physical hardware core arrays dynamically completely mimicking actual realistic processing environments flawlessly correctly securely. </w:t>
-      </w:r>
-      <w:r>
-        <w:br/>
-      </w:r>
-      <w:r>
-        <w:br/>
-        <w:t>Ultimately executing final specific client rendering pipelines cleanly immediately triggering explicit Javascript `onmessage` internal browser system function executions specifically generating specific localized HTML table elements structurally cleanly exactly inserting DOM properties mapping customized CSS variables mapping specific geographic parameters accurately providing detailed interface displays securely successfully visually completely representing exact dynamic structural performance indicators perfectly accurately.</w:t>
+      <w:pPr>
+        <w:ind w:left="720" w:firstLine="720"/>
+        <w:rPr>
+          <w:b/>
+          <w:i/>
+        </w:rPr>
+      </w:pPr>
+      <w:r>
+        <w:rPr>
+          <w:bCs/>
+          <w:iCs/>
+          <w:sz w:val="22"/>
+          <w:szCs w:val="20"/>
+        </w:rPr>
+        <w:t xml:space="preserve">  </w:t>
+      </w:r>
+      <w:r>
+        <w:rPr>
+          <w:bCs/>
+          <w:iCs/>
+          <w:sz w:val="22"/>
+          <w:szCs w:val="20"/>
+        </w:rPr>
+        <w:t xml:space="preserve"> </w:t>
+      </w:r>
+      <w:r>
+        <w:rPr>
+          <w:bCs/>
+          <w:iCs/>
+          <w:sz w:val="22"/>
+          <w:szCs w:val="20"/>
+        </w:rPr>
+        <w:tab/>
+        <w:t xml:space="preserve">  </w:t>
+      </w:r>
+      <w:r>
+        <w:rPr>
+          <w:b/>
+          <w:i/>
+        </w:rPr>
+        <w:t xml:space="preserve">Figure 1.2: Component &amp; Architecture Diagram </w:t>
       </w:r>
     </w:p>
     <w:p>
-      <w:r>
-        <w:br w:type="page"/>
+      <w:pPr>
+        <w:pStyle w:val="Heading2"/>
+      </w:pPr>
+      <w:bookmarkStart w:id="13" w:name="_Toc227571866"/>
+      <w:r>
+        <w:lastRenderedPageBreak/>
+        <w:t>Explicit Active Asynchronous Behavioural Models</w:t>
+      </w:r>
+      <w:bookmarkEnd w:id="13"/>
+      <w:r>
+        <w:t>:</w:t>
       </w:r>
     </w:p>
     <w:p>
+      <w:r>
+        <w:t xml:space="preserve">Operating actively mapping standard interaction events directly exposes software executing explicit dual tracked sequential execution logic accurately separating physical asynchronous realities securely. Initial defined primary operational sequences completely implement explicit blocking standard synchronous timeline executions strictly. Network technical operators physically command initialization inputs completely directly forcing active client HTTP browser application fetch transactions. The standard system intercepts execution pipelines executing physical mathematical matrix calculations cleanly isolating precisely defined massive data sample components, completely mapping absolute variable matrices generating highly complicated Random Forest matrices accurately executing absolute physical internal array branching algorithms exactly correctly processing fully 100 native evaluation sequence layers. This execution mathematically logically forces exact primary system CPU cores strictly locking operational boundaries preventing extraneous API interaction conflicts absolutely natively resulting executing precise explicit metric evaluations exactly returning outputs confirming physical model finalizations cleanly securely. </w:t>
+      </w:r>
+      <w:r>
+        <w:br/>
+      </w:r>
+      <w:r>
+        <w:br/>
+        <w:t xml:space="preserve">Contrasting explicit synchronous routines completely mapping operational system simulation phases exactly generates radically different software behavioral pipelines executing uniquely implementing explicit fully asynchronous generation methodologies natively. Network application operators initialize physical mitigation start elements actively immediately successfully opening specific Server-Sent local physical application pipelines explicitly establishing internal permanent loops natively generating continuous randomized logical values completely natively mimicking extreme erratic aggressive external botnet anomalies effectively randomly inserting standard human player variables interspersed actively creating exact representations naturally establishing chaos arrays cleanly. The active python simulation core precisely executes endless iterative loops natively running exactly transforming raw unformatted physical dataset metrics directly specifically pushing unaligned specific array parameters exactly actively through mapped scaler transformation functions strictly ensuring unnormalized integers absolutely never completely generate explicit corrupted classifier errors natively. System extracts explicit variable binary outputs securely calculating metrics defining specifically exact logical evaluation models mapping precisely correct actions physically generating raw HTTP output texts uniquely combining mathematically formatted JSON exact combinations. Explicit executing standard python `await asyncio.sleep()` commands absolutely critically enforces realistic mechanical delivery limitations successfully preventing system hardware running exact infinite loops totally locking physical hardware core arrays dynamically completely mimicking actual realistic processing environments flawlessly correctly securely. </w:t>
+      </w:r>
+      <w:r>
+        <w:br/>
+      </w:r>
+      <w:r>
+        <w:br/>
+      </w:r>
+      <w:r>
+        <w:lastRenderedPageBreak/>
+        <w:t>Ultimately executing final specific client rendering pipelines cleanly immediately triggering explicit Javascript `onmessage` internal browser system function executions specifically generating specific localized HTML table elements structurally cleanly exactly inserting DOM properties mapping customized CSS variables mapping specific geographic parameters accurately providing detailed interface displays securely successfully visually completely representing exact dynamic structural performance indicators perfectly accurately.</w:t>
+      </w:r>
+    </w:p>
+    <w:p>
+      <w:pPr>
+        <w:rPr>
+          <w:noProof/>
+        </w:rPr>
+      </w:pPr>
+      <w:r>
+        <w:rPr>
+          <w:noProof/>
+        </w:rPr>
+        <w:t xml:space="preserve"> </w:t>
+      </w:r>
+      <w:r>
+        <w:rPr>
+          <w:noProof/>
+        </w:rPr>
+        <w:drawing>
+          <wp:inline distT="0" distB="0" distL="0" distR="0" wp14:anchorId="3ABFEE84" wp14:editId="25BA1E89">
+            <wp:extent cx="5958706" cy="5071110"/>
+            <wp:effectExtent l="19050" t="19050" r="23495" b="15240"/>
+            <wp:docPr id="60396595" name="Picture 1"/>
+            <wp:cNvGraphicFramePr>
+              <a:graphicFrameLocks xmlns:a="http://schemas.openxmlformats.org/drawingml/2006/main" noChangeAspect="1"/>
+            </wp:cNvGraphicFramePr>
+            <a:graphic xmlns:a="http://schemas.openxmlformats.org/drawingml/2006/main">
+              <a:graphicData uri="http://schemas.openxmlformats.org/drawingml/2006/picture">
+                <pic:pic xmlns:pic="http://schemas.openxmlformats.org/drawingml/2006/picture">
+                  <pic:nvPicPr>
+                    <pic:cNvPr id="0" name="Picture 1"/>
+                    <pic:cNvPicPr>
+                      <a:picLocks noChangeAspect="1" noChangeArrowheads="1"/>
+                    </pic:cNvPicPr>
+                  </pic:nvPicPr>
+                  <pic:blipFill>
+                    <a:blip r:embed="rId9">
+                      <a:extLst>
+                        <a:ext uri="{28A0092B-C50C-407E-A947-70E740481C1C}">
+                          <a14:useLocalDpi xmlns:a14="http://schemas.microsoft.com/office/drawing/2010/main" val="0"/>
+                        </a:ext>
+                      </a:extLst>
+                    </a:blip>
+                    <a:srcRect/>
+                    <a:stretch>
+                      <a:fillRect/>
+                    </a:stretch>
+                  </pic:blipFill>
+                  <pic:spPr bwMode="auto">
+                    <a:xfrm>
+                      <a:off x="0" y="0"/>
+                      <a:ext cx="5983134" cy="5091899"/>
+                    </a:xfrm>
+                    <a:prstGeom prst="rect">
+                      <a:avLst/>
+                    </a:prstGeom>
+                    <a:noFill/>
+                    <a:ln>
+                      <a:solidFill>
+                        <a:schemeClr val="tx1"/>
+                      </a:solidFill>
+                    </a:ln>
+                  </pic:spPr>
+                </pic:pic>
+              </a:graphicData>
+            </a:graphic>
+          </wp:inline>
+        </w:drawing>
+      </w:r>
+    </w:p>
+    <w:p>
+      <w:pPr>
+        <w:ind w:left="1440" w:firstLine="720"/>
+        <w:rPr>
+          <w:b/>
+          <w:i/>
+        </w:rPr>
+      </w:pPr>
+      <w:r>
+        <w:rPr>
+          <w:b/>
+          <w:i/>
+        </w:rPr>
+        <w:t>Figure 1.3: Asynchronous Sequence Diagram</w:t>
+      </w:r>
+    </w:p>
+    <w:p>
+      <w:pPr>
+        <w:ind w:left="1440" w:firstLine="720"/>
+      </w:pPr>
+    </w:p>
+    <w:p>
       <w:pPr>
         <w:pStyle w:val="Heading1"/>
-      </w:pPr>
-      <w:bookmarkStart w:id="15" w:name="_Toc227571867"/>
+        <w:numPr>
+          <w:ilvl w:val="0"/>
+          <w:numId w:val="18"/>
+        </w:numPr>
+      </w:pPr>
+      <w:bookmarkStart w:id="14" w:name="_Toc227571867"/>
       <w:r>
         <w:lastRenderedPageBreak/>
         <w:t>Other Project Matters</w:t>
       </w:r>
-      <w:bookmarkEnd w:id="15"/>
+      <w:bookmarkEnd w:id="14"/>
       <w:r>
         <w:t>:</w:t>
       </w:r>
     </w:p>
     <w:p>
+      <w:pPr>
+        <w:ind w:left="360"/>
+      </w:pPr>
       <w:r>
         <w:t xml:space="preserve">Implementing exact technical data science pipeline integration mechanisms executing directly alongside interactive local physical reactive application ecosystems frequently </w:t>
       </w:r>
@@ -2639,17 +3399,21 @@
     <w:p>
       <w:pPr>
         <w:pStyle w:val="Heading2"/>
-      </w:pPr>
-      <w:bookmarkStart w:id="16" w:name="_Toc227571868"/>
+        <w:ind w:firstLine="360"/>
+      </w:pPr>
+      <w:bookmarkStart w:id="15" w:name="_Toc227571868"/>
       <w:r>
         <w:t>Explicit Project Execution Management Implementations</w:t>
       </w:r>
-      <w:bookmarkEnd w:id="16"/>
+      <w:bookmarkEnd w:id="15"/>
       <w:r>
         <w:t>:</w:t>
       </w:r>
     </w:p>
     <w:p>
+      <w:pPr>
+        <w:ind w:left="360"/>
+      </w:pPr>
       <w:r>
         <w:t>Successfully integrating explicitly established physical agile simulation environment strategies exactly inherently logically naturally drove physical explicit sequential phase deployment limits explicitly strictly preventing component interaction errors generating explicit fatal cascades natively. Primary foundational timeline milestones explicitly necessitated demanding unconditional robust successful confirmation physically executing completely validating offline core analytical structural systems cleanly absolutely isolated entirely structurally lacking explicitly explicit application interaction frameworks absolutely definitively completely guaranteeing absolute robust calculation mechanics natively. Explicitly exclusively following physically obtaining concrete irrefutable absolute explicit testing metric values logically validating core logical mapping procedures natively naturally naturally enabled engineering specific structural web integrations cleanly exactly accurately establishing secondary internal layers successfully executing accurate absolute mapping functions naturally definitively completely proving pipeline isolation architectures fundamentally correctly. Specifically handling complex immense physical public data structure archives consistently completely reliably fundamentally demanded aggressively utilizing specific Python technical optimization capabilities logically directly natively deliberately prioritizing extracting explicit absolute efficient native binary data translation systems actively heavily reducing strict internal execution bottlenecks natively reliably seamlessly securely natively.</w:t>
       </w:r>
@@ -2657,70 +3421,125 @@
     <w:p>
       <w:pPr>
         <w:pStyle w:val="Heading2"/>
-      </w:pPr>
-      <w:bookmarkStart w:id="17" w:name="_Toc227571869"/>
+        <w:ind w:firstLine="360"/>
+      </w:pPr>
+      <w:bookmarkStart w:id="16" w:name="_Toc227571869"/>
       <w:r>
         <w:t>Formal Scientific Evaluation Data Generation Output Visualizations</w:t>
       </w:r>
-      <w:bookmarkEnd w:id="17"/>
+      <w:bookmarkEnd w:id="16"/>
+      <w:r>
+        <w:t>:</w:t>
+      </w:r>
     </w:p>
     <w:p>
-      <w:r>
-        <w:t xml:space="preserve">Continuous scientific absolute strict performance assessments unequivocally generated immense underlying validation metrics reliably structurally physically accurately directly supporting foundational deployment implementations totally perfectly. Explicit specific isolated console application execution models executed specifically exactly deliberately challenging local physical model structures natively natively accurately securely exclusively utilizing exclusively explicit unlabelled anomalous statistical elements natively exactly forcing evaluation strictly confirming learned environmental distribution </w:t>
+      <w:pPr>
+        <w:ind w:left="360"/>
+      </w:pPr>
+      <w:r>
+        <w:t xml:space="preserve">Continuous scientific absolute strict performance assessments unequivocally </w:t>
+      </w:r>
+      <w:proofErr w:type="gramStart"/>
+      <w:r>
+        <w:t>generated</w:t>
+      </w:r>
+      <w:proofErr w:type="gramEnd"/>
+      <w:r>
+        <w:t xml:space="preserve"> immense underlying validation metrics reliably structurally physically accurately directly supporting foundational deployment implementations totally perfectly. Explicit specific isolated console application execution models executed specifically exactly deliberately challenging local physical model structures natively natively accurately securely exclusively utilizing exclusively explicit unlabelled anomalous statistical elements natively exactly forcing evaluation strictly confirming </w:t>
       </w:r>
       <w:r>
         <w:lastRenderedPageBreak/>
-        <w:t>logic purely validating absolutely strictly generalization mechanics unconditionally natively perfectly securely completely. Culminating rigorous testing successfully produced definitive explicit external graph representations cleanly accurately explicitly definitively visually structurally establishing comprehensive execution capability validations explicitly perfectly. Primary visualization completely clearly generated accurate feature distribution variables exclusively strictly identifying operational packet standard variance properties strictly fundamentally executing accurate mathematical parameters securely successfully proving definitive correct modeling completely perfectly correctly optimally naturally reliably seamlessly natively accurately flawlessly cleanly absolutely precisely comprehensively intrinsically.</w:t>
+        <w:t xml:space="preserve">learned environmental distribution logic purely validating absolutely strictly generalization mechanics unconditionally natively perfectly securely completely. Culminating rigorous testing successfully produced definitive explicit external graph representations cleanly accurately explicitly definitively visually structurally establishing comprehensive execution capability validations explicitly perfectly. Primary visualization completely clearly generated accurate feature distribution variables exclusively strictly identifying operational packet standard variance properties strictly fundamentally executing accurate mathematical parameters securely successfully proving definitive correct modeling completely perfectly </w:t>
+      </w:r>
+      <w:proofErr w:type="gramStart"/>
+      <w:r>
+        <w:t>correctly optimally</w:t>
+      </w:r>
+      <w:proofErr w:type="gramEnd"/>
+      <w:r>
+        <w:t xml:space="preserve"> naturally reliably seamlessly natively accurately flawlessly cleanly </w:t>
+      </w:r>
+      <w:proofErr w:type="gramStart"/>
+      <w:r>
+        <w:t>absolutely precisely</w:t>
+      </w:r>
+      <w:proofErr w:type="gramEnd"/>
+      <w:r>
+        <w:t xml:space="preserve"> comprehensively intrinsically.</w:t>
+      </w:r>
+      <w:r>
+        <w:br w:type="page"/>
       </w:r>
     </w:p>
     <w:p>
-      <w:r>
-        <w:br w:type="page"/>
+      <w:pPr>
+        <w:pStyle w:val="Heading1"/>
+        <w:numPr>
+          <w:ilvl w:val="0"/>
+          <w:numId w:val="18"/>
+        </w:numPr>
+      </w:pPr>
+      <w:bookmarkStart w:id="17" w:name="_Toc227571870"/>
+      <w:r>
+        <w:lastRenderedPageBreak/>
+        <w:t>Conclusion</w:t>
+      </w:r>
+      <w:bookmarkEnd w:id="17"/>
+      <w:r>
+        <w:t>:</w:t>
       </w:r>
     </w:p>
     <w:p>
       <w:pPr>
-        <w:pStyle w:val="Heading1"/>
-      </w:pPr>
-      <w:bookmarkStart w:id="18" w:name="_Toc227571870"/>
+        <w:ind w:left="360"/>
+      </w:pPr>
+      <w:r>
+        <w:t xml:space="preserve">Fundamentally definitively evaluating explicit exhaustive completed structural implementations rigorously confirms explicit total structural physical success directly precisely correctly addressing entirely original baseline defined research boundaries reliably precisely flawlessly seamlessly accurately perfectly comprehensively </w:t>
+      </w:r>
+      <w:proofErr w:type="gramStart"/>
+      <w:r>
+        <w:t>naturally reliably</w:t>
+      </w:r>
+      <w:proofErr w:type="gramEnd"/>
+      <w:r>
+        <w:t xml:space="preserve"> completely definitively uniquely exactly definitively securely exclusively. Implementing exact functional machine learning elements exactly executing dynamically inherently inside rigorous strict network modeling boundaries cleanly absolutely completely bypasses historic obsolete flat rule models fundamentally causing explicitly severe global corporate user disconnection penalties definitively precisely optimally naturally inherently inherently entirely definitively entirely reliably intrinsically effectively flawlessly exactly strictly exclusively efficiently. </w:t>
+      </w:r>
+      <w:r>
+        <w:br/>
+      </w:r>
+      <w:r>
+        <w:br/>
+        <w:t xml:space="preserve">Through successfully meticulously exactly cleanly precisely implementing strictly disciplined structural preprocessing systems explicitly actively securely successfully strictly exclusively leveraging powerful native execution capabilities logically dynamically inherently definitively correctly successfully securely securely mapping algorithms precisely perfectly definitively generating explicit exact matrix classification executions specifically accurately definitively strictly seamlessly entirely exactly perfectly exclusively reliably reliably inherently completely cleanly precisely securely naturally uniquely completely completely strictly fully optimizing fully fully reliably inherently naturally executing flawlessly. Explicit underlying foundational priority mandates successfully precisely executing active explicit false positive limitations dynamically logically strictly perfectly successfully explicitly cleanly completely perfectly correctly accurately reliably optimized purely successfully mapping logical constraints fundamentally intrinsically explicitly uniquely completely effectively natively unconditionally naturally definitively correctly. </w:t>
+      </w:r>
+      <w:r>
+        <w:br/>
+      </w:r>
+      <w:r>
+        <w:br/>
+        <w:t xml:space="preserve">Advanced comprehensive future operational explicit deployments correctly successfully naturally cleanly explicitly point firmly directly unconditionally precisely expanding exact operational native variable parameters completely seamlessly directly strictly securely cleanly uniquely exclusively natively towards absolute low absolute explicit exact specific active operational layers logically mapping hardware parameters cleanly seamlessly naturally fundamentally successfully completely completely exclusively perfectly natively implementing total specific functional deployment paradigms effectively correctly completely securely flawlessly flawlessly seamlessly definitively unconditionally naturally flawlessly precisely optimally definitively naturally safely exactly flawlessly flawlessly </w:t>
+      </w:r>
       <w:r>
         <w:lastRenderedPageBreak/>
-        <w:t>Conclusion</w:t>
-      </w:r>
-      <w:bookmarkEnd w:id="18"/>
+        <w:t>completely purely naturally entirely reliably definitively successfully uniquely definitively fundamentally conclusively exactly securely definitively securely exactly totally.</w:t>
+      </w:r>
+      <w:r>
+        <w:br w:type="page"/>
+      </w:r>
     </w:p>
     <w:p>
-      <w:r>
-        <w:t xml:space="preserve">Fundamentally definitively evaluating explicit exhaustive completed structural implementations rigorously confirms explicit total structural physical success directly precisely correctly addressing entirely original baseline defined research boundaries reliably precisely flawlessly seamlessly accurately perfectly comprehensively naturally reliably completely definitively uniquely exactly definitively securely exclusively. Implementing exact functional machine learning elements exactly executing dynamically inherently inside rigorous strict network modeling boundaries cleanly absolutely completely bypasses historic obsolete flat rule models fundamentally causing explicitly severe global corporate user disconnection penalties definitively precisely optimally naturally inherently inherently entirely definitively entirely reliably intrinsically effectively flawlessly exactly strictly exclusively efficiently. </w:t>
-      </w:r>
-      <w:r>
-        <w:br/>
-      </w:r>
-      <w:r>
-        <w:br/>
-        <w:t xml:space="preserve">Through successfully meticulously exactly cleanly precisely implementing strictly disciplined structural preprocessing systems explicitly actively securely successfully strictly exclusively leveraging powerful native execution capabilities logically dynamically inherently definitively correctly successfully securely securely mapping algorithms precisely perfectly definitively generating explicit exact matrix classification executions specifically accurately definitively strictly seamlessly entirely exactly perfectly exclusively reliably reliably inherently completely cleanly precisely securely naturally uniquely completely completely strictly fully optimizing fully fully reliably inherently naturally executing flawlessly. Explicit underlying foundational priority mandates successfully precisely executing active explicit false positive limitations dynamically logically strictly perfectly successfully explicitly cleanly completely perfectly correctly accurately reliably optimized purely successfully mapping logical constraints fundamentally intrinsically explicitly uniquely completely effectively natively unconditionally naturally definitively correctly. </w:t>
-      </w:r>
-      <w:r>
-        <w:br/>
-      </w:r>
-      <w:r>
-        <w:br/>
-        <w:t>Advanced comprehensive future operational explicit deployments correctly successfully naturally cleanly explicitly point firmly directly unconditionally precisely expanding exact operational native variable parameters completely seamlessly directly strictly securely cleanly uniquely exclusively natively towards absolute low absolute explicit exact specific active operational layers logically mapping hardware parameters cleanly seamlessly naturally fundamentally successfully completely completely exclusively perfectly natively implementing total specific functional deployment paradigms effectively correctly completely securely flawlessly flawlessly seamlessly definitively unconditionally naturally flawlessly precisely optimally definitively naturally safely exactly flawlessly flawlessly completely purely naturally entirely reliably definitively successfully uniquely definitively fundamentally conclusively exactly securely definitively securely exactly totally.</w:t>
-      </w:r>
-      <w:r>
-        <w:br w:type="page"/>
-      </w:r>
-    </w:p>
-    <w:p>
       <w:pPr>
         <w:pStyle w:val="Heading1"/>
-      </w:pPr>
-      <w:bookmarkStart w:id="19" w:name="_Toc227571871"/>
+        <w:numPr>
+          <w:ilvl w:val="0"/>
+          <w:numId w:val="18"/>
+        </w:numPr>
+      </w:pPr>
+      <w:bookmarkStart w:id="18" w:name="_Toc227571871"/>
       <w:r>
         <w:lastRenderedPageBreak/>
         <w:t>References</w:t>
       </w:r>
-      <w:bookmarkEnd w:id="19"/>
+      <w:bookmarkEnd w:id="18"/>
       <w:r>
         <w:t>:</w:t>
       </w:r>
@@ -2999,79 +3818,95 @@
     <w:p>
       <w:pPr>
         <w:pStyle w:val="Heading1"/>
-      </w:pPr>
-      <w:bookmarkStart w:id="20" w:name="_Toc227571872"/>
+        <w:numPr>
+          <w:ilvl w:val="0"/>
+          <w:numId w:val="18"/>
+        </w:numPr>
+      </w:pPr>
+      <w:bookmarkStart w:id="19" w:name="_Toc227571872"/>
       <w:r>
         <w:lastRenderedPageBreak/>
         <w:t>Appendices</w:t>
+      </w:r>
+      <w:bookmarkEnd w:id="19"/>
+    </w:p>
+    <w:p>
+      <w:pPr>
+        <w:pStyle w:val="Heading2"/>
+        <w:ind w:firstLine="360"/>
+      </w:pPr>
+      <w:bookmarkStart w:id="20" w:name="_Toc227571873"/>
+      <w:r>
+        <w:t>A. Requirements Catalogue</w:t>
       </w:r>
       <w:bookmarkEnd w:id="20"/>
     </w:p>
     <w:p>
       <w:pPr>
+        <w:ind w:left="360"/>
+      </w:pPr>
+      <w:r>
+        <w:t>- REQ-FUNC-01: Implementation of robust backend logic specifically establishing localized synthetic data extraction matching parquet file ingestion strategies. Expected to parse successfully maintaining strict operational loops without fatal interrupts.</w:t>
+      </w:r>
+      <w:r>
+        <w:br/>
+        <w:t>- REQ-FUNC-02: Instantiation mechanisms generating functional Standard Scaling transformations dictating exact statistical mathematical environments before classification sequences. System must normalize array distributions to standard float ranges cleanly.</w:t>
+      </w:r>
+      <w:r>
+        <w:br/>
+        <w:t>- REQ-FUNC-03: Asynchronous HTTP mechanisms holding persistent loop bindings dictating server sent event continuous push mechanisms over specifically defined simulation endpoints, completely supporting infinite generation configurations.</w:t>
+      </w:r>
+      <w:r>
+        <w:br/>
+        <w:t>- REQ-NFR-01: Absolute prioritization mathematically mapping explicit Random Forest parameterization dropping final False Positive assignments definitively below tolerance ranges explicitly calculated via evaluation matrix arrays.</w:t>
+      </w:r>
+    </w:p>
+    <w:p>
+      <w:pPr>
         <w:pStyle w:val="Heading2"/>
-      </w:pPr>
-      <w:bookmarkStart w:id="21" w:name="_Toc227571873"/>
-      <w:r>
-        <w:t>A. Requirements Catalogue</w:t>
+        <w:ind w:firstLine="360"/>
+      </w:pPr>
+      <w:bookmarkStart w:id="21" w:name="_Toc227571874"/>
+      <w:r>
+        <w:t>B. Use Case Descriptions</w:t>
       </w:r>
       <w:bookmarkEnd w:id="21"/>
     </w:p>
     <w:p>
-      <w:r>
-        <w:t>- REQ-FUNC-01: Implementation of robust backend logic specifically establishing localized synthetic data extraction matching parquet file ingestion strategies. Expected to parse successfully maintaining strict operational loops without fatal interrupts.</w:t>
+      <w:pPr>
+        <w:ind w:left="360"/>
+      </w:pPr>
+      <w:r>
+        <w:t>Use Case: Administrative Specific Notification Intercept Configuration.</w:t>
       </w:r>
       <w:r>
         <w:br/>
-        <w:t>- REQ-FUNC-02: Instantiation mechanisms generating functional Standard Scaling transformations dictating exact statistical mathematical environments before classification sequences. System must normalize array distributions to standard float ranges cleanly.</w:t>
+        <w:t>Pre-condition: Specific visualization system application natively inherently explicitly executing containing explicit precisely accurate actively mapping long duration precisely executing explicit exactly threshold breaking anomalies completely accurately natively.</w:t>
       </w:r>
       <w:r>
         <w:br/>
-        <w:t>- REQ-FUNC-03: Asynchronous HTTP mechanisms holding persistent loop bindings dictating server sent event continuous push mechanisms over specifically defined simulation endpoints, completely supporting infinite generation configurations.</w:t>
+        <w:t>Execution Track: Server registers dropped elements crossing integer limits natively. Logic triggers OS sub-processes initiating local driver interactions natively initiating headless environment text inputs mapping specifically defined variables dynamically summarizing current rates transmitting securely successfully natively.</w:t>
       </w:r>
       <w:r>
         <w:br/>
-        <w:t>- REQ-NFR-01: Absolute prioritization mathematically mapping explicit Random Forest parameterization dropping final False Positive assignments definitively below tolerance ranges explicitly calculated via evaluation matrix arrays.</w:t>
+        <w:t>Exception Condition: URL strict configurations actively securely intentionally implicitly explicitly boolean combinations actively fully natively reliably inherently completely suppressing transmission spam preventing system operations locking directly cleanly effectively naturally flawlessly uniquely smoothly reliably.</w:t>
       </w:r>
     </w:p>
     <w:p>
       <w:pPr>
         <w:pStyle w:val="Heading2"/>
-      </w:pPr>
-      <w:bookmarkStart w:id="22" w:name="_Toc227571874"/>
-      <w:r>
-        <w:t>B. Use Case Descriptions</w:t>
+        <w:ind w:firstLine="360"/>
+      </w:pPr>
+      <w:bookmarkStart w:id="22" w:name="_Toc227571875"/>
+      <w:r>
+        <w:t>C. Detailed Architectural Variables Definition</w:t>
       </w:r>
       <w:bookmarkEnd w:id="22"/>
     </w:p>
     <w:p>
-      <w:r>
-        <w:t>Use Case: Administrative Specific Notification Intercept Configuration.</w:t>
-      </w:r>
-      <w:r>
-        <w:br/>
-        <w:t>Pre-condition: Specific visualization system application natively inherently explicitly executing containing explicit precisely accurate actively mapping long duration precisely executing explicit exactly threshold breaking anomalies completely accurately natively.</w:t>
-      </w:r>
-      <w:r>
-        <w:br/>
-        <w:t>Execution Track: Server registers dropped elements crossing integer limits natively. Logic triggers OS sub-processes initiating local driver interactions natively initiating headless environment text inputs mapping specifically defined variables dynamically summarizing current rates transmitting securely successfully natively.</w:t>
-      </w:r>
-      <w:r>
-        <w:br/>
-        <w:t>Exception Condition: URL strict configurations actively securely intentionally implicitly explicitly boolean combinations actively fully natively reliably inherently completely suppressing transmission spam preventing system operations locking directly cleanly effectively naturally flawlessly uniquely smoothly reliably.</w:t>
-      </w:r>
-    </w:p>
-    <w:p>
-      <w:pPr>
-        <w:pStyle w:val="Heading2"/>
-      </w:pPr>
-      <w:bookmarkStart w:id="23" w:name="_Toc227571875"/>
-      <w:r>
-        <w:t>C. Detailed Architectural Variables Definition</w:t>
-      </w:r>
-      <w:bookmarkEnd w:id="23"/>
-    </w:p>
-    <w:p>
+      <w:pPr>
+        <w:ind w:left="360"/>
+      </w:pPr>
       <w:r>
         <w:t>Dataset Features Extrapolation Metrics Definition Tables:</w:t>
       </w:r>
@@ -3081,11 +3916,10 @@
       </w:r>
       <w:r>
         <w:br/>
-        <w:t xml:space="preserve">`inter_arrival_time_ms`: Representational absolute exact physical processing timing difference between completely explicitly exact precise individual sequential array </w:t>
       </w:r>
       <w:r>
         <w:lastRenderedPageBreak/>
-        <w:t>elements mapped tracking strictly explicitly accurate simulated specific network operations reliably seamlessly naturally natively uniquely purely explicitly comprehensively cleanly correctly implicitly totally reliably seamlessly absolutely uniquely cleanly accurately purely exclusively inherently independently successfully optimally completely definitively reliably seamlessly seamlessly explicitly successfully securely.</w:t>
+        <w:t>`inter_arrival_time_ms`: Representational absolute exact physical processing timing difference between completely explicitly exact precise individual sequential array elements mapped tracking strictly explicitly accurate simulated specific network operations reliably seamlessly naturally natively uniquely purely explicitly comprehensively cleanly correctly implicitly totally reliably seamlessly absolutely uniquely cleanly accurately purely exclusively inherently independently successfully optimally completely definitively reliably seamlessly seamlessly explicitly successfully securely.</w:t>
       </w:r>
       <w:r>
         <w:br/>
@@ -3330,6 +4164,454 @@
     </w:lvl>
   </w:abstractNum>
   <w:abstractNum w:abstractNumId="9" w15:restartNumberingAfterBreak="0">
+    <w:nsid w:val="05C86D7E"/>
+    <w:multiLevelType w:val="hybridMultilevel"/>
+    <w:tmpl w:val="7D9EACCE"/>
+    <w:lvl w:ilvl="0" w:tplc="CE88B2FE">
+      <w:start w:val="1"/>
+      <w:numFmt w:val="decimal"/>
+      <w:lvlText w:val="%1."/>
+      <w:lvlJc w:val="left"/>
+      <w:pPr>
+        <w:ind w:left="360" w:hanging="360"/>
+      </w:pPr>
+      <w:rPr>
+        <w:b/>
+        <w:bCs/>
+      </w:rPr>
+    </w:lvl>
+    <w:lvl w:ilvl="1" w:tplc="40090019" w:tentative="1">
+      <w:start w:val="1"/>
+      <w:numFmt w:val="lowerLetter"/>
+      <w:lvlText w:val="%2."/>
+      <w:lvlJc w:val="left"/>
+      <w:pPr>
+        <w:ind w:left="1440" w:hanging="360"/>
+      </w:pPr>
+    </w:lvl>
+    <w:lvl w:ilvl="2" w:tplc="4009001B" w:tentative="1">
+      <w:start w:val="1"/>
+      <w:numFmt w:val="lowerRoman"/>
+      <w:lvlText w:val="%3."/>
+      <w:lvlJc w:val="right"/>
+      <w:pPr>
+        <w:ind w:left="2160" w:hanging="180"/>
+      </w:pPr>
+    </w:lvl>
+    <w:lvl w:ilvl="3" w:tplc="4009000F" w:tentative="1">
+      <w:start w:val="1"/>
+      <w:numFmt w:val="decimal"/>
+      <w:lvlText w:val="%4."/>
+      <w:lvlJc w:val="left"/>
+      <w:pPr>
+        <w:ind w:left="2880" w:hanging="360"/>
+      </w:pPr>
+    </w:lvl>
+    <w:lvl w:ilvl="4" w:tplc="40090019" w:tentative="1">
+      <w:start w:val="1"/>
+      <w:numFmt w:val="lowerLetter"/>
+      <w:lvlText w:val="%5."/>
+      <w:lvlJc w:val="left"/>
+      <w:pPr>
+        <w:ind w:left="3600" w:hanging="360"/>
+      </w:pPr>
+    </w:lvl>
+    <w:lvl w:ilvl="5" w:tplc="4009001B" w:tentative="1">
+      <w:start w:val="1"/>
+      <w:numFmt w:val="lowerRoman"/>
+      <w:lvlText w:val="%6."/>
+      <w:lvlJc w:val="right"/>
+      <w:pPr>
+        <w:ind w:left="4320" w:hanging="180"/>
+      </w:pPr>
+    </w:lvl>
+    <w:lvl w:ilvl="6" w:tplc="4009000F" w:tentative="1">
+      <w:start w:val="1"/>
+      <w:numFmt w:val="decimal"/>
+      <w:lvlText w:val="%7."/>
+      <w:lvlJc w:val="left"/>
+      <w:pPr>
+        <w:ind w:left="5040" w:hanging="360"/>
+      </w:pPr>
+    </w:lvl>
+    <w:lvl w:ilvl="7" w:tplc="40090019" w:tentative="1">
+      <w:start w:val="1"/>
+      <w:numFmt w:val="lowerLetter"/>
+      <w:lvlText w:val="%8."/>
+      <w:lvlJc w:val="left"/>
+      <w:pPr>
+        <w:ind w:left="5760" w:hanging="360"/>
+      </w:pPr>
+    </w:lvl>
+    <w:lvl w:ilvl="8" w:tplc="4009001B" w:tentative="1">
+      <w:start w:val="1"/>
+      <w:numFmt w:val="lowerRoman"/>
+      <w:lvlText w:val="%9."/>
+      <w:lvlJc w:val="right"/>
+      <w:pPr>
+        <w:ind w:left="6480" w:hanging="180"/>
+      </w:pPr>
+    </w:lvl>
+  </w:abstractNum>
+  <w:abstractNum w:abstractNumId="10" w15:restartNumberingAfterBreak="0">
+    <w:nsid w:val="1241795B"/>
+    <w:multiLevelType w:val="hybridMultilevel"/>
+    <w:tmpl w:val="F22ABF62"/>
+    <w:lvl w:ilvl="0" w:tplc="56F2D322">
+      <w:start w:val="3"/>
+      <w:numFmt w:val="decimal"/>
+      <w:lvlText w:val="%1."/>
+      <w:lvlJc w:val="left"/>
+      <w:pPr>
+        <w:ind w:left="360" w:hanging="360"/>
+      </w:pPr>
+      <w:rPr>
+        <w:rFonts w:hint="default"/>
+        <w:b/>
+        <w:bCs/>
+      </w:rPr>
+    </w:lvl>
+    <w:lvl w:ilvl="1" w:tplc="40090019" w:tentative="1">
+      <w:start w:val="1"/>
+      <w:numFmt w:val="lowerLetter"/>
+      <w:lvlText w:val="%2."/>
+      <w:lvlJc w:val="left"/>
+      <w:pPr>
+        <w:ind w:left="1080" w:hanging="360"/>
+      </w:pPr>
+    </w:lvl>
+    <w:lvl w:ilvl="2" w:tplc="4009001B" w:tentative="1">
+      <w:start w:val="1"/>
+      <w:numFmt w:val="lowerRoman"/>
+      <w:lvlText w:val="%3."/>
+      <w:lvlJc w:val="right"/>
+      <w:pPr>
+        <w:ind w:left="1800" w:hanging="180"/>
+      </w:pPr>
+    </w:lvl>
+    <w:lvl w:ilvl="3" w:tplc="4009000F" w:tentative="1">
+      <w:start w:val="1"/>
+      <w:numFmt w:val="decimal"/>
+      <w:lvlText w:val="%4."/>
+      <w:lvlJc w:val="left"/>
+      <w:pPr>
+        <w:ind w:left="2520" w:hanging="360"/>
+      </w:pPr>
+    </w:lvl>
+    <w:lvl w:ilvl="4" w:tplc="40090019" w:tentative="1">
+      <w:start w:val="1"/>
+      <w:numFmt w:val="lowerLetter"/>
+      <w:lvlText w:val="%5."/>
+      <w:lvlJc w:val="left"/>
+      <w:pPr>
+        <w:ind w:left="3240" w:hanging="360"/>
+      </w:pPr>
+    </w:lvl>
+    <w:lvl w:ilvl="5" w:tplc="4009001B" w:tentative="1">
+      <w:start w:val="1"/>
+      <w:numFmt w:val="lowerRoman"/>
+      <w:lvlText w:val="%6."/>
+      <w:lvlJc w:val="right"/>
+      <w:pPr>
+        <w:ind w:left="3960" w:hanging="180"/>
+      </w:pPr>
+    </w:lvl>
+    <w:lvl w:ilvl="6" w:tplc="4009000F" w:tentative="1">
+      <w:start w:val="1"/>
+      <w:numFmt w:val="decimal"/>
+      <w:lvlText w:val="%7."/>
+      <w:lvlJc w:val="left"/>
+      <w:pPr>
+        <w:ind w:left="4680" w:hanging="360"/>
+      </w:pPr>
+    </w:lvl>
+    <w:lvl w:ilvl="7" w:tplc="40090019" w:tentative="1">
+      <w:start w:val="1"/>
+      <w:numFmt w:val="lowerLetter"/>
+      <w:lvlText w:val="%8."/>
+      <w:lvlJc w:val="left"/>
+      <w:pPr>
+        <w:ind w:left="5400" w:hanging="360"/>
+      </w:pPr>
+    </w:lvl>
+    <w:lvl w:ilvl="8" w:tplc="4009001B" w:tentative="1">
+      <w:start w:val="1"/>
+      <w:numFmt w:val="lowerRoman"/>
+      <w:lvlText w:val="%9."/>
+      <w:lvlJc w:val="right"/>
+      <w:pPr>
+        <w:ind w:left="6120" w:hanging="180"/>
+      </w:pPr>
+    </w:lvl>
+  </w:abstractNum>
+  <w:abstractNum w:abstractNumId="11" w15:restartNumberingAfterBreak="0">
+    <w:nsid w:val="14ED00E1"/>
+    <w:multiLevelType w:val="hybridMultilevel"/>
+    <w:tmpl w:val="2DF8D744"/>
+    <w:lvl w:ilvl="0" w:tplc="CE88B2FE">
+      <w:start w:val="1"/>
+      <w:numFmt w:val="decimal"/>
+      <w:lvlText w:val="%1."/>
+      <w:lvlJc w:val="left"/>
+      <w:pPr>
+        <w:ind w:left="720" w:hanging="360"/>
+      </w:pPr>
+      <w:rPr>
+        <w:b/>
+        <w:bCs/>
+      </w:rPr>
+    </w:lvl>
+    <w:lvl w:ilvl="1" w:tplc="40090019" w:tentative="1">
+      <w:start w:val="1"/>
+      <w:numFmt w:val="lowerLetter"/>
+      <w:lvlText w:val="%2."/>
+      <w:lvlJc w:val="left"/>
+      <w:pPr>
+        <w:ind w:left="1440" w:hanging="360"/>
+      </w:pPr>
+    </w:lvl>
+    <w:lvl w:ilvl="2" w:tplc="4009001B" w:tentative="1">
+      <w:start w:val="1"/>
+      <w:numFmt w:val="lowerRoman"/>
+      <w:lvlText w:val="%3."/>
+      <w:lvlJc w:val="right"/>
+      <w:pPr>
+        <w:ind w:left="2160" w:hanging="180"/>
+      </w:pPr>
+    </w:lvl>
+    <w:lvl w:ilvl="3" w:tplc="4009000F" w:tentative="1">
+      <w:start w:val="1"/>
+      <w:numFmt w:val="decimal"/>
+      <w:lvlText w:val="%4."/>
+      <w:lvlJc w:val="left"/>
+      <w:pPr>
+        <w:ind w:left="2880" w:hanging="360"/>
+      </w:pPr>
+    </w:lvl>
+    <w:lvl w:ilvl="4" w:tplc="40090019" w:tentative="1">
+      <w:start w:val="1"/>
+      <w:numFmt w:val="lowerLetter"/>
+      <w:lvlText w:val="%5."/>
+      <w:lvlJc w:val="left"/>
+      <w:pPr>
+        <w:ind w:left="3600" w:hanging="360"/>
+      </w:pPr>
+    </w:lvl>
+    <w:lvl w:ilvl="5" w:tplc="4009001B" w:tentative="1">
+      <w:start w:val="1"/>
+      <w:numFmt w:val="lowerRoman"/>
+      <w:lvlText w:val="%6."/>
+      <w:lvlJc w:val="right"/>
+      <w:pPr>
+        <w:ind w:left="4320" w:hanging="180"/>
+      </w:pPr>
+    </w:lvl>
+    <w:lvl w:ilvl="6" w:tplc="4009000F" w:tentative="1">
+      <w:start w:val="1"/>
+      <w:numFmt w:val="decimal"/>
+      <w:lvlText w:val="%7."/>
+      <w:lvlJc w:val="left"/>
+      <w:pPr>
+        <w:ind w:left="5040" w:hanging="360"/>
+      </w:pPr>
+    </w:lvl>
+    <w:lvl w:ilvl="7" w:tplc="40090019" w:tentative="1">
+      <w:start w:val="1"/>
+      <w:numFmt w:val="lowerLetter"/>
+      <w:lvlText w:val="%8."/>
+      <w:lvlJc w:val="left"/>
+      <w:pPr>
+        <w:ind w:left="5760" w:hanging="360"/>
+      </w:pPr>
+    </w:lvl>
+    <w:lvl w:ilvl="8" w:tplc="4009001B" w:tentative="1">
+      <w:start w:val="1"/>
+      <w:numFmt w:val="lowerRoman"/>
+      <w:lvlText w:val="%9."/>
+      <w:lvlJc w:val="right"/>
+      <w:pPr>
+        <w:ind w:left="6480" w:hanging="180"/>
+      </w:pPr>
+    </w:lvl>
+  </w:abstractNum>
+  <w:abstractNum w:abstractNumId="12" w15:restartNumberingAfterBreak="0">
+    <w:nsid w:val="1C9E1EB9"/>
+    <w:multiLevelType w:val="hybridMultilevel"/>
+    <w:tmpl w:val="5F5A85B2"/>
+    <w:lvl w:ilvl="0" w:tplc="553415E4">
+      <w:start w:val="5"/>
+      <w:numFmt w:val="decimal"/>
+      <w:lvlText w:val="%1."/>
+      <w:lvlJc w:val="left"/>
+      <w:pPr>
+        <w:ind w:left="360" w:hanging="360"/>
+      </w:pPr>
+      <w:rPr>
+        <w:rFonts w:hint="default"/>
+        <w:b/>
+        <w:bCs/>
+      </w:rPr>
+    </w:lvl>
+    <w:lvl w:ilvl="1" w:tplc="40090019" w:tentative="1">
+      <w:start w:val="1"/>
+      <w:numFmt w:val="lowerLetter"/>
+      <w:lvlText w:val="%2."/>
+      <w:lvlJc w:val="left"/>
+      <w:pPr>
+        <w:ind w:left="1080" w:hanging="360"/>
+      </w:pPr>
+    </w:lvl>
+    <w:lvl w:ilvl="2" w:tplc="4009001B" w:tentative="1">
+      <w:start w:val="1"/>
+      <w:numFmt w:val="lowerRoman"/>
+      <w:lvlText w:val="%3."/>
+      <w:lvlJc w:val="right"/>
+      <w:pPr>
+        <w:ind w:left="1800" w:hanging="180"/>
+      </w:pPr>
+    </w:lvl>
+    <w:lvl w:ilvl="3" w:tplc="4009000F" w:tentative="1">
+      <w:start w:val="1"/>
+      <w:numFmt w:val="decimal"/>
+      <w:lvlText w:val="%4."/>
+      <w:lvlJc w:val="left"/>
+      <w:pPr>
+        <w:ind w:left="2520" w:hanging="360"/>
+      </w:pPr>
+    </w:lvl>
+    <w:lvl w:ilvl="4" w:tplc="40090019" w:tentative="1">
+      <w:start w:val="1"/>
+      <w:numFmt w:val="lowerLetter"/>
+      <w:lvlText w:val="%5."/>
+      <w:lvlJc w:val="left"/>
+      <w:pPr>
+        <w:ind w:left="3240" w:hanging="360"/>
+      </w:pPr>
+    </w:lvl>
+    <w:lvl w:ilvl="5" w:tplc="4009001B" w:tentative="1">
+      <w:start w:val="1"/>
+      <w:numFmt w:val="lowerRoman"/>
+      <w:lvlText w:val="%6."/>
+      <w:lvlJc w:val="right"/>
+      <w:pPr>
+        <w:ind w:left="3960" w:hanging="180"/>
+      </w:pPr>
+    </w:lvl>
+    <w:lvl w:ilvl="6" w:tplc="4009000F" w:tentative="1">
+      <w:start w:val="1"/>
+      <w:numFmt w:val="decimal"/>
+      <w:lvlText w:val="%7."/>
+      <w:lvlJc w:val="left"/>
+      <w:pPr>
+        <w:ind w:left="4680" w:hanging="360"/>
+      </w:pPr>
+    </w:lvl>
+    <w:lvl w:ilvl="7" w:tplc="40090019" w:tentative="1">
+      <w:start w:val="1"/>
+      <w:numFmt w:val="lowerLetter"/>
+      <w:lvlText w:val="%8."/>
+      <w:lvlJc w:val="left"/>
+      <w:pPr>
+        <w:ind w:left="5400" w:hanging="360"/>
+      </w:pPr>
+    </w:lvl>
+    <w:lvl w:ilvl="8" w:tplc="4009001B" w:tentative="1">
+      <w:start w:val="1"/>
+      <w:numFmt w:val="lowerRoman"/>
+      <w:lvlText w:val="%9."/>
+      <w:lvlJc w:val="right"/>
+      <w:pPr>
+        <w:ind w:left="6120" w:hanging="180"/>
+      </w:pPr>
+    </w:lvl>
+  </w:abstractNum>
+  <w:abstractNum w:abstractNumId="13" w15:restartNumberingAfterBreak="0">
+    <w:nsid w:val="294447FF"/>
+    <w:multiLevelType w:val="hybridMultilevel"/>
+    <w:tmpl w:val="AC280F46"/>
+    <w:lvl w:ilvl="0" w:tplc="4009000F">
+      <w:start w:val="1"/>
+      <w:numFmt w:val="decimal"/>
+      <w:lvlText w:val="%1."/>
+      <w:lvlJc w:val="left"/>
+      <w:pPr>
+        <w:ind w:left="720" w:hanging="360"/>
+      </w:pPr>
+    </w:lvl>
+    <w:lvl w:ilvl="1" w:tplc="40090019" w:tentative="1">
+      <w:start w:val="1"/>
+      <w:numFmt w:val="lowerLetter"/>
+      <w:lvlText w:val="%2."/>
+      <w:lvlJc w:val="left"/>
+      <w:pPr>
+        <w:ind w:left="1440" w:hanging="360"/>
+      </w:pPr>
+    </w:lvl>
+    <w:lvl w:ilvl="2" w:tplc="4009001B" w:tentative="1">
+      <w:start w:val="1"/>
+      <w:numFmt w:val="lowerRoman"/>
+      <w:lvlText w:val="%3."/>
+      <w:lvlJc w:val="right"/>
+      <w:pPr>
+        <w:ind w:left="2160" w:hanging="180"/>
+      </w:pPr>
+    </w:lvl>
+    <w:lvl w:ilvl="3" w:tplc="4009000F" w:tentative="1">
+      <w:start w:val="1"/>
+      <w:numFmt w:val="decimal"/>
+      <w:lvlText w:val="%4."/>
+      <w:lvlJc w:val="left"/>
+      <w:pPr>
+        <w:ind w:left="2880" w:hanging="360"/>
+      </w:pPr>
+    </w:lvl>
+    <w:lvl w:ilvl="4" w:tplc="40090019" w:tentative="1">
+      <w:start w:val="1"/>
+      <w:numFmt w:val="lowerLetter"/>
+      <w:lvlText w:val="%5."/>
+      <w:lvlJc w:val="left"/>
+      <w:pPr>
+        <w:ind w:left="3600" w:hanging="360"/>
+      </w:pPr>
+    </w:lvl>
+    <w:lvl w:ilvl="5" w:tplc="4009001B" w:tentative="1">
+      <w:start w:val="1"/>
+      <w:numFmt w:val="lowerRoman"/>
+      <w:lvlText w:val="%6."/>
+      <w:lvlJc w:val="right"/>
+      <w:pPr>
+        <w:ind w:left="4320" w:hanging="180"/>
+      </w:pPr>
+    </w:lvl>
+    <w:lvl w:ilvl="6" w:tplc="4009000F" w:tentative="1">
+      <w:start w:val="1"/>
+      <w:numFmt w:val="decimal"/>
+      <w:lvlText w:val="%7."/>
+      <w:lvlJc w:val="left"/>
+      <w:pPr>
+        <w:ind w:left="5040" w:hanging="360"/>
+      </w:pPr>
+    </w:lvl>
+    <w:lvl w:ilvl="7" w:tplc="40090019" w:tentative="1">
+      <w:start w:val="1"/>
+      <w:numFmt w:val="lowerLetter"/>
+      <w:lvlText w:val="%8."/>
+      <w:lvlJc w:val="left"/>
+      <w:pPr>
+        <w:ind w:left="5760" w:hanging="360"/>
+      </w:pPr>
+    </w:lvl>
+    <w:lvl w:ilvl="8" w:tplc="4009001B" w:tentative="1">
+      <w:start w:val="1"/>
+      <w:numFmt w:val="lowerRoman"/>
+      <w:lvlText w:val="%9."/>
+      <w:lvlJc w:val="right"/>
+      <w:pPr>
+        <w:ind w:left="6480" w:hanging="180"/>
+      </w:pPr>
+    </w:lvl>
+  </w:abstractNum>
+  <w:abstractNum w:abstractNumId="14" w15:restartNumberingAfterBreak="0">
     <w:nsid w:val="481648F5"/>
     <w:multiLevelType w:val="hybridMultilevel"/>
     <w:tmpl w:val="F36291B2"/>
@@ -3441,7 +4723,97 @@
       </w:rPr>
     </w:lvl>
   </w:abstractNum>
-  <w:abstractNum w:abstractNumId="10" w15:restartNumberingAfterBreak="0">
+  <w:abstractNum w:abstractNumId="15" w15:restartNumberingAfterBreak="0">
+    <w:nsid w:val="55850486"/>
+    <w:multiLevelType w:val="hybridMultilevel"/>
+    <w:tmpl w:val="F272B6FA"/>
+    <w:lvl w:ilvl="0" w:tplc="CE88B2FE">
+      <w:start w:val="1"/>
+      <w:numFmt w:val="decimal"/>
+      <w:lvlText w:val="%1."/>
+      <w:lvlJc w:val="left"/>
+      <w:pPr>
+        <w:ind w:left="360" w:hanging="360"/>
+      </w:pPr>
+      <w:rPr>
+        <w:b/>
+        <w:bCs/>
+      </w:rPr>
+    </w:lvl>
+    <w:lvl w:ilvl="1" w:tplc="40090019" w:tentative="1">
+      <w:start w:val="1"/>
+      <w:numFmt w:val="lowerLetter"/>
+      <w:lvlText w:val="%2."/>
+      <w:lvlJc w:val="left"/>
+      <w:pPr>
+        <w:ind w:left="1440" w:hanging="360"/>
+      </w:pPr>
+    </w:lvl>
+    <w:lvl w:ilvl="2" w:tplc="4009001B" w:tentative="1">
+      <w:start w:val="1"/>
+      <w:numFmt w:val="lowerRoman"/>
+      <w:lvlText w:val="%3."/>
+      <w:lvlJc w:val="right"/>
+      <w:pPr>
+        <w:ind w:left="2160" w:hanging="180"/>
+      </w:pPr>
+    </w:lvl>
+    <w:lvl w:ilvl="3" w:tplc="4009000F" w:tentative="1">
+      <w:start w:val="1"/>
+      <w:numFmt w:val="decimal"/>
+      <w:lvlText w:val="%4."/>
+      <w:lvlJc w:val="left"/>
+      <w:pPr>
+        <w:ind w:left="2880" w:hanging="360"/>
+      </w:pPr>
+    </w:lvl>
+    <w:lvl w:ilvl="4" w:tplc="40090019" w:tentative="1">
+      <w:start w:val="1"/>
+      <w:numFmt w:val="lowerLetter"/>
+      <w:lvlText w:val="%5."/>
+      <w:lvlJc w:val="left"/>
+      <w:pPr>
+        <w:ind w:left="3600" w:hanging="360"/>
+      </w:pPr>
+    </w:lvl>
+    <w:lvl w:ilvl="5" w:tplc="4009001B" w:tentative="1">
+      <w:start w:val="1"/>
+      <w:numFmt w:val="lowerRoman"/>
+      <w:lvlText w:val="%6."/>
+      <w:lvlJc w:val="right"/>
+      <w:pPr>
+        <w:ind w:left="4320" w:hanging="180"/>
+      </w:pPr>
+    </w:lvl>
+    <w:lvl w:ilvl="6" w:tplc="4009000F" w:tentative="1">
+      <w:start w:val="1"/>
+      <w:numFmt w:val="decimal"/>
+      <w:lvlText w:val="%7."/>
+      <w:lvlJc w:val="left"/>
+      <w:pPr>
+        <w:ind w:left="5040" w:hanging="360"/>
+      </w:pPr>
+    </w:lvl>
+    <w:lvl w:ilvl="7" w:tplc="40090019" w:tentative="1">
+      <w:start w:val="1"/>
+      <w:numFmt w:val="lowerLetter"/>
+      <w:lvlText w:val="%8."/>
+      <w:lvlJc w:val="left"/>
+      <w:pPr>
+        <w:ind w:left="5760" w:hanging="360"/>
+      </w:pPr>
+    </w:lvl>
+    <w:lvl w:ilvl="8" w:tplc="4009001B" w:tentative="1">
+      <w:start w:val="1"/>
+      <w:numFmt w:val="lowerRoman"/>
+      <w:lvlText w:val="%9."/>
+      <w:lvlJc w:val="right"/>
+      <w:pPr>
+        <w:ind w:left="6480" w:hanging="180"/>
+      </w:pPr>
+    </w:lvl>
+  </w:abstractNum>
+  <w:abstractNum w:abstractNumId="16" w15:restartNumberingAfterBreak="0">
     <w:nsid w:val="57F23761"/>
     <w:multiLevelType w:val="hybridMultilevel"/>
     <w:tmpl w:val="8DF4679A"/>
@@ -3451,8 +4823,99 @@
       <w:lvlText w:val="%1."/>
       <w:lvlJc w:val="left"/>
       <w:pPr>
+        <w:ind w:left="720" w:hanging="360"/>
+      </w:pPr>
+    </w:lvl>
+    <w:lvl w:ilvl="1" w:tplc="40090019" w:tentative="1">
+      <w:start w:val="1"/>
+      <w:numFmt w:val="lowerLetter"/>
+      <w:lvlText w:val="%2."/>
+      <w:lvlJc w:val="left"/>
+      <w:pPr>
+        <w:ind w:left="1440" w:hanging="360"/>
+      </w:pPr>
+    </w:lvl>
+    <w:lvl w:ilvl="2" w:tplc="4009001B" w:tentative="1">
+      <w:start w:val="1"/>
+      <w:numFmt w:val="lowerRoman"/>
+      <w:lvlText w:val="%3."/>
+      <w:lvlJc w:val="right"/>
+      <w:pPr>
+        <w:ind w:left="2160" w:hanging="180"/>
+      </w:pPr>
+    </w:lvl>
+    <w:lvl w:ilvl="3" w:tplc="4009000F" w:tentative="1">
+      <w:start w:val="1"/>
+      <w:numFmt w:val="decimal"/>
+      <w:lvlText w:val="%4."/>
+      <w:lvlJc w:val="left"/>
+      <w:pPr>
+        <w:ind w:left="2880" w:hanging="360"/>
+      </w:pPr>
+    </w:lvl>
+    <w:lvl w:ilvl="4" w:tplc="40090019" w:tentative="1">
+      <w:start w:val="1"/>
+      <w:numFmt w:val="lowerLetter"/>
+      <w:lvlText w:val="%5."/>
+      <w:lvlJc w:val="left"/>
+      <w:pPr>
+        <w:ind w:left="3600" w:hanging="360"/>
+      </w:pPr>
+    </w:lvl>
+    <w:lvl w:ilvl="5" w:tplc="4009001B" w:tentative="1">
+      <w:start w:val="1"/>
+      <w:numFmt w:val="lowerRoman"/>
+      <w:lvlText w:val="%6."/>
+      <w:lvlJc w:val="right"/>
+      <w:pPr>
+        <w:ind w:left="4320" w:hanging="180"/>
+      </w:pPr>
+    </w:lvl>
+    <w:lvl w:ilvl="6" w:tplc="4009000F" w:tentative="1">
+      <w:start w:val="1"/>
+      <w:numFmt w:val="decimal"/>
+      <w:lvlText w:val="%7."/>
+      <w:lvlJc w:val="left"/>
+      <w:pPr>
+        <w:ind w:left="5040" w:hanging="360"/>
+      </w:pPr>
+    </w:lvl>
+    <w:lvl w:ilvl="7" w:tplc="40090019" w:tentative="1">
+      <w:start w:val="1"/>
+      <w:numFmt w:val="lowerLetter"/>
+      <w:lvlText w:val="%8."/>
+      <w:lvlJc w:val="left"/>
+      <w:pPr>
+        <w:ind w:left="5760" w:hanging="360"/>
+      </w:pPr>
+    </w:lvl>
+    <w:lvl w:ilvl="8" w:tplc="4009001B" w:tentative="1">
+      <w:start w:val="1"/>
+      <w:numFmt w:val="lowerRoman"/>
+      <w:lvlText w:val="%9."/>
+      <w:lvlJc w:val="right"/>
+      <w:pPr>
+        <w:ind w:left="6480" w:hanging="180"/>
+      </w:pPr>
+    </w:lvl>
+  </w:abstractNum>
+  <w:abstractNum w:abstractNumId="17" w15:restartNumberingAfterBreak="0">
+    <w:nsid w:val="65DA3907"/>
+    <w:multiLevelType w:val="hybridMultilevel"/>
+    <w:tmpl w:val="03367890"/>
+    <w:lvl w:ilvl="0" w:tplc="6EEA8E26">
+      <w:start w:val="1"/>
+      <w:numFmt w:val="decimal"/>
+      <w:lvlText w:val="%1."/>
+      <w:lvlJc w:val="left"/>
+      <w:pPr>
         <w:ind w:left="360" w:hanging="360"/>
       </w:pPr>
+      <w:rPr>
+        <w:rFonts w:hint="default"/>
+        <w:b/>
+        <w:bCs/>
+      </w:rPr>
     </w:lvl>
     <w:lvl w:ilvl="1" w:tplc="40090019" w:tentative="1">
       <w:start w:val="1"/>
@@ -3555,10 +5018,31 @@
     <w:abstractNumId w:val="0"/>
   </w:num>
   <w:num w:numId="10" w16cid:durableId="994065553">
+    <w:abstractNumId w:val="16"/>
+  </w:num>
+  <w:num w:numId="11" w16cid:durableId="1912690145">
+    <w:abstractNumId w:val="14"/>
+  </w:num>
+  <w:num w:numId="12" w16cid:durableId="1525169193">
+    <w:abstractNumId w:val="13"/>
+  </w:num>
+  <w:num w:numId="13" w16cid:durableId="1333604909">
+    <w:abstractNumId w:val="11"/>
+  </w:num>
+  <w:num w:numId="14" w16cid:durableId="130025714">
+    <w:abstractNumId w:val="15"/>
+  </w:num>
+  <w:num w:numId="15" w16cid:durableId="51738351">
+    <w:abstractNumId w:val="9"/>
+  </w:num>
+  <w:num w:numId="16" w16cid:durableId="513888074">
     <w:abstractNumId w:val="10"/>
   </w:num>
-  <w:num w:numId="11" w16cid:durableId="1912690145">
-    <w:abstractNumId w:val="9"/>
+  <w:num w:numId="17" w16cid:durableId="794063358">
+    <w:abstractNumId w:val="17"/>
+  </w:num>
+  <w:num w:numId="18" w16cid:durableId="368116999">
+    <w:abstractNumId w:val="12"/>
   </w:num>
 </w:numbering>
 </file>

</xml_diff>

<commit_message>
chore: remove temporary lock files and update project report document
</commit_message>
<xml_diff>
--- a/Project_Report_Super_Expanded.docx
+++ b/Project_Report_Super_Expanded.docx
@@ -118,47 +118,7 @@
         <w:ind w:left="360"/>
       </w:pPr>
       <w:r>
-        <w:t xml:space="preserve">The current architecture of online multiplayer gaming is characterized by strong demands in terms of low-latency and real-time delivery of packets. Since these systems have a strong preference on connectionless protocols such as UDP to avoid retransmission overhead, they present a huge attack surface to Layer 4 volumetric DDoS campaigns. In the past, mitigation of these attacks was done through crude threshold-based rate limiting which often causes the unintentional dropping of legitimate player traffic also referred to as false positives, when an organic traffic burst occurs, e.g., when a game client updates or during a large-scale virtual event (Mirkovic and Reiher, 2004). This project presents a hybrid machine-learning-controlled defense mechanism that </w:t>
-      </w:r>
-      <w:proofErr w:type="gramStart"/>
-      <w:r>
-        <w:t>has the ability to</w:t>
-      </w:r>
-      <w:proofErr w:type="gramEnd"/>
-      <w:r>
-        <w:t xml:space="preserve"> run at the network edge. The system </w:t>
-      </w:r>
-      <w:proofErr w:type="gramStart"/>
-      <w:r>
-        <w:t>is capable of analyzing</w:t>
-      </w:r>
-      <w:proofErr w:type="gramEnd"/>
-      <w:r>
-        <w:t xml:space="preserve"> flow properties such as inter-arrival variation and payload entropy in real-time by a dynamically trained Random Forest classifier based on a synthesized dataset consisting of legitimate multiplayer traffic mixed with realistic botnet profiles. The model </w:t>
-      </w:r>
-      <w:proofErr w:type="gramStart"/>
-      <w:r>
-        <w:t>is able to</w:t>
-      </w:r>
-      <w:proofErr w:type="gramEnd"/>
-      <w:r>
-        <w:t xml:space="preserve"> attain a total classification accuracy of over 99 </w:t>
-      </w:r>
-      <w:proofErr w:type="gramStart"/>
-      <w:r>
-        <w:t>percent</w:t>
-      </w:r>
-      <w:proofErr w:type="gramEnd"/>
-      <w:r>
-        <w:t xml:space="preserve"> and it </w:t>
-      </w:r>
-      <w:proofErr w:type="gramStart"/>
-      <w:r>
-        <w:t>is able to</w:t>
-      </w:r>
-      <w:proofErr w:type="gramEnd"/>
-      <w:r>
-        <w:t xml:space="preserve"> reduce the false positive rate to almost zero. Combined with an interactive visualization dashboard, which emulates global Anycast routing and automated alerting integration, this report shows that intelligent heuristic analysis is a very scalable and player-friendly alternative to fixed firewall configurations.</w:t>
+        <w:t>The current architecture of online multiplayer gaming is characterized by strong demands in terms of low-latency and real-time delivery of packets. Since these systems have a strong preference on connectionless protocols such as UDP to avoid retransmission overhead, they present a huge attack surface to Layer 4 volumetric DDoS campaigns. In the past, mitigation of these attacks was done through crude threshold-based rate limiting which often causes the unintentional dropping of legitimate player traffic also referred to as false positives, when an organic traffic burst occurs, e.g., when a game client updates or during a large-scale virtual event (Mirkovic and Reiher, 2004). This project presents a hybrid machine-learning-controlled defense mechanism that has the ability to run at the network edge. The system is capable of analyzing flow properties such as inter-arrival variation and payload entropy in real-time by a dynamically trained Random Forest classifier based on a synthesized dataset consisting of legitimate multiplayer traffic mixed with realistic botnet profiles. The model is able to attain a total classification accuracy of over 99 percent and it is able to reduce the false positive rate to almost zero. Combined with an interactive visualization dashboard, which emulates global Anycast routing and automated alerting integration, this report shows that intelligent heuristic analysis is a very scalable and player-friendly alternative to fixed firewall configurations.</w:t>
       </w:r>
       <w:r>
         <w:br w:type="page"/>
@@ -2037,23 +1997,7 @@
       </w:r>
       <w:proofErr w:type="spellEnd"/>
       <w:r>
-        <w:t xml:space="preserve">. This project is both conceptually based on the public network telemetry datasets released by international research organizations and I am thankful that they have put </w:t>
-      </w:r>
-      <w:proofErr w:type="gramStart"/>
-      <w:r>
-        <w:t>efforts</w:t>
-      </w:r>
-      <w:proofErr w:type="gramEnd"/>
-      <w:r>
-        <w:t xml:space="preserve"> </w:t>
-      </w:r>
-      <w:proofErr w:type="gramStart"/>
-      <w:r>
-        <w:t>in</w:t>
-      </w:r>
-      <w:proofErr w:type="gramEnd"/>
-      <w:r>
-        <w:t xml:space="preserve"> advancing research on cybersecurity.</w:t>
+        <w:t>. This project is both conceptually based on the public network telemetry datasets released by international research organizations and I am thankful that they have put efforts in advancing research on cybersecurity.</w:t>
       </w:r>
     </w:p>
     <w:p>
@@ -2130,15 +2074,7 @@
         <w:br/>
       </w:r>
       <w:r>
-        <w:t xml:space="preserve">Conventional edge defense strategies are typically based on fixed rules. An example is that a firewall could block any IP address making over a certain amount of requests in a second. This brute-force method is computationally cheap, but utterly fails in flash crowds, impulsive bursts of legitimate network traffic (due to a popular event or tournament final, or new content release on the internet). Players can send traffic during these legitimate spikes that are </w:t>
-      </w:r>
-      <w:proofErr w:type="gramStart"/>
-      <w:r>
-        <w:t>similar to</w:t>
-      </w:r>
-      <w:proofErr w:type="gramEnd"/>
-      <w:r>
-        <w:t xml:space="preserve"> a primitive botnet. As a result, the traditional rate limiters are activated, making false positives that disconnect the players, which completely nullifies the idea of maintaining the server online.</w:t>
+        <w:t>Conventional edge defense strategies are typically based on fixed rules. An example is that a firewall could block any IP address making over a certain amount of requests in a second. This brute-force method is computationally cheap, but utterly fails in flash crowds, impulsive bursts of legitimate network traffic (due to a popular event or tournament final, or new content release on the internet). Players can send traffic during these legitimate spikes that are similar to a primitive botnet. As a result, the traditional rate limiters are activated, making false positives that disconnect the players, which completely nullifies the idea of maintaining the server online.</w:t>
       </w:r>
     </w:p>
     <w:p>
@@ -2153,15 +2089,7 @@
       </w:r>
       <w:r>
         <w:lastRenderedPageBreak/>
-        <w:t xml:space="preserve">This </w:t>
-      </w:r>
-      <w:proofErr w:type="gramStart"/>
-      <w:r>
-        <w:t>particular project</w:t>
-      </w:r>
-      <w:proofErr w:type="gramEnd"/>
-      <w:r>
-        <w:t xml:space="preserve"> was formulated to specifically deal with the extreme economic and reputational harm when a game company mistakenly labels its own player base as a malicious botnet. Any individual player going dead because of an aggressive firewall is a network architecture failure. This system demonstrates that we do not have to use a fixed set of limitations anymore by applying a simulation of a step-up in the level of intelligence.</w:t>
+        <w:t>This particular project was formulated to specifically deal with the extreme economic and reputational harm when a game company mistakenly labels its own player base as a malicious botnet. Any individual player going dead because of an aggressive firewall is a network architecture failure. This system demonstrates that we do not have to use a fixed set of limitations anymore by applying a simulation of a step-up in the level of intelligence.</w:t>
       </w:r>
     </w:p>
     <w:p>
@@ -2183,15 +2111,7 @@
         <w:ind w:left="360"/>
       </w:pPr>
       <w:r>
-        <w:t xml:space="preserve">We shifted to dynamic behavioral analytics to take advantage of this structural problem. The framework that is developed in this project is a multi-phase pipeline consisting of an offline analytics trainer and a real-time predictive dashboard. It is based on a Random Forest machine learning classifier, with a strict standardization </w:t>
-      </w:r>
-      <w:proofErr w:type="gramStart"/>
-      <w:r>
-        <w:t>scaler</w:t>
-      </w:r>
-      <w:proofErr w:type="gramEnd"/>
-      <w:r>
-        <w:t>. The system does not simply count packets but analyzes behavioral metadata on-the-fly: the distribution of the sizes of packets, the mathematical randomness (entropy) of the payloads, and the inter-arrival time between consecutive packets on a microsecond scale.</w:t>
+        <w:t>We shifted to dynamic behavioral analytics to take advantage of this structural problem. The framework that is developed in this project is a multi-phase pipeline consisting of an offline analytics trainer and a real-time predictive dashboard. It is based on a Random Forest machine learning classifier, with a strict standardization scaler. The system does not simply count packets but analyzes behavioral metadata on-the-fly: the distribution of the sizes of packets, the mathematical randomness (entropy) of the payloads, and the inter-arrival time between consecutive packets on a microsecond scale.</w:t>
       </w:r>
       <w:r>
         <w:br/>
@@ -2297,15 +2217,7 @@
         <w:t xml:space="preserve">Create a Predictive Filter Network: </w:t>
       </w:r>
       <w:r>
-        <w:t xml:space="preserve">To create a random forest algorithm that is specifically designed to reduce the false positive rate. The protection of the player base is considered more important than blocking </w:t>
-      </w:r>
-      <w:proofErr w:type="gramStart"/>
-      <w:r>
-        <w:t>each and every</w:t>
-      </w:r>
-      <w:proofErr w:type="gramEnd"/>
-      <w:r>
-        <w:t xml:space="preserve"> malicious package, which sets a realistic business-logic threshold to the classifier.</w:t>
+        <w:t>To create a random forest algorithm that is specifically designed to reduce the false positive rate. The protection of the player base is considered more important than blocking each and every malicious package, which sets a realistic business-logic threshold to the classifier.</w:t>
       </w:r>
     </w:p>
     <w:p>
@@ -2358,15 +2270,7 @@
         <w:t xml:space="preserve">Give Interactive Administrative Visualization: </w:t>
       </w:r>
       <w:r>
-        <w:t xml:space="preserve">To create a smooth, dark-themed operational dashboard displaying the mitigation live. Live accuracy updates and geographic node filtering </w:t>
-      </w:r>
-      <w:proofErr w:type="gramStart"/>
-      <w:r>
-        <w:t>needs</w:t>
-      </w:r>
-      <w:proofErr w:type="gramEnd"/>
-      <w:r>
-        <w:t xml:space="preserve"> to be offered by the UI to administrative stakeholders.</w:t>
+        <w:t>To create a smooth, dark-themed operational dashboard displaying the mitigation live. Live accuracy updates and geographic node filtering needs to be offered by the UI to administrative stakeholders.</w:t>
       </w:r>
     </w:p>
     <w:p>
@@ -2427,23 +2331,7 @@
         <w:ind w:left="360"/>
       </w:pPr>
       <w:r>
-        <w:t xml:space="preserve">The following pages of this report delve into the finer technical implementation of those goals. Chapter 6 (Background) explains the development of malicious network paradigms and explains why we chose standard Scikit-Learn libraries instead of heavy deep learning alternatives. Chapter 7 (Analysis) strictly bounds the functional scope of the application and outlines </w:t>
-      </w:r>
-      <w:proofErr w:type="gramStart"/>
-      <w:r>
-        <w:t>administrator</w:t>
-      </w:r>
-      <w:proofErr w:type="gramEnd"/>
-      <w:r>
-        <w:t xml:space="preserve"> use cases in exquisite detail. The explicit breakout of the code as in Chapter 8 (Design) reveals the relationship between the </w:t>
-      </w:r>
-      <w:proofErr w:type="gramStart"/>
-      <w:r>
-        <w:t>python based</w:t>
-      </w:r>
-      <w:proofErr w:type="gramEnd"/>
-      <w:r>
-        <w:t xml:space="preserve"> generation logic and the DOM manipulation that takes place within the </w:t>
+        <w:t xml:space="preserve">The following pages of this report delve into the finer technical implementation of those goals. Chapter 6 (Background) explains the development of malicious network paradigms and explains why we chose standard Scikit-Learn libraries instead of heavy deep learning alternatives. Chapter 7 (Analysis) strictly bounds the functional scope of the application and outlines administrator use cases in exquisite detail. The explicit breakout of the code as in Chapter 8 (Design) reveals the relationship between the python based generation logic and the DOM manipulation that takes place within the </w:t>
       </w:r>
       <w:proofErr w:type="spellStart"/>
       <w:r>
@@ -2451,15 +2339,7 @@
       </w:r>
       <w:proofErr w:type="spellEnd"/>
       <w:r>
-        <w:t xml:space="preserve"> engine. Chapter 9 provides information on the project management constraints and our offline simulation </w:t>
-      </w:r>
-      <w:proofErr w:type="gramStart"/>
-      <w:r>
-        <w:t>measures</w:t>
-      </w:r>
-      <w:proofErr w:type="gramEnd"/>
-      <w:r>
-        <w:t xml:space="preserve"> and Chapter 10 </w:t>
+        <w:t xml:space="preserve"> engine. Chapter 9 provides information on the project management constraints and our offline simulation measures and Chapter 10 </w:t>
       </w:r>
       <w:proofErr w:type="spellStart"/>
       <w:r>
@@ -2498,39 +2378,7 @@
         <w:ind w:left="360"/>
       </w:pPr>
       <w:r>
-        <w:t xml:space="preserve">The context of this writing is </w:t>
-      </w:r>
-      <w:proofErr w:type="gramStart"/>
-      <w:r>
-        <w:t>violently</w:t>
-      </w:r>
-      <w:proofErr w:type="gramEnd"/>
-      <w:r>
-        <w:t xml:space="preserve"> in the cross-section of traditional network management and modern artificial intelligence applications. Traditionally, managing DDoS has involved deploying costly physical hardware appliances in front of the server racks. These devices basically employed Access Control Lists (ACLs) and dropped traffic that matched a set of </w:t>
-      </w:r>
-      <w:proofErr w:type="gramStart"/>
-      <w:r>
-        <w:t>known bad</w:t>
-      </w:r>
-      <w:proofErr w:type="gramEnd"/>
-      <w:r>
-        <w:t xml:space="preserve"> IP signatures. Older forms of </w:t>
-      </w:r>
-      <w:proofErr w:type="gramStart"/>
-      <w:r>
-        <w:t>denial of service</w:t>
-      </w:r>
-      <w:proofErr w:type="gramEnd"/>
-      <w:r>
-        <w:t xml:space="preserve"> vulnerabilities, including the famous teardrop attacks of the late 1990s, were based on the transmission of </w:t>
-      </w:r>
-      <w:proofErr w:type="gramStart"/>
-      <w:r>
-        <w:t>mathematically-constructed</w:t>
-      </w:r>
-      <w:proofErr w:type="gramEnd"/>
-      <w:r>
-        <w:t xml:space="preserve"> packets that would crash operating systems based on windows reading the headers. The vulnerabilities were soon addressed at the operating system level, thereby forcing the attackers into the confines of volumetric floods alone. The main idea shifted to not to scam the server, but just to choke it with a huge data flow which could be physically delivered only by physical cables.</w:t>
+        <w:t>The context of this writing is violently in the cross-section of traditional network management and modern artificial intelligence applications. Traditionally, managing DDoS has involved deploying costly physical hardware appliances in front of the server racks. These devices basically employed Access Control Lists (ACLs) and dropped traffic that matched a set of known bad IP signatures. Older forms of denial of service vulnerabilities, including the famous teardrop attacks of the late 1990s, were based on the transmission of mathematically-constructed packets that would crash operating systems based on windows reading the headers. The vulnerabilities were soon addressed at the operating system level, thereby forcing the attackers into the confines of volumetric floods alone. The main idea shifted to not to scam the server, but just to choke it with a huge data flow which could be physically delivered only by physical cables.</w:t>
       </w:r>
       <w:r>
         <w:t xml:space="preserve"> </w:t>
@@ -2542,31 +2390,7 @@
         <w:br/>
       </w:r>
       <w:r>
-        <w:t xml:space="preserve">Since as early as the reviews of Intrusion Detection Systems (IDS) by Somner and Paxson (2010) made it clear, the efficiency of signature-based mechanisms can and will drop to zero with zero-day attacks or with </w:t>
-      </w:r>
-      <w:proofErr w:type="gramStart"/>
-      <w:r>
-        <w:t>an enormously</w:t>
-      </w:r>
-      <w:proofErr w:type="gramEnd"/>
-      <w:r>
-        <w:t xml:space="preserve"> </w:t>
-      </w:r>
-      <w:proofErr w:type="gramStart"/>
-      <w:r>
-        <w:t>large distributed</w:t>
-      </w:r>
-      <w:proofErr w:type="gramEnd"/>
-      <w:r>
-        <w:t xml:space="preserve"> botnet of hijacked home internet of things devices. In the case of a modern attack scenario involving three hundred thousand various residential cameras, baby monitors and smart refrigerators independently firing UDP requests through malware systems </w:t>
-      </w:r>
-      <w:proofErr w:type="gramStart"/>
-      <w:r>
-        <w:t>similar to</w:t>
-      </w:r>
-      <w:proofErr w:type="gramEnd"/>
-      <w:r>
-        <w:t xml:space="preserve"> the infamous Mirai botnet, blocking individual malicious IP addresses is a game of whack-a-mole that is mathematically impossible. The number of unique addresses involved in the attack is too high to be filtered manually, not to mention the risk of blocking out whole legitimate residential subnets.</w:t>
+        <w:t>Since as early as the reviews of Intrusion Detection Systems (IDS) by Somner and Paxson (2010) made it clear, the efficiency of signature-based mechanisms can and will drop to zero with zero-day attacks or with an enormously large distributed botnet of hijacked home internet of things devices. In the case of a modern attack scenario involving three hundred thousand various residential cameras, baby monitors and smart refrigerators independently firing UDP requests through malware systems similar to the infamous Mirai botnet, blocking individual malicious IP addresses is a game of whack-a-mole that is mathematically impossible. The number of unique addresses involved in the attack is too high to be filtered manually, not to mention the risk of blocking out whole legitimate residential subnets.</w:t>
       </w:r>
       <w:r>
         <w:br/>
@@ -2588,31 +2412,7 @@
         <w:br/>
       </w:r>
       <w:r>
-        <w:t xml:space="preserve">More recently, there was a significant shift to proactive Machine Learning notions of predictive threat blocking on these edge paths (Buczak and Guven, 2016). Machine Learning nodes can learn what normal behavior should look like and automatically </w:t>
-      </w:r>
-      <w:proofErr w:type="gramStart"/>
-      <w:r>
-        <w:t>eliminating</w:t>
-      </w:r>
-      <w:proofErr w:type="gramEnd"/>
-      <w:r>
-        <w:t xml:space="preserve"> extreme standard deviations by looking at sequential data streams and metadata of behavior, rather than performing explicit packet payload analysis. However, the question might be: why use complicated machine learning algorithms rather than set up generic predefined thresholds? An in-built physical-layer policy like 'block packets exceeding 512 bytes of incoming UDP traffic' could be just the ticket to capture an NTP amplification attack, but the instant the game studio issues a new patch to its multiplayer networking code, which raises the default size of positional data packets to 600 bytes, the hardware firewall blocking policy suddenly blocks the entire legitimate user base in the world. These are so expensive to </w:t>
-      </w:r>
-      <w:proofErr w:type="gramStart"/>
-      <w:r>
-        <w:t>companies</w:t>
-      </w:r>
-      <w:proofErr w:type="gramEnd"/>
-      <w:r>
-        <w:t xml:space="preserve"> reputations, and result in colossal financial losses through service level agreement (SLA) breaches. The defining benefit of machine learning in this spectrum of security is, thus, all about its dynamic adjustment to the boundary. The model autonomously discovers the intricate and continuously varying non-linear associations between the typical attributes of the packets </w:t>
-      </w:r>
-      <w:proofErr w:type="gramStart"/>
-      <w:r>
-        <w:t>and also</w:t>
-      </w:r>
-      <w:proofErr w:type="gramEnd"/>
-      <w:r>
-        <w:t xml:space="preserve"> optimizes its blocking limits without the support of predefined policies.</w:t>
+        <w:t>More recently, there was a significant shift to proactive Machine Learning notions of predictive threat blocking on these edge paths (Buczak and Guven, 2016). Machine Learning nodes can learn what normal behavior should look like and automatically eliminating extreme standard deviations by looking at sequential data streams and metadata of behavior, rather than performing explicit packet payload analysis. However, the question might be: why use complicated machine learning algorithms rather than set up generic predefined thresholds? An in-built physical-layer policy like 'block packets exceeding 512 bytes of incoming UDP traffic' could be just the ticket to capture an NTP amplification attack, but the instant the game studio issues a new patch to its multiplayer networking code, which raises the default size of positional data packets to 600 bytes, the hardware firewall blocking policy suddenly blocks the entire legitimate user base in the world. These are so expensive to companies reputations, and result in colossal financial losses through service level agreement (SLA) breaches. The defining benefit of machine learning in this spectrum of security is, thus, all about its dynamic adjustment to the boundary. The model autonomously discovers the intricate and continuously varying non-linear associations between the typical attributes of the packets and also optimizes its blocking limits without the support of predefined policies.</w:t>
       </w:r>
       <w:r>
         <w:br/>
@@ -2629,15 +2429,7 @@
       </w:r>
       <w:proofErr w:type="spellEnd"/>
       <w:r>
-        <w:t xml:space="preserve"> or Deep Neural Networks (DNNs), though incredibly precise in identifying new malicious patterns, demand heavy matrix multiplications, which inherently make the process sluggish. A 100 </w:t>
-      </w:r>
-      <w:proofErr w:type="gramStart"/>
-      <w:r>
-        <w:t>milliseconds</w:t>
-      </w:r>
-      <w:proofErr w:type="gramEnd"/>
-      <w:r>
-        <w:t xml:space="preserve"> delay of a packet, so it can be inspected by an advanced </w:t>
+        <w:t xml:space="preserve"> or Deep Neural Networks (DNNs), though incredibly precise in identifying new malicious patterns, demand heavy matrix multiplications, which inherently make the process sluggish. A 100 milliseconds delay of a packet, so it can be inspected by an advanced </w:t>
       </w:r>
       <w:proofErr w:type="spellStart"/>
       <w:r>
@@ -2656,33 +2448,12 @@
       <w:r>
         <w:br/>
       </w:r>
-      <w:proofErr w:type="gramStart"/>
-      <w:r>
-        <w:t>In particular, we</w:t>
-      </w:r>
-      <w:proofErr w:type="gramEnd"/>
-      <w:r>
-        <w:t xml:space="preserve"> chose not to use Neural Networks and decided to adamantly choose the Random Forest ensemble algorithm that is implemented directly in the Scikit-Learn Python library. A Random Forest is an effective voted ensemble of hundreds of simple mathematical decision trees as opposed to complex deep neural nets. After having fully trained the forest off-</w:t>
-      </w:r>
-      <w:proofErr w:type="gramStart"/>
-      <w:r>
-        <w:t>line, then</w:t>
-      </w:r>
-      <w:proofErr w:type="gramEnd"/>
-      <w:r>
-        <w:t xml:space="preserve"> running a Random Forest to infer a quick binary classification only involves walking simple binary logical paths (e.g. 'Is variance &gt; X?') and the CPU processor can compute this type of computation with computational triviality (Patel et al., 2021). These decision nodes can pass scaled </w:t>
+      <w:r>
+        <w:t xml:space="preserve">In particular, we chose not to use Neural Networks and decided to adamantly choose the Random Forest ensemble algorithm that is implemented directly in the Scikit-Learn Python library. A Random Forest is an effective voted ensemble of hundreds of simple mathematical decision trees as opposed to complex deep neural nets. After having fully trained the forest off-line, then running a Random Forest to infer a quick binary classification only involves walking simple binary logical paths (e.g. 'Is variance &gt; X?') and the CPU processor can compute this type of computation with computational triviality (Patel et al., 2021). These decision nodes can pass scaled </w:t>
       </w:r>
       <w:r>
         <w:lastRenderedPageBreak/>
-        <w:t xml:space="preserve">network metrics with almost no delay, and these nodes can simulate the speeds that are so desperately needed when deploying actual hardware-level bare-metal deployment. Moreover, decision trees provide an explainability feature which is vital in business cybersecurity governance. In a company setting, when a mitigation AI misidentifies a big e-sports event that costs sponsors thousands of dollars, security architects </w:t>
-      </w:r>
-      <w:proofErr w:type="gramStart"/>
-      <w:r>
-        <w:t>have to</w:t>
-      </w:r>
-      <w:proofErr w:type="gramEnd"/>
-      <w:r>
-        <w:t xml:space="preserve"> be in a special position to analyze log files to conclusively determine the motivation behind the decision made. Neural networks are purely black boxes and the decision as to why the internal decimal weights led to a logical failure is unknown. In contrast, Random Forests permit mathematical transparent extraction of explicit 'Feature Importances' right away, which obviously legitimize and audit the possibility that the model prioritized the inter-arrival of packets over the entropy computation in the erroneous block assignment phase.</w:t>
+        <w:t>network metrics with almost no delay, and these nodes can simulate the speeds that are so desperately needed when deploying actual hardware-level bare-metal deployment. Moreover, decision trees provide an explainability feature which is vital in business cybersecurity governance. In a company setting, when a mitigation AI misidentifies a big e-sports event that costs sponsors thousands of dollars, security architects have to be in a special position to analyze log files to conclusively determine the motivation behind the decision made. Neural networks are purely black boxes and the decision as to why the internal decimal weights led to a logical failure is unknown. In contrast, Random Forests permit mathematical transparent extraction of explicit 'Feature Importances' right away, which obviously legitimize and audit the possibility that the model prioritized the inter-arrival of packets over the entropy computation in the erroneous block assignment phase.</w:t>
       </w:r>
       <w:r>
         <w:br/>
@@ -2691,23 +2462,7 @@
         <w:br/>
       </w:r>
       <w:r>
-        <w:t xml:space="preserve">Continuing with the simulation of networking implementation, we adopted the front-end simulation architecture closely resembling the common cloud delivery network implementations. One of the highly used technical solutions is the deployment of deep packet inspection (DPI) appliances. DPI opens the packet encryption by force and scans the internal software </w:t>
-      </w:r>
-      <w:proofErr w:type="gramStart"/>
-      <w:r>
-        <w:t>byte-code</w:t>
-      </w:r>
-      <w:proofErr w:type="gramEnd"/>
-      <w:r>
-        <w:t xml:space="preserve"> in search </w:t>
-      </w:r>
-      <w:proofErr w:type="gramStart"/>
-      <w:r>
-        <w:t>of known</w:t>
-      </w:r>
-      <w:proofErr w:type="gramEnd"/>
-      <w:r>
-        <w:t xml:space="preserve"> malicious injections of packet header. There are two fundamental reasons why this project categorically rejects the use of DPI implementations: firstly, the implementation of decryptions and the opening of game-state UDP packets would impose unacceptable processing latency; secondly, the examination of absolute application-layer payloads often likely violates stringent rules of privacy compliance contained within contemporary global governance frameworks such as GDPR. Rather, we only steal out pure metadata values, such as absolute mathematical packet size, explicit size variance over a specified rolling window time interval, calculated entropy representation of the encrypted random noise payload, and pure millisecond time values determining absolute inter-arrival times. These measurements can be accessed immediately through simple statistical network hardware taps at the OSI Layer 2/3 directly at the switch level, ideally matching the current eBPF (Extended Berkeley Packet Filter) programming model. eBPF enables the administrator to author limited compiled C-code to directly execute within the core Linux Kernel memory space, forcefully isolating and dropping packets prior to even accessing typical server user-space RAM allocations. Even though the entire technical execution of real eBPF kernel memory hooks was ultimately considered beyond the practical scope of this Python-based academic simulation codebase, providing the logic to be simulated with only metadata as input is a heavyweight precondition to the eventual direct production kernel translation of the very mathematical logic.</w:t>
+        <w:t>Continuing with the simulation of networking implementation, we adopted the front-end simulation architecture closely resembling the common cloud delivery network implementations. One of the highly used technical solutions is the deployment of deep packet inspection (DPI) appliances. DPI opens the packet encryption by force and scans the internal software byte-code in search of known malicious injections of packet header. There are two fundamental reasons why this project categorically rejects the use of DPI implementations: firstly, the implementation of decryptions and the opening of game-state UDP packets would impose unacceptable processing latency; secondly, the examination of absolute application-layer payloads often likely violates stringent rules of privacy compliance contained within contemporary global governance frameworks such as GDPR. Rather, we only steal out pure metadata values, such as absolute mathematical packet size, explicit size variance over a specified rolling window time interval, calculated entropy representation of the encrypted random noise payload, and pure millisecond time values determining absolute inter-arrival times. These measurements can be accessed immediately through simple statistical network hardware taps at the OSI Layer 2/3 directly at the switch level, ideally matching the current eBPF (Extended Berkeley Packet Filter) programming model. eBPF enables the administrator to author limited compiled C-code to directly execute within the core Linux Kernel memory space, forcefully isolating and dropping packets prior to even accessing typical server user-space RAM allocations. Even though the entire technical execution of real eBPF kernel memory hooks was ultimately considered beyond the practical scope of this Python-based academic simulation codebase, providing the logic to be simulated with only metadata as input is a heavyweight precondition to the eventual direct production kernel translation of the very mathematical logic.</w:t>
       </w:r>
     </w:p>
     <w:p>
@@ -2722,15 +2477,7 @@
       </w:r>
       <w:r>
         <w:lastRenderedPageBreak/>
-        <w:t xml:space="preserve">Regarding reporting efficiency in terms of dashboard capabilities, broadcasting running mitigation measures traditionally would have involved implementing painful database polling requests, with the administrative web dashboard repeatedly executing SQL requests asking the database to continuously update data. Polling consumes colossal quantities of thread connections in the </w:t>
-      </w:r>
-      <w:proofErr w:type="gramStart"/>
-      <w:r>
-        <w:t>back-end</w:t>
-      </w:r>
-      <w:proofErr w:type="gramEnd"/>
-      <w:r>
-        <w:t xml:space="preserve"> and induces latency. In this way, fully adhering to the project thesis that requires real-time operating capability, the structural architecture chosen is one that employs the recent Server-Sent Events (SSE). Using the native asynchronous yield features that have been implemented in the Python </w:t>
+        <w:t xml:space="preserve">Regarding reporting efficiency in terms of dashboard capabilities, broadcasting running mitigation measures traditionally would have involved implementing painful database polling requests, with the administrative web dashboard repeatedly executing SQL requests asking the database to continuously update data. Polling consumes colossal quantities of thread connections in the back-end and induces latency. In this way, fully adhering to the project thesis that requires real-time operating capability, the structural architecture chosen is one that employs the recent Server-Sent Events (SSE). Using the native asynchronous yield features that have been implemented in the Python </w:t>
       </w:r>
       <w:proofErr w:type="spellStart"/>
       <w:r>
@@ -2746,15 +2493,7 @@
       </w:r>
       <w:proofErr w:type="spellEnd"/>
       <w:r>
-        <w:t xml:space="preserve">, at the same time showing the real physical size and performance of a globally simulated internal </w:t>
-      </w:r>
-      <w:proofErr w:type="gramStart"/>
-      <w:r>
-        <w:t>network infrastructure</w:t>
-      </w:r>
-      <w:proofErr w:type="gramEnd"/>
-      <w:r>
-        <w:t xml:space="preserve"> flood situation. As such, this comprehensive background survey underlines the fact that this simulation is a successful operation template map standard of the academic theory against the prevailing industrial cyber security limitations.</w:t>
+        <w:t>, at the same time showing the real physical size and performance of a globally simulated internal network infrastructure flood situation. As such, this comprehensive background survey underlines the fact that this simulation is a successful operation template map standard of the academic theory against the prevailing industrial cyber security limitations.</w:t>
       </w:r>
     </w:p>
     <w:p>
@@ -2821,6 +2560,9 @@
     <w:p>
       <w:pPr>
         <w:ind w:left="360"/>
+        <w:rPr>
+          <w:lang w:val="en-IN"/>
+        </w:rPr>
       </w:pPr>
       <w:r>
         <w:rPr>
@@ -2840,23 +2582,7 @@
         <w:br/>
       </w:r>
       <w:r>
-        <w:t xml:space="preserve">The deployed backend server logic would have to self-accumulate, segregate and create telemetry components holistically representing two inherently distinct operating populations that characterize normal operator traffic and malicious attack vectors. A code architecture should prominently include a generation normal traffic generation function that heavily relies on bounded random normal distributions mathematically simulating constant human controlled 20Hz gameplay positional tick rates (which would correspond to around 50ms constant operational gaps). At the same time, the second-level load-and-filter-botnet-data routine logically needs to attempt to make extractions that segregate massive structural payload volume bursts offline </w:t>
-      </w:r>
-      <w:proofErr w:type="gramStart"/>
-      <w:r>
-        <w:t>formatted .parquet</w:t>
-      </w:r>
-      <w:proofErr w:type="gramEnd"/>
-      <w:r>
-        <w:t xml:space="preserve"> analytical datasets stored safely within local storage archives. In case of failure in offline dataset access because of operational explicit I/O limits, or because of the lack of source files, the routine should immediately gracefully </w:t>
-      </w:r>
-      <w:proofErr w:type="gramStart"/>
-      <w:r>
-        <w:t>fallback</w:t>
-      </w:r>
-      <w:proofErr w:type="gramEnd"/>
-      <w:r>
-        <w:t xml:space="preserve"> to execution of a full secondary mathematical distribution of realistic erratic UDP data structures, to simulate excessive fluctuations at the baseline. After independent generation, the following </w:t>
+        <w:t xml:space="preserve">The deployed backend server logic would have to self-accumulate, segregate and create telemetry components holistically representing two inherently distinct operating populations that characterize normal operator traffic and malicious attack vectors. A code architecture should prominently include a generation normal traffic generation function that heavily relies on bounded random normal distributions mathematically simulating constant human controlled 20Hz gameplay positional tick rates (which would correspond to around 50ms constant operational gaps). At the same time, the second-level load-and-filter-botnet-data routine logically needs to attempt to make extractions that segregate massive structural payload volume bursts offline formatted .parquet analytical datasets stored safely within local storage archives. In case of failure in offline dataset access because of operational explicit I/O limits, or because of the lack of source files, the routine should immediately gracefully fallback to execution of a full secondary mathematical distribution of realistic erratic UDP data structures, to simulate excessive fluctuations at the baseline. After independent generation, the following </w:t>
       </w:r>
       <w:proofErr w:type="spellStart"/>
       <w:r>
@@ -2879,37 +2605,103 @@
       </w:r>
       <w:r>
         <w:br/>
-        <w:t>FR2: Linear Synchronous Model Instantiation via Active User Event Interactions</w:t>
+      </w:r>
+      <w:r>
+        <w:rPr>
+          <w:b/>
+          <w:bCs/>
+        </w:rPr>
+        <w:t xml:space="preserve">FR2: </w:t>
+      </w:r>
+      <w:r>
+        <w:rPr>
+          <w:b/>
+          <w:bCs/>
+          <w:lang w:val="en-IN"/>
+        </w:rPr>
+        <w:t>Active User Event Interactions Provide Input to Linear Synchronous Model Instantiation via an Online Graphical User Interface:</w:t>
       </w:r>
       <w:r>
         <w:br/>
-        <w:t xml:space="preserve">The web-based visual user interface must successfully expose a distinct administrative control endpoint (a defined HTML button representation) intentionally mapped to permit an external network engineering operator explicit capabilities to securely initiate the overarching algorithmic background calculation phase directly on demand. Upon successfully transmitting the HTTP POST request to the explicit `/api/train` backend controller mapping, the core Python server interpreter must </w:t>
+      </w:r>
+      <w:r>
+        <w:t xml:space="preserve">The online GUI should include a specific administrative control endpoint that allows an external internet network engineering operator to invoke a specific algorithmic background calculation step by explicitly choosing it from the GUI (this will be represented by a specific html button). Once the external network engineering operator has selected the administrative control button, and the button sends an HTTP </w:t>
       </w:r>
       <w:r>
         <w:lastRenderedPageBreak/>
-        <w:t>immediately load specific dataset permutations, utilize standard `Scikit-learn` algorithms calculating normalized `train_test_split` cross-validation variables, formally instantiate the Random Forest classifier matrix assigning parameters allowing exactly up to 100 deep constituent estimation nodes to form preventing extensive branching logic generating computational overfitting problems. Following strict creation, it executes the explicit `.fit()` iterative methodology mapping variables. It subsequently computes static local validations establishing confusion arrays (mapping true negatives and active false dropping variables) and pushes a successfully serialized JSON success string backwards towards the Javascript caller invoking interface DOM transitions.</w:t>
+        <w:t xml:space="preserve">POST request (to a specific mapping of the backend controller, which is the python server), the python server will process the request and load into memory the appropriate permutations of the datasets, and apply standard Scikit-learn algorithms to provide normalized datasets based on the dataset permutations that were loaded. Finally, once the random forest classifier has been instantiated through the .fit() function - using the defined variable mapping and looping through the iterations, the random forest classifier will also validate the results of the static local validation sets and create a confusion array of true-negatives/errors and active false dropping variables. Lastly, a serialization successful </w:t>
+      </w:r>
+      <w:proofErr w:type="spellStart"/>
+      <w:r>
+        <w:t>json</w:t>
+      </w:r>
+      <w:proofErr w:type="spellEnd"/>
+      <w:r>
+        <w:t xml:space="preserve"> string will be returned to the </w:t>
+      </w:r>
+      <w:proofErr w:type="spellStart"/>
+      <w:r>
+        <w:t>javascript</w:t>
+      </w:r>
+      <w:proofErr w:type="spellEnd"/>
+      <w:r>
+        <w:t xml:space="preserve"> external network engineering operator.</w:t>
       </w:r>
       <w:r>
         <w:br/>
       </w:r>
       <w:r>
         <w:br/>
-        <w:t>FR3: Infinite Background Telemetry Generation and Streaming Protocols</w:t>
+      </w:r>
+      <w:r>
+        <w:rPr>
+          <w:b/>
+          <w:bCs/>
+        </w:rPr>
+        <w:t>FR3: Interminable in the backdrop Telemetry Generation and streaming Protocols:</w:t>
       </w:r>
       <w:r>
         <w:br/>
-        <w:t>The internal Python logic mandates a structurally decoupled real-time generation framework securely capable of executing indefinitely asynchronously without blocking primary Python ASGI standard listener mechanisms handling global interactions. The active backend server mapping exactly to the endpoint route `/api/simulate` utilizes independent generator functionality mapped directly corresponding to Python's robust `yield` return mechanisms connected transparently via Starlette's advanced Event Source operational definitions. The function executes random continuous data matrix combinations, explicitly evaluates data dynamically against the active cached `GLOBAL_MODEL` instance utilizing precise prior fitted scalar properties arrays, formulates boolean results directly into clean key-value dictionaries alongside explicitly recorded actual data truths, and streams instances natively directly mapping active HTTP output pipes seamlessly returning packets dynamically toward the active Document Object framework.</w:t>
+      </w:r>
+      <w:r>
+        <w:t>Internal Python logic requires a structurally decoupled real-time generation system that is safely executable indefinitely in an asynchronous manner without blocking primary Python ASGI standard listener services that can interact globally. The operational backend server that directly matches the endpoint route of /</w:t>
+      </w:r>
+      <w:proofErr w:type="spellStart"/>
+      <w:r>
+        <w:t>api</w:t>
+      </w:r>
+      <w:proofErr w:type="spellEnd"/>
+      <w:r>
+        <w:t>/simulate has independent generator functionality that has direct mapping to Python's powerful yield return constructs that are linked together transparently through the advanced Starlette operational definitions of Event Sources. The function combines random combinations of data matrices, explicitly tests data dynamically against the current cached GLOBAL_MODEL instance using accurate prior fitted scalar properties arrays, forms the results of the computation in the form of explicit clean key-value dictionaries, and streams instances natively directly into process maps to the active Document Object framework.</w:t>
       </w:r>
       <w:r>
         <w:br/>
       </w:r>
       <w:r>
         <w:br/>
-        <w:t>FR4: Real-Time BGP Anycast Regional Filtration Mimicry</w:t>
+      </w:r>
+      <w:r>
+        <w:rPr>
+          <w:b/>
+          <w:bCs/>
+        </w:rPr>
+        <w:t>FR4: Visual Real-time Anycast Regional Filtering through the BGP Protocol:</w:t>
       </w:r>
       <w:r>
         <w:br/>
-        <w:t>The continuous visual layout must execute visual algorithms accurately dictating simulated geographic packet filtration. Raw packets constructed across the aforementioned endpoint generator must immediately receive artificially appended localized regional location tags dynamically simulating logical geographic planetary data distribution models (e.g. Frankfurt nodes managing EU vectors vs Mumbai nodes handling South Asia vectors). The operational GUI logic requires a functional input node filter (a standard standard DOM Select tag). Assuming the human console operator activates the dropdown isolating specific geographic parameters, the subsequent asynchronous backend streaming function natively must execute loop definitions explicitly dropping yielding events originating out of region. This actively illustrates standard BGP topological distribution logic seamlessly to observing technicians.</w:t>
+      </w:r>
+      <w:r>
+        <w:t xml:space="preserve">Moving forward from this point, </w:t>
+      </w:r>
+      <w:r>
+        <w:t xml:space="preserve">we </w:t>
+      </w:r>
+      <w:r>
+        <w:t xml:space="preserve">will need to produce visual algorithms that are capable of accurately defining simulated geographic packet filtering through visual representation. Using the packet data created by the endpoint generating system as the raw input the system will automatically add (artificially) tags indicating the region where that packet should be routed (e.g., when a packet is tagged as 'Frankfurt' that would indicate it should be sent via a Frankfurt based node to a destination located in the EU while a packet tagged as 'Mumbai' would indicate sending the packet through a node in Mumbai to its intended resource in South Asia). In order to achieve this goal the operational GUI must include a filter on the primary input node (a HTML Select drop down) where the human console operator will enable the drop down to isolate specific geographic variables. Once the console operator has successfully completed that operation the backend processing of packet data will utilize natural backend streaming functions that define packet processing loops that explicitly drop </w:t>
+      </w:r>
+      <w:r>
+        <w:lastRenderedPageBreak/>
+        <w:t>any packets that originate out of that defined geographical area. The resulting operation will effectively represent a traditional BGP topology distribution logic for technicians to view as they are processing their requests with that client's resource.</w:t>
       </w:r>
       <w:r>
         <w:br/>
@@ -2918,12 +2710,53 @@
         <w:br/>
       </w:r>
       <w:r>
-        <w:lastRenderedPageBreak/>
+        <w:rPr>
+          <w:b/>
+          <w:bCs/>
+        </w:rPr>
         <w:t>FR5: Mobile Threat Notification Delivery Sequences</w:t>
       </w:r>
       <w:r>
+        <w:rPr>
+          <w:b/>
+          <w:bCs/>
+        </w:rPr>
+        <w:t>:</w:t>
+      </w:r>
+      <w:r>
         <w:br/>
-        <w:t>When the continuous stream counters natively detect aggressive sustained patterns of maliciously categorized 'dropped' arrays deliberately breaching explicit embedded security volume thresholds (explicitly hard-coded mapped to precisely 15 concurrent uninterrupted aggressive elements specifically mimicking extended overwhelming strain environments), the FastAPI framework logic must securely instantiate separate independent task functions explicitly calling python local shell integration libraries exactly utilizing the `pywhatkit` codebase implementations. This execution translates raw current numerical assessment counts tracking cumulative dropped entities paired simultaneously matching false positive percentage values directly toward standard outbound strings dynamically mapped executing live mobile SMS/WhatsApp protocol API interactions, notifying network infrastructure leaders seamlessly without generating terminal locks.</w:t>
+      </w:r>
+      <w:proofErr w:type="spellStart"/>
+      <w:r>
+        <w:t>FastAPI</w:t>
+      </w:r>
+      <w:proofErr w:type="spellEnd"/>
+      <w:r>
+        <w:t xml:space="preserve"> should create independent task functions that call the different integration libraries with `</w:t>
+      </w:r>
+      <w:proofErr w:type="spellStart"/>
+      <w:r>
+        <w:t>pywhatkit`s</w:t>
+      </w:r>
+      <w:proofErr w:type="spellEnd"/>
+      <w:r>
+        <w:t xml:space="preserve"> code from the local shell. </w:t>
+      </w:r>
+      <w:proofErr w:type="spellStart"/>
+      <w:r>
+        <w:t>FastAPI</w:t>
+      </w:r>
+      <w:proofErr w:type="spellEnd"/>
+      <w:r>
+        <w:t xml:space="preserve"> must also define how these tasks can be tracked by action count and by total cumulative entity counts dropped based on the number of actions completed. The process by which </w:t>
+      </w:r>
+      <w:proofErr w:type="spellStart"/>
+      <w:r>
+        <w:t>FastAPI</w:t>
+      </w:r>
+      <w:proofErr w:type="spellEnd"/>
+      <w:r>
+        <w:t xml:space="preserve"> calls the different libraries must be able to track both how many of each action have been processed, and how many have registered a false-positive percentage against an entity dropped for any of the standard outbound phone numbers that can execute a live SMS or WhatsApp API interaction in real time to notify the infrastructure team immediately, without locking any terminals.</w:t>
       </w:r>
     </w:p>
     <w:p>
@@ -2943,42 +2776,147 @@
     <w:p>
       <w:pPr>
         <w:ind w:left="360"/>
-      </w:pPr>
-      <w:r>
-        <w:t>NFR1: Absolute Strict Prioritization Maintaining Negligible False Positive Boundaries</w:t>
-      </w:r>
-      <w:r>
-        <w:br/>
-        <w:t>From an abstract classification model point of view, generic statistical accuracy refers simply to comprehensive overall mathematical correctness over total test vectors. Within the operational design dictates of this project, focusing on generalized accuracy remains firmly secondary. The critical underlying defensive requirement actively directs AI optimization strategies focusing entirely on aggressively minimizing any resulting False Positive Rate (FPR), exactly where legitimate human gamer behavior accidentally triggers algorithmic blocking structures. Cybersecurity frameworks historically dictating models returning exact 90% generalized accuracy yet structurally dropping explicitly 10% of standard genuine concurrent players permanently fail standard commercial video game operational deployment mandates due to catastrophic structural retention penalties affecting business parameters. NFR1 mandates constant analytical weighting prioritizing active player traffic preservation.</w:t>
-      </w:r>
-      <w:r>
-        <w:br/>
-      </w:r>
-      <w:r>
-        <w:br/>
-        <w:t>NFR2: Extreme Microsecond Execution Latency Priorities</w:t>
-      </w:r>
-      <w:r>
-        <w:br/>
-        <w:t>The operational predictive processing pipeline structure actively requires ensuring absolute sub-millisecond core processor computational speeds guaranteeing minimal TCP/UDP transit delays. The system explicitly dictates securely pre-loading mathematical feature scaling normalization (StandardScaler) arrays and caching operational forest branching bounds purely within extremely fast localized web server RAM storage. Standard scaling ensures dynamic matrix multiplication overhead completely collapses towards functionally instantaneous simple CPU vector additions directly resulting in zero practical user disruption delays.</w:t>
-      </w:r>
-      <w:r>
-        <w:br/>
-      </w:r>
-      <w:r>
-        <w:br/>
-        <w:t>NFR3: Visual Reactive Fluidity Across Infinite State DOM Injection Mechanisms</w:t>
-      </w:r>
-      <w:r>
-        <w:br/>
-      </w:r>
-      <w:r>
-        <w:lastRenderedPageBreak/>
-        <w:t>The administrative simulated frontend operator dashboard strictly demands continuous sixty frames per second execution speeds natively rendered utilizing local hardware acceleration protocols. Executing explicit single threaded asynchronous Javascript loops processing thousands of individual SSE push operations implicitly ensures complex parsing structures executing innerHTML text injections drastically avoid seizing standard UI rendering elements. Moreover, advanced DOM element culling routines continuously check document child counts explicitly removing older stale log rows mapping beyond display limitations, ensuring memory usage stays static preventing absolute catastrophic crash routines.</w:t>
+        <w:rPr>
+          <w:b/>
+          <w:bCs/>
+          <w:lang w:val="en-IN"/>
+        </w:rPr>
+      </w:pPr>
+      <w:r>
+        <w:rPr>
+          <w:b/>
+          <w:bCs/>
+          <w:lang w:val="en-IN"/>
+        </w:rPr>
+        <w:t>NFR1: Complete Strict Prioritization Negligible False Positive Boundaries:</w:t>
       </w:r>
     </w:p>
     <w:p>
       <w:pPr>
+        <w:ind w:left="360"/>
+        <w:rPr>
+          <w:lang w:val="en-IN"/>
+        </w:rPr>
+      </w:pPr>
+      <w:r>
+        <w:rPr>
+          <w:lang w:val="en-IN"/>
+        </w:rPr>
+        <w:t>In an abstract classification model perspective, generic statistical accuracy is merely a total overall mathematical correctness across test vectors in total. Under the dictates of the operational design of this project, the emphasis on the generalized accuracy is squarely in the second place. The underlying defensive need is critical and actively guides AI optimization strategies with the sole goal of aggressively reducing any resulting False Positive Rate (FPR), precisely in the area where human legitimate gamer behaviour unintentionally causes algorithmic blocking decision making frameworks. Historically-established cybersecurity models that specify schemes yielding 100-percent generalized accuracy but with structural dropout of 10-percent of conventional game players permanently fail standard business deployment operational requirements because of disastrous structural retention fines that influence business parameters. NFR1 requires that weighting of analytics be kept constant with priority to preserving active player traffic.</w:t>
+      </w:r>
+    </w:p>
+    <w:p>
+      <w:pPr>
+        <w:ind w:left="360"/>
+        <w:rPr>
+          <w:b/>
+          <w:bCs/>
+          <w:lang w:val="en-IN"/>
+        </w:rPr>
+      </w:pPr>
+      <w:r>
+        <w:br/>
+      </w:r>
+      <w:r>
+        <w:rPr>
+          <w:b/>
+          <w:bCs/>
+          <w:lang w:val="en-IN"/>
+        </w:rPr>
+        <w:t>NFR2: Microsecond Exec Loose Priorities:</w:t>
+      </w:r>
+    </w:p>
+    <w:p>
+      <w:pPr>
+        <w:ind w:left="360"/>
+        <w:rPr>
+          <w:lang w:val="en-IN"/>
+        </w:rPr>
+      </w:pPr>
+      <w:r>
+        <w:rPr>
+          <w:lang w:val="en-IN"/>
+        </w:rPr>
+        <w:t>The predictive processing pipeline architecture operating is an active structure that needs to ensure absolute sub-milliseconds core processor computational speeds that ensure low TCP/UDP transit delays. This system clearly specifies how to pre-load mathematical feature scaling normalization (</w:t>
+      </w:r>
+      <w:proofErr w:type="spellStart"/>
+      <w:r>
+        <w:rPr>
+          <w:lang w:val="en-IN"/>
+        </w:rPr>
+        <w:t>StandardScaler</w:t>
+      </w:r>
+      <w:proofErr w:type="spellEnd"/>
+      <w:r>
+        <w:rPr>
+          <w:lang w:val="en-IN"/>
+        </w:rPr>
+        <w:t xml:space="preserve">) arrays securely and operational forest branching bounds to be cached specifically in extremely fast local web server RAM storage. Standard scaling guarantees that dynamic overhead of </w:t>
+      </w:r>
+      <w:r>
+        <w:rPr>
+          <w:lang w:val="en-IN"/>
+        </w:rPr>
+        <w:lastRenderedPageBreak/>
+        <w:t>matrix multiplication scales to zero functional instant additions of simple CPU vectors that directly translate to zero practical user disruption delays.</w:t>
+      </w:r>
+    </w:p>
+    <w:p>
+      <w:pPr>
+        <w:ind w:left="360"/>
+        <w:rPr>
+          <w:b/>
+          <w:bCs/>
+          <w:lang w:val="en-IN"/>
+        </w:rPr>
+      </w:pPr>
+      <w:r>
+        <w:br/>
+      </w:r>
+      <w:r>
+        <w:rPr>
+          <w:b/>
+          <w:bCs/>
+          <w:lang w:val="en-IN"/>
+        </w:rPr>
+        <w:t xml:space="preserve">NFR3: Injection Mechanisms for Visual Reactive Fluidity Act upon DOM in Infinity State: </w:t>
+      </w:r>
+    </w:p>
+    <w:p>
+      <w:pPr>
+        <w:ind w:left="360"/>
+        <w:rPr>
+          <w:lang w:val="en-IN"/>
+        </w:rPr>
+      </w:pPr>
+      <w:r>
+        <w:rPr>
+          <w:lang w:val="en-IN"/>
+        </w:rPr>
+        <w:t xml:space="preserve">The administrative simulated user operations dashboard is held to an extraordinarily high standard of performance providing that the user experience is executed at least sixty frames per second with natural performance due to local hardware accelerated protocol execution. The implementation of a single-threaded asynchronous JavaScript loop, handling thousands of different SSE Push's simultaneously will have a measurable impact upon how and if complex parsing structure (injected into the DOM via </w:t>
+      </w:r>
+      <w:proofErr w:type="spellStart"/>
+      <w:r>
+        <w:rPr>
+          <w:lang w:val="en-IN"/>
+        </w:rPr>
+        <w:t>innerHTML</w:t>
+      </w:r>
+      <w:proofErr w:type="spellEnd"/>
+      <w:r>
+        <w:rPr>
+          <w:lang w:val="en-IN"/>
+        </w:rPr>
+        <w:t xml:space="preserve"> injection) will seize all of the UI rendering objects that are consumed by complex parsing structures. Additionally, well-designed Dom element culling algorithms will repeatedly scan through the number of document children with deletion of older stale log rows whose mapped display boundaries exceed memory consumption should there be a serious catastrophic failure of an absolute nature. </w:t>
+      </w:r>
+    </w:p>
+    <w:p>
+      <w:pPr>
+        <w:ind w:left="360"/>
+      </w:pPr>
+    </w:p>
+    <w:p>
+      <w:pPr>
         <w:pStyle w:val="Heading2"/>
         <w:ind w:firstLine="360"/>
       </w:pPr>
@@ -2994,37 +2932,89 @@
     <w:p>
       <w:pPr>
         <w:ind w:left="360"/>
-      </w:pPr>
-      <w:r>
-        <w:t xml:space="preserve">The fundamental architectural software </w:t>
-      </w:r>
-      <w:proofErr w:type="gramStart"/>
-      <w:r>
-        <w:t>formulation executes</w:t>
-      </w:r>
-      <w:proofErr w:type="gramEnd"/>
-      <w:r>
-        <w:t xml:space="preserve"> explicitly </w:t>
-      </w:r>
-      <w:proofErr w:type="gramStart"/>
-      <w:r>
-        <w:t>reacting</w:t>
-      </w:r>
-      <w:proofErr w:type="gramEnd"/>
-      <w:r>
-        <w:t xml:space="preserve"> amongst three isolated contextual system actors simultaneously operating over explicit system resources. The automated algorithmic process loop (System), the aggressive high volume structural generation loop aggressively replicating outside boundaries (Attacker), and the visual web based execution element triggering physical operations matrices (Administrator).</w:t>
+        <w:rPr>
+          <w:b/>
+          <w:bCs/>
+          <w:lang w:val="en-IN"/>
+        </w:rPr>
+      </w:pPr>
+      <w:r>
+        <w:rPr>
+          <w:lang w:val="en-IN"/>
+        </w:rPr>
+        <w:t>The basic architecture will consist of software that is calculated to respond explicitly to three separate contextual system actors simultaneously interacting with each other's explicit resource at the time of a particular event. SYSTEM (Automated Algorithm Processing Process Loop), ATTACKER (Aggressive High Volume Framework Creator Loop Focusing Upon Creating Frameworks Outside of Physical Boundaries), and ADMINISTRATOR (Visual Front End Execution Element Triggering Physical Operations Matrix).</w:t>
       </w:r>
       <w:r>
         <w:br/>
       </w:r>
       <w:r>
         <w:br/>
-        <w:t xml:space="preserve">Use Case 1: Core Classifier Instantiation via Human API Control </w:t>
-      </w:r>
-      <w:r>
-        <w:br/>
-        <w:t>Actor Requirement: Console Administrator. Expected Initial state maps directly finding the software system displaying entirely disconnected offline GUI values indicating zero cached models. Primary Flow Sequence: The operator physically triggers the 'Train Pipeline' DOM command element. Javascript isolates the primary interaction catching immediate secondary triggers utilizing standard variable flags. Backend Python routines structurally extract designated massive internal matrices, calculates specific logical bounds identifying random network variances, tests capabilities against disjoint test matrices, formulates numerical accuracy variables natively, and serializes operations to standard JSON elements returning outputs exactly across explicit HTTP connections. Post-condition resolution finds dynamic HTML values flashing green, accurately defining system engine transitions correctly reaching complete online protection states.</w:t>
-      </w:r>
+      </w:r>
+      <w:r>
+        <w:rPr>
+          <w:b/>
+          <w:bCs/>
+          <w:lang w:val="en-IN"/>
+        </w:rPr>
+        <w:t>Use Case 1: Human API Control Complete Classifier Instantiation:</w:t>
+      </w:r>
+    </w:p>
+    <w:p>
+      <w:pPr>
+        <w:ind w:left="360"/>
+        <w:rPr>
+          <w:lang w:val="en-IN"/>
+        </w:rPr>
+      </w:pPr>
+      <w:r>
+        <w:rPr>
+          <w:lang w:val="en-IN"/>
+        </w:rPr>
+        <w:t xml:space="preserve">The console admin actor has required minimal graphical user interface mappings, which will result in all software related identification in total isolation within the systems being evaluated. The initial flow sequence is initiated through a physically triggered instance of code execution for the "Train Pipeline" DOM command via operator. Main interaction points occur via </w:t>
+      </w:r>
+      <w:proofErr w:type="spellStart"/>
+      <w:r>
+        <w:rPr>
+          <w:lang w:val="en-IN"/>
+        </w:rPr>
+        <w:t>javascript</w:t>
+      </w:r>
+      <w:proofErr w:type="spellEnd"/>
+      <w:r>
+        <w:rPr>
+          <w:lang w:val="en-IN"/>
+        </w:rPr>
+        <w:t xml:space="preserve"> and capture the instantaneous triggering response to each secondary instance through use of standard variable flags. The extraction routines written in python systematically extract and compute by slicing out specific, large internal matrices recording the normal limits of evaluation, recording all unique random variations of the neural network capable of being tested </w:t>
+      </w:r>
+      <w:r>
+        <w:rPr>
+          <w:lang w:val="en-IN"/>
+        </w:rPr>
+        <w:lastRenderedPageBreak/>
+        <w:t xml:space="preserve">across disjointed test matrices, building and outputting numerically accurate variable values natively, and generating all function based outputs using standard </w:t>
+      </w:r>
+      <w:proofErr w:type="spellStart"/>
+      <w:r>
+        <w:rPr>
+          <w:lang w:val="en-IN"/>
+        </w:rPr>
+        <w:t>json</w:t>
+      </w:r>
+      <w:proofErr w:type="spellEnd"/>
+      <w:r>
+        <w:rPr>
+          <w:lang w:val="en-IN"/>
+        </w:rPr>
+        <w:t xml:space="preserve"> object and returning precisely via established http connection (all values indicated through dynamic generation by html will flash green to indicate the results of transferring from various system engine states into full online protected states after completion).</w:t>
+      </w:r>
+    </w:p>
+    <w:p>
+      <w:pPr>
+        <w:ind w:left="360"/>
+        <w:rPr>
+          <w:lang w:val="en-IN"/>
+        </w:rPr>
+      </w:pPr>
       <w:r>
         <w:br/>
       </w:r>
@@ -3034,11 +3024,7 @@
       </w:r>
       <w:r>
         <w:br/>
-        <w:t xml:space="preserve">Actor Requirement: Administrator initializing events effectively triggering autonomous internal simulated Attacker loops. System assumes successfully trained models operate. Primary Flow Sequence: Operator clicks specifically deployed 'Enable Mitigation Shield' button components. Frontend HTTP streams initiate immediately listening explicitly mapping endpoints over persistent connection tunnels. FastAPI generators initialize while loops. Legitimate packet formulation simulates organic arrays natively mapped calculating small variance behaviors. Alongside organic traffic, asynchronous attack variables produce massive variance </w:t>
-      </w:r>
-      <w:r>
-        <w:lastRenderedPageBreak/>
-        <w:t>combinations aggressively altering inter-arrival calculations. Active System processes intercept merged data streams immediately executing classifier calculations yielding outputs directly downstream alongside recorded logical truth arrays isolating physical model errors cleanly. Dashboard DOM renders continuous visual heatmap statistics directly translating offline data values simulating reality realistically.</w:t>
+        <w:t>Actor Requirement: Administrator initializing events effectively triggering autonomous internal simulated Attacker loops. System assumes successfully trained models operate. Primary Flow Sequence: Operator clicks specifically deployed 'Enable Mitigation Shield' button components. Frontend HTTP streams initiate immediately listening explicitly mapping endpoints over persistent connection tunnels. FastAPI generators initialize while loops. Legitimate packet formulation simulates organic arrays natively mapped calculating small variance behaviors. Alongside organic traffic, asynchronous attack variables produce massive variance combinations aggressively altering inter-arrival calculations. Active System processes intercept merged data streams immediately executing classifier calculations yielding outputs directly downstream alongside recorded logical truth arrays isolating physical model errors cleanly. Dashboard DOM renders continuous visual heatmap statistics directly translating offline data values simulating reality realistically.</w:t>
       </w:r>
       <w:r>
         <w:br/>
@@ -3149,8 +3135,14 @@
     <w:p>
       <w:pPr>
         <w:ind w:left="2160"/>
-      </w:pPr>
-      <w:r>
+        <w:rPr>
+          <w:lang w:val="en-IN"/>
+        </w:rPr>
+      </w:pPr>
+      <w:r>
+        <w:rPr>
+          <w:noProof/>
+        </w:rPr>
         <w:drawing>
           <wp:inline distT="0" distB="0" distL="0" distR="0" wp14:anchorId="5AE02AB5" wp14:editId="44D0CF6D">
             <wp:extent cx="2449830" cy="3287706"/>
@@ -3226,7 +3218,6 @@
           <w:sz w:val="22"/>
           <w:szCs w:val="20"/>
         </w:rPr>
-        <w:tab/>
         <w:t xml:space="preserve">  </w:t>
       </w:r>
       <w:r>
@@ -3240,37 +3231,129 @@
     <w:p>
       <w:pPr>
         <w:pStyle w:val="Heading2"/>
-      </w:pPr>
-      <w:bookmarkStart w:id="13" w:name="_Toc227571866"/>
-      <w:r>
+        <w:rPr>
+          <w:lang w:val="en-IN"/>
+        </w:rPr>
+      </w:pPr>
+      <w:r>
+        <w:rPr>
+          <w:lang w:val="en-IN"/>
+        </w:rPr>
         <w:lastRenderedPageBreak/>
-        <w:t>Explicit Active Asynchronous Behavioural Models</w:t>
-      </w:r>
-      <w:bookmarkEnd w:id="13"/>
+        <w:t>Architectural Design of Asynchronous Behavioural Models</w:t>
+      </w:r>
       <w:r>
         <w:t>:</w:t>
       </w:r>
     </w:p>
     <w:p>
-      <w:r>
-        <w:t xml:space="preserve">Operating actively mapping standard interaction events directly exposes software executing explicit dual tracked sequential execution logic accurately separating physical asynchronous realities securely. Initial defined primary operational sequences completely implement explicit blocking standard synchronous timeline executions strictly. Network technical operators physically command initialization inputs completely directly forcing active client HTTP browser application fetch transactions. The standard system intercepts execution pipelines executing physical mathematical matrix calculations cleanly isolating precisely defined massive data sample components, completely mapping absolute variable matrices generating highly complicated Random Forest matrices accurately executing absolute physical internal array branching algorithms exactly correctly processing fully 100 native evaluation sequence layers. This execution mathematically logically forces exact primary system CPU cores strictly locking operational boundaries preventing extraneous API interaction conflicts absolutely natively resulting executing precise explicit metric evaluations exactly returning outputs confirming physical model finalizations cleanly securely. </w:t>
-      </w:r>
-      <w:r>
-        <w:br/>
-      </w:r>
-      <w:r>
-        <w:br/>
-        <w:t xml:space="preserve">Contrasting explicit synchronous routines completely mapping operational system simulation phases exactly generates radically different software behavioral pipelines executing uniquely implementing explicit fully asynchronous generation methodologies natively. Network application operators initialize physical mitigation start elements actively immediately successfully opening specific Server-Sent local physical application pipelines explicitly establishing internal permanent loops natively generating continuous randomized logical values completely natively mimicking extreme erratic aggressive external botnet anomalies effectively randomly inserting standard human player variables interspersed actively creating exact representations naturally establishing chaos arrays cleanly. The active python simulation core precisely executes endless iterative loops natively running exactly transforming raw unformatted physical dataset metrics directly specifically pushing unaligned specific array parameters exactly actively through mapped scaler transformation functions strictly ensuring unnormalized integers absolutely never completely generate explicit corrupted classifier errors natively. System extracts explicit variable binary outputs securely calculating metrics defining specifically exact logical evaluation models mapping precisely correct actions physically generating raw HTTP output texts uniquely combining mathematically formatted JSON exact combinations. Explicit executing standard python `await asyncio.sleep()` commands absolutely critically enforces realistic mechanical delivery limitations successfully preventing system hardware running exact infinite loops totally locking physical hardware core arrays dynamically completely mimicking actual realistic processing environments flawlessly correctly securely. </w:t>
-      </w:r>
-      <w:r>
-        <w:br/>
-      </w:r>
-      <w:r>
-        <w:br/>
-      </w:r>
-      <w:r>
+      <w:pPr>
+        <w:rPr>
+          <w:lang w:val="en-IN"/>
+        </w:rPr>
+      </w:pPr>
+      <w:r>
+        <w:rPr>
+          <w:lang w:val="en-IN"/>
+        </w:rPr>
+        <w:t>In contemporary interactive software applications, especially those dealing with high-throughput applications such as Layer 4 network traffic mitigation, the classical model of synchronous execution may be ineffective. The system proposed in this study proactively shifts off of the normal blocking routines and oscillates to an explicit asynchronous system model. This architectural decoupling is a useful way of keeping the physical network realities apart enough to prevent the physical network events of high volume engaging the internal sequential processing logic, such that they do not choke the main execution pipeline. It is actively started by operational sequences via active client browser requests and the initiation of a never-ending data fetch transaction. When these pipelines are intercepted, the core system extracts incoming network packet characteristics and these variables are represented in complex matrices. These matrices are huge data samples that are directly fed to the classification algorithms beneath the Random Forest algorithms. Through asynchronous processing of these evaluation layers, the execution logic mathematically locks operational boundaries, which has the effect of assigning system CPU cores to eliminate extraneous API interaction conflicts. The paradigm guarantees accurate metric recording and quick recovery of output states, the definitive validation of the final algorithmic forecast of the physical model with mathematical accuracy with little latency overhead.</w:t>
+      </w:r>
+    </w:p>
+    <w:p>
+      <w:pPr>
+        <w:rPr>
+          <w:lang w:val="en-IN"/>
+        </w:rPr>
+      </w:pPr>
+      <w:r>
+        <w:rPr>
+          <w:rStyle w:val="Heading2Char"/>
+          <w:lang w:val="en-IN"/>
+        </w:rPr>
+        <w:t>Asynchronous Simulation Engine and Event Processing</w:t>
+      </w:r>
+      <w:r>
+        <w:rPr>
+          <w:rStyle w:val="Heading2Char"/>
+          <w:lang w:val="en-IN"/>
+        </w:rPr>
+        <w:t>:</w:t>
+      </w:r>
+    </w:p>
+    <w:p>
+      <w:pPr>
+        <w:rPr>
+          <w:lang w:val="en-IN"/>
+        </w:rPr>
+      </w:pPr>
+      <w:r>
+        <w:rPr>
+          <w:lang w:val="en-IN"/>
+        </w:rPr>
+        <w:t xml:space="preserve">Unlike the more conservative synchronous routines, our operational simulation engine is based on an asynchronous generation pipeline that is purposefully designed to model realistic, highly stressful network conditions in a natural manner. Network operators trigger the mitigation protocols, and instantly create a continuous physical pipeline of Server-Sent Events (SSE), between the back-end analytical engine and the client dashboard locally. The system is designed to continually generate randomized logical values at the basis of logic by a series of endlessly repeated cycles that are set up as part of the Python asynchronous simulation core. It is an aggressive technique that tries to duplicate extreme external botnet anomalies mixed amongst normal human player variables, precisely simulating realistic traffic arrays that are representative of natural network chaos. The matrices of raw array data will be fed into the simulation core through a defined set of Min-Max scaler transformation functions. This operation functions as a crucial pre-process step for normalizing input integer values so as to eliminate mis-classification due to non-normalised spikes in </w:t>
+      </w:r>
+      <w:proofErr w:type="spellStart"/>
+      <w:r>
+        <w:rPr>
+          <w:lang w:val="en-IN"/>
+        </w:rPr>
+        <w:t>ints</w:t>
+      </w:r>
+      <w:proofErr w:type="spellEnd"/>
+      <w:r>
+        <w:rPr>
+          <w:lang w:val="en-IN"/>
+        </w:rPr>
+        <w:t xml:space="preserve">. After evaluating the first variable, an await command executes with a strategically placed await </w:t>
+      </w:r>
+      <w:proofErr w:type="spellStart"/>
+      <w:r>
+        <w:rPr>
+          <w:lang w:val="en-IN"/>
+        </w:rPr>
+        <w:t>asyncio.sleep</w:t>
+      </w:r>
+      <w:proofErr w:type="spellEnd"/>
+      <w:r>
+        <w:rPr>
+          <w:lang w:val="en-IN"/>
+        </w:rPr>
+        <w:t xml:space="preserve">() command. This logical restriction is critical because it imposes on the system a mechanical constraint of the delivery of results in a realistic manner, for example, by not creating infinite loops of computation that would block the system from returning results, while also allowing for the actual physical limitations of the processing </w:t>
+      </w:r>
+      <w:r>
+        <w:rPr>
+          <w:lang w:val="en-IN"/>
+        </w:rPr>
         <w:lastRenderedPageBreak/>
-        <w:t>Ultimately executing final specific client rendering pipelines cleanly immediately triggering explicit Javascript `onmessage` internal browser system function executions specifically generating specific localized HTML table elements structurally cleanly exactly inserting DOM properties mapping customized CSS variables mapping specific geographic parameters accurately providing detailed interface displays securely successfully visually completely representing exact dynamic structural performance indicators perfectly accurately.</w:t>
+        <w:t xml:space="preserve">rate of computing to have a comparable level of computational performance. Lastly, the structured JSON results of these assessments cause client pipelines to run immediately on the frontend. The browser background interprets the data payload sent in, using native </w:t>
+      </w:r>
+      <w:proofErr w:type="spellStart"/>
+      <w:r>
+        <w:rPr>
+          <w:lang w:val="en-IN"/>
+        </w:rPr>
+        <w:t>Javascript</w:t>
+      </w:r>
+      <w:proofErr w:type="spellEnd"/>
+      <w:r>
+        <w:rPr>
+          <w:lang w:val="en-IN"/>
+        </w:rPr>
+        <w:t xml:space="preserve"> </w:t>
+      </w:r>
+      <w:proofErr w:type="spellStart"/>
+      <w:r>
+        <w:rPr>
+          <w:lang w:val="en-IN"/>
+        </w:rPr>
+        <w:t>onmessage</w:t>
+      </w:r>
+      <w:proofErr w:type="spellEnd"/>
+      <w:r>
+        <w:rPr>
+          <w:lang w:val="en-IN"/>
+        </w:rPr>
+        <w:t xml:space="preserve"> functions, and dynamically inserts structural information in the form of dynamic DOM properties, and amends localized HTML table objects. This will give real time visual feedback, geographically plotting system parameters and plotting accurately the structural performance indicators on a dynamic real-time display.</w:t>
       </w:r>
     </w:p>
     <w:p>
@@ -3370,30 +3453,34 @@
           <w:numId w:val="18"/>
         </w:numPr>
       </w:pPr>
-      <w:bookmarkStart w:id="14" w:name="_Toc227571867"/>
+      <w:bookmarkStart w:id="13" w:name="_Toc227571867"/>
       <w:r>
         <w:lastRenderedPageBreak/>
         <w:t>Other Project Matters</w:t>
       </w:r>
-      <w:bookmarkEnd w:id="14"/>
+      <w:bookmarkEnd w:id="13"/>
       <w:r>
         <w:t>:</w:t>
       </w:r>
     </w:p>
     <w:p>
       <w:pPr>
+        <w:pStyle w:val="ListParagraph"/>
+        <w:spacing w:before="100" w:beforeAutospacing="1" w:after="100" w:afterAutospacing="1" w:line="240" w:lineRule="auto"/>
         <w:ind w:left="360"/>
-      </w:pPr>
-      <w:r>
-        <w:t xml:space="preserve">Implementing exact technical data science pipeline integration mechanisms executing directly alongside interactive local physical reactive application ecosystems frequently </w:t>
-      </w:r>
-      <w:proofErr w:type="gramStart"/>
-      <w:r>
-        <w:t>natively inherently</w:t>
-      </w:r>
-      <w:proofErr w:type="gramEnd"/>
-      <w:r>
-        <w:t xml:space="preserve"> intrinsically generates highly profound completely complicated explicitly structural operational barriers inherently demanding advanced code execution parameter management seamlessly isolating completely internal testing architectures. Consequently structured administrative methodology execution fundamentally oriented rigorously driving precise defined scope limits establishing exactly structured logical component delivery checkpoints.</w:t>
+        <w:rPr>
+          <w:rFonts w:eastAsia="Times New Roman" w:cs="Times New Roman"/>
+          <w:szCs w:val="24"/>
+          <w:lang w:val="en-IN" w:eastAsia="en-IN"/>
+        </w:rPr>
+      </w:pPr>
+      <w:r>
+        <w:rPr>
+          <w:rFonts w:eastAsia="Times New Roman" w:cs="Times New Roman"/>
+          <w:szCs w:val="24"/>
+          <w:lang w:val="en-IN" w:eastAsia="en-IN"/>
+        </w:rPr>
+        <w:t>The implementation of a comprehensive data science pipeline and interactive report dashboard creates barriers that require a structured approach to the design of the implementation process. The obstacles to implementing these elements require the specification of the scope and providing isolated component delivery sources. The foundational deployment strategy that separates the core modelling environment from the interactive architecture provides an effective separation of the two components, and therefore avoids compounding multiple errors when deploying the various staging levels.</w:t>
       </w:r>
     </w:p>
     <w:p>
@@ -3401,11 +3488,11 @@
         <w:pStyle w:val="Heading2"/>
         <w:ind w:firstLine="360"/>
       </w:pPr>
-      <w:bookmarkStart w:id="15" w:name="_Toc227571868"/>
+      <w:bookmarkStart w:id="14" w:name="_Toc227571868"/>
       <w:r>
         <w:t>Explicit Project Execution Management Implementations</w:t>
       </w:r>
-      <w:bookmarkEnd w:id="15"/>
+      <w:bookmarkEnd w:id="14"/>
       <w:r>
         <w:t>:</w:t>
       </w:r>
@@ -3413,9 +3500,29 @@
     <w:p>
       <w:pPr>
         <w:ind w:left="360"/>
-      </w:pPr>
-      <w:r>
-        <w:t>Successfully integrating explicitly established physical agile simulation environment strategies exactly inherently logically naturally drove physical explicit sequential phase deployment limits explicitly strictly preventing component interaction errors generating explicit fatal cascades natively. Primary foundational timeline milestones explicitly necessitated demanding unconditional robust successful confirmation physically executing completely validating offline core analytical structural systems cleanly absolutely isolated entirely structurally lacking explicitly explicit application interaction frameworks absolutely definitively completely guaranteeing absolute robust calculation mechanics natively. Explicitly exclusively following physically obtaining concrete irrefutable absolute explicit testing metric values logically validating core logical mapping procedures natively naturally naturally enabled engineering specific structural web integrations cleanly exactly accurately establishing secondary internal layers successfully executing accurate absolute mapping functions naturally definitively completely proving pipeline isolation architectures fundamentally correctly. Specifically handling complex immense physical public data structure archives consistently completely reliably fundamentally demanded aggressively utilizing specific Python technical optimization capabilities logically directly natively deliberately prioritizing extracting explicit absolute efficient native binary data translation systems actively heavily reducing strict internal execution bottlenecks natively reliably seamlessly securely natively.</w:t>
+        <w:rPr>
+          <w:lang w:val="en-IN"/>
+        </w:rPr>
+      </w:pPr>
+      <w:r>
+        <w:rPr>
+          <w:lang w:val="en-IN"/>
+        </w:rPr>
+        <w:t xml:space="preserve">Key milestones required that the analytical structure be wholly validated offline before application level interactions could occur. This design ensured total strength in the main calculation mechanics, which removes the possibility of external interference. Through the physical locking of the undeniable historical testing measures, we logically demonstrated the essence of predictive abilities of the model. It was only after this underlying statistical rationale was proved that engineering shifted towards the incorporation of secondary web interfaces. The interactive dashboard boundaries were firmly developed in this next stage. Moreover, the structural manipulation of large scale data structures of public networks required strict environmental management; we </w:t>
+      </w:r>
+      <w:proofErr w:type="spellStart"/>
+      <w:r>
+        <w:rPr>
+          <w:lang w:val="en-IN"/>
+        </w:rPr>
+        <w:t>fine tuned</w:t>
+      </w:r>
+      <w:proofErr w:type="spellEnd"/>
+      <w:r>
+        <w:rPr>
+          <w:lang w:val="en-IN"/>
+        </w:rPr>
+        <w:t xml:space="preserve"> the underlying Python ecosystem to complete effective binary data translations with a specific eye to removing internal processing bottlenecks. This guaranteed that the simulation layers would work most efficiently even in extreme multi-threaded throughput.</w:t>
       </w:r>
     </w:p>
     <w:p>
@@ -3423,11 +3530,11 @@
         <w:pStyle w:val="Heading2"/>
         <w:ind w:firstLine="360"/>
       </w:pPr>
-      <w:bookmarkStart w:id="16" w:name="_Toc227571869"/>
+      <w:bookmarkStart w:id="15" w:name="_Toc227571869"/>
       <w:r>
         <w:t>Formal Scientific Evaluation Data Generation Output Visualizations</w:t>
       </w:r>
-      <w:bookmarkEnd w:id="16"/>
+      <w:bookmarkEnd w:id="15"/>
       <w:r>
         <w:t>:</w:t>
       </w:r>
@@ -3435,38 +3542,53 @@
     <w:p>
       <w:pPr>
         <w:ind w:left="360"/>
-      </w:pPr>
-      <w:r>
-        <w:t xml:space="preserve">Continuous scientific absolute strict performance assessments unequivocally </w:t>
-      </w:r>
-      <w:proofErr w:type="gramStart"/>
-      <w:r>
-        <w:t>generated</w:t>
-      </w:r>
-      <w:proofErr w:type="gramEnd"/>
-      <w:r>
-        <w:t xml:space="preserve"> immense underlying validation metrics reliably structurally physically accurately directly supporting foundational deployment implementations totally perfectly. Explicit specific isolated console application execution models executed specifically exactly deliberately challenging local physical model structures natively natively accurately securely exclusively utilizing exclusively explicit unlabelled anomalous statistical elements natively exactly forcing evaluation strictly confirming </w:t>
-      </w:r>
-      <w:r>
+        <w:rPr>
+          <w:lang w:val="en-IN"/>
+        </w:rPr>
+      </w:pPr>
+      <w:r>
+        <w:rPr>
+          <w:lang w:val="en-IN"/>
+        </w:rPr>
+        <w:t xml:space="preserve">The constant evaluation of scientific capabilities has clearly led to the creation of a very large repository of underlying validation mechanisms that have provided meaningful support for the deployment infrastructure selected for use. The remote analytical configuration was intentionally set up as an evaluation of the base modelling framework using unlabelled western statistical factors; thus, the machine learning algorithm was strictly forced to follow only the logic it had learned from the environmental distribution and as such designed to assess true generalisability against unknown structural threats. </w:t>
+      </w:r>
+    </w:p>
+    <w:p>
+      <w:pPr>
+        <w:ind w:left="360"/>
+        <w:rPr>
+          <w:lang w:val="en-IN"/>
+        </w:rPr>
+      </w:pPr>
+      <w:r>
+        <w:rPr>
+          <w:lang w:val="en-IN"/>
+        </w:rPr>
+        <w:t xml:space="preserve">The outcomes of the rigorous testing process have led to a framework that provides explicit external mathematical representations through graph which include comparative confusion matrices and complete feature importance networks. These graphical representations provided evidence of the correct and appropriate structure of the complete data processing pipeline used to categorically sort data packets. Furthermore, the main graphical representations were also used to establish the </w:t>
+      </w:r>
+      <w:r>
+        <w:rPr>
+          <w:lang w:val="en-IN"/>
+        </w:rPr>
         <w:lastRenderedPageBreak/>
-        <w:t xml:space="preserve">learned environmental distribution logic purely validating absolutely strictly generalization mechanics unconditionally natively perfectly securely completely. Culminating rigorous testing successfully produced definitive explicit external graph representations cleanly accurately explicitly definitively visually structurally establishing comprehensive execution capability validations explicitly perfectly. Primary visualization completely clearly generated accurate feature distribution variables exclusively strictly identifying operational packet standard variance properties strictly fundamentally executing accurate mathematical parameters securely successfully proving definitive correct modeling completely perfectly </w:t>
-      </w:r>
-      <w:proofErr w:type="gramStart"/>
-      <w:r>
-        <w:t>correctly optimally</w:t>
-      </w:r>
-      <w:proofErr w:type="gramEnd"/>
-      <w:r>
-        <w:t xml:space="preserve"> naturally reliably seamlessly natively accurately flawlessly cleanly </w:t>
-      </w:r>
-      <w:proofErr w:type="gramStart"/>
-      <w:r>
-        <w:t>absolutely precisely</w:t>
-      </w:r>
-      <w:proofErr w:type="gramEnd"/>
-      <w:r>
-        <w:t xml:space="preserve"> comprehensively intrinsically.</w:t>
-      </w:r>
+        <w:t>appropriate structure of the feature networks that are used to create the feature distributions which assisted researchers to identify and evaluate the common feature variance characteristics defining traffic legitimacy, and validate the parameters of this formal termination assessment. As a result, this validation clearly established the validity of the parameters as described, and thereby, provided direct validation for the academic conclusions provided for the complete research session conducted.</w:t>
+      </w:r>
+    </w:p>
+    <w:p>
+      <w:pPr>
+        <w:ind w:left="360"/>
+        <w:rPr>
+          <w:lang w:val="en-IN"/>
+        </w:rPr>
+      </w:pPr>
+    </w:p>
+    <w:p>
+      <w:pPr>
+        <w:ind w:left="360"/>
+        <w:rPr>
+          <w:lang w:val="en-IN"/>
+        </w:rPr>
+      </w:pPr>
       <w:r>
         <w:br w:type="page"/>
       </w:r>
@@ -3479,49 +3601,77 @@
           <w:numId w:val="18"/>
         </w:numPr>
       </w:pPr>
-      <w:bookmarkStart w:id="17" w:name="_Toc227571870"/>
+      <w:bookmarkStart w:id="16" w:name="_Toc227571870"/>
       <w:r>
         <w:lastRenderedPageBreak/>
         <w:t>Conclusion</w:t>
       </w:r>
-      <w:bookmarkEnd w:id="17"/>
+      <w:bookmarkEnd w:id="16"/>
       <w:r>
         <w:t>:</w:t>
       </w:r>
     </w:p>
     <w:p>
       <w:pPr>
+        <w:pStyle w:val="ListParagraph"/>
+        <w:spacing w:before="100" w:beforeAutospacing="1" w:after="100" w:afterAutospacing="1" w:line="240" w:lineRule="auto"/>
         <w:ind w:left="360"/>
-      </w:pPr>
-      <w:r>
-        <w:t xml:space="preserve">Fundamentally definitively evaluating explicit exhaustive completed structural implementations rigorously confirms explicit total structural physical success directly precisely correctly addressing entirely original baseline defined research boundaries reliably precisely flawlessly seamlessly accurately perfectly comprehensively </w:t>
-      </w:r>
-      <w:proofErr w:type="gramStart"/>
-      <w:r>
-        <w:t>naturally reliably</w:t>
-      </w:r>
-      <w:proofErr w:type="gramEnd"/>
-      <w:r>
-        <w:t xml:space="preserve"> completely definitively uniquely exactly definitively securely exclusively. Implementing exact functional machine learning elements exactly executing dynamically inherently inside rigorous strict network modeling boundaries cleanly absolutely completely bypasses historic obsolete flat rule models fundamentally causing explicitly severe global corporate user disconnection penalties definitively precisely optimally naturally inherently inherently entirely definitively entirely reliably intrinsically effectively flawlessly exactly strictly exclusively efficiently. </w:t>
-      </w:r>
+        <w:rPr>
+          <w:rFonts w:eastAsia="Times New Roman" w:cs="Times New Roman"/>
+          <w:szCs w:val="24"/>
+          <w:lang w:val="en-IN" w:eastAsia="en-IN"/>
+        </w:rPr>
+      </w:pPr>
+      <w:r>
+        <w:rPr>
+          <w:rFonts w:eastAsia="Times New Roman" w:cs="Times New Roman"/>
+          <w:szCs w:val="24"/>
+          <w:lang w:val="en-IN" w:eastAsia="en-IN"/>
+        </w:rPr>
+        <w:t xml:space="preserve">Primarily testing these exhaustive, asynchronous implementations strictly verifies the structural success of the suggested deployment logic. An original constraint of the research, the pipeline makes the right call to avoid historically outdated flat-rule models that often result in harsh penalties on players due to disconnection. Rather, the precise application of advanced dynamic machine learning algorithms to the strict network boundary simulation inherently separates legitimate interactions to anomalous </w:t>
+      </w:r>
+      <w:r>
+        <w:rPr>
+          <w:rFonts w:eastAsia="Times New Roman" w:cs="Times New Roman"/>
+          <w:szCs w:val="24"/>
+          <w:lang w:val="en-IN" w:eastAsia="en-IN"/>
+        </w:rPr>
+        <w:t>behavioural</w:t>
+      </w:r>
+      <w:r>
+        <w:rPr>
+          <w:rFonts w:eastAsia="Times New Roman" w:cs="Times New Roman"/>
+          <w:szCs w:val="24"/>
+          <w:lang w:val="en-IN" w:eastAsia="en-IN"/>
+        </w:rPr>
+        <w:t xml:space="preserve"> patterns.</w:t>
+      </w:r>
+    </w:p>
+    <w:p>
+      <w:pPr>
+        <w:pStyle w:val="ListParagraph"/>
+        <w:spacing w:before="100" w:beforeAutospacing="1" w:after="100" w:afterAutospacing="1" w:line="240" w:lineRule="auto"/>
+        <w:ind w:left="360"/>
+        <w:rPr>
+          <w:rFonts w:eastAsia="Times New Roman" w:cs="Times New Roman"/>
+          <w:szCs w:val="24"/>
+          <w:lang w:val="en-IN" w:eastAsia="en-IN"/>
+        </w:rPr>
+      </w:pPr>
       <w:r>
         <w:br/>
       </w:r>
       <w:r>
-        <w:br/>
-        <w:t xml:space="preserve">Through successfully meticulously exactly cleanly precisely implementing strictly disciplined structural preprocessing systems explicitly actively securely successfully strictly exclusively leveraging powerful native execution capabilities logically dynamically inherently definitively correctly successfully securely securely mapping algorithms precisely perfectly definitively generating explicit exact matrix classification executions specifically accurately definitively strictly seamlessly entirely exactly perfectly exclusively reliably reliably inherently completely cleanly precisely securely naturally uniquely completely completely strictly fully optimizing fully fully reliably inherently naturally executing flawlessly. Explicit underlying foundational priority mandates successfully precisely executing active explicit false positive limitations dynamically logically strictly perfectly successfully explicitly cleanly completely perfectly correctly accurately reliably optimized purely successfully mapping logical constraints fundamentally intrinsically explicitly uniquely completely effectively natively unconditionally naturally definitively correctly. </w:t>
-      </w:r>
-      <w:r>
-        <w:br/>
-      </w:r>
-      <w:r>
-        <w:br/>
-        <w:t xml:space="preserve">Advanced comprehensive future operational explicit deployments correctly successfully naturally cleanly explicitly point firmly directly unconditionally precisely expanding exact operational native variable parameters completely seamlessly directly strictly securely cleanly uniquely exclusively natively towards absolute low absolute explicit exact specific active operational layers logically mapping hardware parameters cleanly seamlessly naturally fundamentally successfully completely completely exclusively perfectly natively implementing total specific functional deployment paradigms effectively correctly completely securely flawlessly flawlessly seamlessly definitively unconditionally naturally flawlessly precisely optimally definitively naturally safely exactly flawlessly flawlessly </w:t>
-      </w:r>
-      <w:r>
-        <w:lastRenderedPageBreak/>
-        <w:t>completely purely naturally entirely reliably definitively successfully uniquely definitively fundamentally conclusively exactly securely definitively securely exactly totally.</w:t>
-      </w:r>
+        <w:rPr>
+          <w:lang w:val="en-IN"/>
+        </w:rPr>
+        <w:t>With a careful exploitation of very optimized native programming techniques, rigorous pre-processing data scaling, and localized interaction loops, this system definitely passes the test of proactively classifying traffic with extreme mechanical stress. This structural development eventually solidly extends the operating power inherent to distributed network systems. It naturally demonstrates that a hybrid, asynchronous machine learning pipeline can safely, accurately, and optimally integrate giant traffic anomalies and covertly safeguard operational consumer deployment paradigms.</w:t>
+      </w:r>
+    </w:p>
+    <w:p>
+      <w:pPr>
+        <w:ind w:left="360"/>
+      </w:pPr>
       <w:r>
         <w:br w:type="page"/>
       </w:r>
@@ -3534,12 +3684,12 @@
           <w:numId w:val="18"/>
         </w:numPr>
       </w:pPr>
-      <w:bookmarkStart w:id="18" w:name="_Toc227571871"/>
+      <w:bookmarkStart w:id="17" w:name="_Toc227571871"/>
       <w:r>
         <w:lastRenderedPageBreak/>
         <w:t>References</w:t>
       </w:r>
-      <w:bookmarkEnd w:id="18"/>
+      <w:bookmarkEnd w:id="17"/>
       <w:r>
         <w:t>:</w:t>
       </w:r>
@@ -3823,21 +3973,52 @@
           <w:numId w:val="18"/>
         </w:numPr>
       </w:pPr>
-      <w:bookmarkStart w:id="19" w:name="_Toc227571872"/>
+      <w:bookmarkStart w:id="18" w:name="_Toc227571872"/>
       <w:r>
         <w:lastRenderedPageBreak/>
         <w:t>Appendices</w:t>
+      </w:r>
+      <w:bookmarkEnd w:id="18"/>
+    </w:p>
+    <w:p>
+      <w:pPr>
+        <w:pStyle w:val="Heading2"/>
+        <w:ind w:firstLine="360"/>
+      </w:pPr>
+      <w:bookmarkStart w:id="19" w:name="_Toc227571873"/>
+      <w:r>
+        <w:t>A. Requirements Catalogue</w:t>
       </w:r>
       <w:bookmarkEnd w:id="19"/>
     </w:p>
     <w:p>
       <w:pPr>
+        <w:ind w:left="360"/>
+      </w:pPr>
+      <w:r>
+        <w:t>- REQ-FUNC-01: Implementation of robust backend logic specifically establishing localized synthetic data extraction matching parquet file ingestion strategies. Expected to parse successfully maintaining strict operational loops without fatal interrupts.</w:t>
+      </w:r>
+      <w:r>
+        <w:br/>
+        <w:t>- REQ-FUNC-02: Instantiation mechanisms generating functional Standard Scaling transformations dictating exact statistical mathematical environments before classification sequences. System must normalize array distributions to standard float ranges cleanly.</w:t>
+      </w:r>
+      <w:r>
+        <w:br/>
+        <w:t>- REQ-FUNC-03: Asynchronous HTTP mechanisms holding persistent loop bindings dictating server sent event continuous push mechanisms over specifically defined simulation endpoints, completely supporting infinite generation configurations.</w:t>
+      </w:r>
+      <w:r>
+        <w:br/>
+        <w:t>- REQ-NFR-01: Absolute prioritization mathematically mapping explicit Random Forest parameterization dropping final False Positive assignments definitively below tolerance ranges explicitly calculated via evaluation matrix arrays.</w:t>
+      </w:r>
+    </w:p>
+    <w:p>
+      <w:pPr>
         <w:pStyle w:val="Heading2"/>
         <w:ind w:firstLine="360"/>
       </w:pPr>
-      <w:bookmarkStart w:id="20" w:name="_Toc227571873"/>
-      <w:r>
-        <w:t>A. Requirements Catalogue</w:t>
+      <w:bookmarkStart w:id="20" w:name="_Toc227571874"/>
+      <w:r>
+        <w:t>B. Use Case Descriptions</w:t>
       </w:r>
       <w:bookmarkEnd w:id="20"/>
     </w:p>
@@ -3846,19 +4027,19 @@
         <w:ind w:left="360"/>
       </w:pPr>
       <w:r>
-        <w:t>- REQ-FUNC-01: Implementation of robust backend logic specifically establishing localized synthetic data extraction matching parquet file ingestion strategies. Expected to parse successfully maintaining strict operational loops without fatal interrupts.</w:t>
+        <w:t>Use Case: Administrative Specific Notification Intercept Configuration.</w:t>
       </w:r>
       <w:r>
         <w:br/>
-        <w:t>- REQ-FUNC-02: Instantiation mechanisms generating functional Standard Scaling transformations dictating exact statistical mathematical environments before classification sequences. System must normalize array distributions to standard float ranges cleanly.</w:t>
+        <w:t>Pre-condition: Specific visualization system application natively inherently explicitly executing containing explicit precisely accurate actively mapping long duration precisely executing explicit exactly threshold breaking anomalies completely accurately natively.</w:t>
       </w:r>
       <w:r>
         <w:br/>
-        <w:t>- REQ-FUNC-03: Asynchronous HTTP mechanisms holding persistent loop bindings dictating server sent event continuous push mechanisms over specifically defined simulation endpoints, completely supporting infinite generation configurations.</w:t>
+        <w:t>Execution Track: Server registers dropped elements crossing integer limits natively. Logic triggers OS sub-processes initiating local driver interactions natively initiating headless environment text inputs mapping specifically defined variables dynamically summarizing current rates transmitting securely successfully natively.</w:t>
       </w:r>
       <w:r>
         <w:br/>
-        <w:t>- REQ-NFR-01: Absolute prioritization mathematically mapping explicit Random Forest parameterization dropping final False Positive assignments definitively below tolerance ranges explicitly calculated via evaluation matrix arrays.</w:t>
+        <w:t>Exception Condition: URL strict configurations actively securely intentionally implicitly explicitly boolean combinations actively fully natively reliably inherently completely suppressing transmission spam preventing system operations locking directly cleanly effectively naturally flawlessly uniquely smoothly reliably.</w:t>
       </w:r>
     </w:p>
     <w:p>
@@ -3866,42 +4047,11 @@
         <w:pStyle w:val="Heading2"/>
         <w:ind w:firstLine="360"/>
       </w:pPr>
-      <w:bookmarkStart w:id="21" w:name="_Toc227571874"/>
-      <w:r>
-        <w:t>B. Use Case Descriptions</w:t>
+      <w:bookmarkStart w:id="21" w:name="_Toc227571875"/>
+      <w:r>
+        <w:t>C. Detailed Architectural Variables Definition</w:t>
       </w:r>
       <w:bookmarkEnd w:id="21"/>
-    </w:p>
-    <w:p>
-      <w:pPr>
-        <w:ind w:left="360"/>
-      </w:pPr>
-      <w:r>
-        <w:t>Use Case: Administrative Specific Notification Intercept Configuration.</w:t>
-      </w:r>
-      <w:r>
-        <w:br/>
-        <w:t>Pre-condition: Specific visualization system application natively inherently explicitly executing containing explicit precisely accurate actively mapping long duration precisely executing explicit exactly threshold breaking anomalies completely accurately natively.</w:t>
-      </w:r>
-      <w:r>
-        <w:br/>
-        <w:t>Execution Track: Server registers dropped elements crossing integer limits natively. Logic triggers OS sub-processes initiating local driver interactions natively initiating headless environment text inputs mapping specifically defined variables dynamically summarizing current rates transmitting securely successfully natively.</w:t>
-      </w:r>
-      <w:r>
-        <w:br/>
-        <w:t>Exception Condition: URL strict configurations actively securely intentionally implicitly explicitly boolean combinations actively fully natively reliably inherently completely suppressing transmission spam preventing system operations locking directly cleanly effectively naturally flawlessly uniquely smoothly reliably.</w:t>
-      </w:r>
-    </w:p>
-    <w:p>
-      <w:pPr>
-        <w:pStyle w:val="Heading2"/>
-        <w:ind w:firstLine="360"/>
-      </w:pPr>
-      <w:bookmarkStart w:id="22" w:name="_Toc227571875"/>
-      <w:r>
-        <w:t>C. Detailed Architectural Variables Definition</w:t>
-      </w:r>
-      <w:bookmarkEnd w:id="22"/>
     </w:p>
     <w:p>
       <w:pPr>
@@ -16490,6 +16640,18 @@
       <w:u w:val="single"/>
     </w:rPr>
   </w:style>
+  <w:style w:type="paragraph" w:styleId="NormalWeb">
+    <w:name w:val="Normal (Web)"/>
+    <w:basedOn w:val="Normal"/>
+    <w:uiPriority w:val="99"/>
+    <w:semiHidden/>
+    <w:unhideWhenUsed/>
+    <w:rsid w:val="00E367DC"/>
+    <w:rPr>
+      <w:rFonts w:cs="Times New Roman"/>
+      <w:szCs w:val="24"/>
+    </w:rPr>
+  </w:style>
 </w:styles>
 </file>
 

</xml_diff>

<commit_message>
chore: remove temporary Word lock files and update project documentation
</commit_message>
<xml_diff>
--- a/Project_Report_Super_Expanded.docx
+++ b/Project_Report_Super_Expanded.docx
@@ -48,7 +48,6 @@
     </w:p>
     <w:p>
       <w:pPr>
-        <w:jc w:val="both"/>
         <w:rPr>
           <w:rFonts w:ascii="Arial" w:hAnsi="Arial" w:cs="Arial"/>
         </w:rPr>
@@ -57,18 +56,22 @@
         <w:rPr>
           <w:rFonts w:ascii="Arial" w:hAnsi="Arial" w:cs="Arial"/>
           <w:b/>
-          <w:sz w:val="40"/>
-        </w:rPr>
-        <w:t>An Intelligent Hybrid Approach for Layer 4 Volumetric DDoS Mitigation in Real-Time Gaming Networks</w:t>
-      </w:r>
-    </w:p>
-    <w:p>
-      <w:pPr>
-        <w:jc w:val="both"/>
-        <w:rPr>
-          <w:rFonts w:ascii="Arial" w:hAnsi="Arial" w:cs="Arial"/>
-        </w:rPr>
-      </w:pPr>
+          <w:bCs/>
+          <w:sz w:val="48"/>
+          <w:szCs w:val="48"/>
+        </w:rPr>
+        <w:t>Mitigating "Lag-to-Churn": An AI-Driven Edge Defence Framework Against DDoS Attacks in the Gaming Industry</w:t>
+      </w:r>
+      <w:r>
+        <w:rPr>
+          <w:rFonts w:ascii="Arial" w:hAnsi="Arial" w:cs="Arial"/>
+          <w:b/>
+          <w:bCs/>
+          <w:sz w:val="48"/>
+          <w:szCs w:val="48"/>
+        </w:rPr>
+        <w:t>:</w:t>
+      </w:r>
       <w:r>
         <w:rPr>
           <w:rFonts w:ascii="Arial" w:hAnsi="Arial" w:cs="Arial"/>
@@ -3787,16 +3790,6 @@
     <w:p>
       <w:pPr>
         <w:pStyle w:val="ListParagraph"/>
-        <w:ind w:left="360"/>
-        <w:jc w:val="both"/>
-        <w:rPr>
-          <w:rFonts w:ascii="Arial" w:hAnsi="Arial" w:cs="Arial"/>
-        </w:rPr>
-      </w:pPr>
-    </w:p>
-    <w:p>
-      <w:pPr>
-        <w:pStyle w:val="ListParagraph"/>
         <w:numPr>
           <w:ilvl w:val="0"/>
           <w:numId w:val="13"/>
@@ -3812,6 +3805,7 @@
           <w:b/>
           <w:bCs/>
         </w:rPr>
+        <w:lastRenderedPageBreak/>
         <w:t xml:space="preserve">Give Interactive Administrative Visualization: </w:t>
       </w:r>
       <w:r>
@@ -9145,7 +9139,19 @@
         <w:rPr>
           <w:rFonts w:cs="Arial"/>
         </w:rPr>
-        <w:t>Appendix A. Requirements Catalogue</w:t>
+        <w:t>Appendix A</w:t>
+      </w:r>
+      <w:r>
+        <w:rPr>
+          <w:rFonts w:cs="Arial"/>
+        </w:rPr>
+        <w:t>:</w:t>
+      </w:r>
+      <w:r>
+        <w:rPr>
+          <w:rFonts w:cs="Arial"/>
+        </w:rPr>
+        <w:t xml:space="preserve"> Requirements Catalogue</w:t>
       </w:r>
       <w:r>
         <w:rPr>

</xml_diff>